<commit_message>
Fix umlauts, typos and add spacing between tables in all scripts
- Replace all ue/ae/oe substitutions with proper umlauts (ü, ä, ö)
- Fix compound-word typos (Datenttraeger → Datenträger etc.)
- Add blank paragraph after each table before next heading

Co-Authored-By: Claude Sonnet 4.6 <noreply@anthropic.com>
</commit_message>
<xml_diff>
--- a/Betriebssysteme-Rechnernetze.docx
+++ b/Betriebssysteme-Rechnernetze.docx
@@ -1835,7 +1835,7 @@
                 <w:sz w:val="20"/>
                 <w:szCs w:val="20"/>
               </w:rPr>
-              <w:t>koennen</w:t>
+              <w:t>können</w:t>
             </w:r>
             <w:proofErr w:type="spellEnd"/>
             <w:r>
@@ -1975,7 +1975,7 @@
                 <w:sz w:val="20"/>
                 <w:szCs w:val="20"/>
               </w:rPr>
-              <w:t>erklaeren</w:t>
+              <w:t>erklären</w:t>
             </w:r>
             <w:proofErr w:type="spellEnd"/>
             <w:r>
@@ -2022,7 +2022,7 @@
                 <w:sz w:val="20"/>
                 <w:szCs w:val="20"/>
               </w:rPr>
-              <w:t>Ausfuehrung</w:t>
+              <w:t>Ausführung</w:t>
             </w:r>
             <w:proofErr w:type="spellEnd"/>
             <w:r>
@@ -2106,7 +2106,7 @@
                 <w:sz w:val="20"/>
                 <w:szCs w:val="20"/>
               </w:rPr>
-              <w:t>Erklaeren</w:t>
+              <w:t>Erklären</w:t>
             </w:r>
             <w:proofErr w:type="spellEnd"/>
             <w:r>
@@ -2259,7 +2259,7 @@
                 <w:sz w:val="20"/>
                 <w:szCs w:val="20"/>
               </w:rPr>
-              <w:t>zuverlaessig</w:t>
+              <w:t>zuverlässig</w:t>
             </w:r>
             <w:proofErr w:type="spellEnd"/>
             <w:r>
@@ -2275,7 +2275,7 @@
                 <w:sz w:val="20"/>
                 <w:szCs w:val="20"/>
               </w:rPr>
-              <w:t>fuer</w:t>
+              <w:t>für</w:t>
             </w:r>
             <w:proofErr w:type="spellEnd"/>
             <w:r>
@@ -2291,7 +2291,7 @@
                 <w:sz w:val="20"/>
                 <w:szCs w:val="20"/>
               </w:rPr>
-              <w:t>Echtzeitfaelle</w:t>
+              <w:t>Echtzeitfälle</w:t>
             </w:r>
             <w:proofErr w:type="spellEnd"/>
             <w:r>
@@ -2341,7 +2341,7 @@
                 <w:bCs/>
                 <w:color w:val="2E75B6"/>
               </w:rPr>
-              <w:t>Pruefungstipp</w:t>
+              <w:t>Prüfungstipp</w:t>
             </w:r>
             <w:proofErr w:type="spellEnd"/>
           </w:p>
@@ -2354,7 +2354,7 @@
             </w:r>
             <w:proofErr w:type="spellStart"/>
             <w:r>
-              <w:t>erklaere</w:t>
+              <w:t>erkläre</w:t>
             </w:r>
             <w:proofErr w:type="spellEnd"/>
             <w:r>
@@ -2372,6 +2372,7 @@
         </w:tc>
       </w:tr>
     </w:tbl>
+    <w:p/>
     <w:p>
       <w:pPr>
         <w:pStyle w:val="berschrift2"/>
@@ -2626,7 +2627,7 @@
                 <w:sz w:val="20"/>
                 <w:szCs w:val="20"/>
               </w:rPr>
-              <w:t>eingeschraenkt</w:t>
+              <w:t>eingeschränkt</w:t>
             </w:r>
             <w:proofErr w:type="spellEnd"/>
             <w:r>
@@ -2642,7 +2643,7 @@
                 <w:sz w:val="20"/>
                 <w:szCs w:val="20"/>
               </w:rPr>
-              <w:t>ausfuehren</w:t>
+              <w:t>ausführen</w:t>
             </w:r>
             <w:proofErr w:type="spellEnd"/>
             <w:r>
@@ -2728,7 +2729,7 @@
                 <w:sz w:val="20"/>
                 <w:szCs w:val="20"/>
               </w:rPr>
-              <w:t>selbststaendig</w:t>
+              <w:t>selbstständig</w:t>
             </w:r>
             <w:proofErr w:type="spellEnd"/>
             <w:r>
@@ -2884,7 +2885,7 @@
                 <w:sz w:val="20"/>
                 <w:szCs w:val="20"/>
               </w:rPr>
-              <w:t>zuverlaessig</w:t>
+              <w:t>zuverlässig</w:t>
             </w:r>
             <w:proofErr w:type="spellEnd"/>
             <w:r>
@@ -2970,7 +2971,7 @@
                 <w:sz w:val="20"/>
                 <w:szCs w:val="20"/>
               </w:rPr>
-              <w:t>schuetzt</w:t>
+              <w:t>schützt</w:t>
             </w:r>
             <w:proofErr w:type="spellEnd"/>
             <w:r>
@@ -2986,7 +2987,7 @@
                 <w:sz w:val="20"/>
                 <w:szCs w:val="20"/>
               </w:rPr>
-              <w:t>erhoeht</w:t>
+              <w:t>erhöht</w:t>
             </w:r>
             <w:proofErr w:type="spellEnd"/>
             <w:r>
@@ -3002,7 +3003,7 @@
                 <w:sz w:val="20"/>
                 <w:szCs w:val="20"/>
               </w:rPr>
-              <w:t>Verfuegbarkeit</w:t>
+              <w:t>Verfügbarkeit</w:t>
             </w:r>
             <w:proofErr w:type="spellEnd"/>
             <w:r>
@@ -3152,7 +3153,7 @@
                 <w:sz w:val="20"/>
                 <w:szCs w:val="20"/>
               </w:rPr>
-              <w:t>Erklaerung</w:t>
+              <w:t>Erklärung</w:t>
             </w:r>
             <w:proofErr w:type="spellEnd"/>
           </w:p>
@@ -3270,7 +3271,7 @@
                 <w:sz w:val="20"/>
                 <w:szCs w:val="20"/>
               </w:rPr>
-              <w:t>Geraete</w:t>
+              <w:t>Geräte</w:t>
             </w:r>
             <w:proofErr w:type="spellEnd"/>
             <w:r>
@@ -3392,7 +3393,7 @@
                 <w:sz w:val="20"/>
                 <w:szCs w:val="20"/>
               </w:rPr>
-              <w:t>ueber</w:t>
+              <w:t>über</w:t>
             </w:r>
             <w:proofErr w:type="spellEnd"/>
             <w:r>
@@ -3515,7 +3516,7 @@
                 <w:sz w:val="20"/>
                 <w:szCs w:val="20"/>
               </w:rPr>
-              <w:t>geprueft</w:t>
+              <w:t>geprüft</w:t>
             </w:r>
             <w:proofErr w:type="spellEnd"/>
             <w:r>
@@ -3562,7 +3563,7 @@
                 <w:sz w:val="20"/>
                 <w:szCs w:val="20"/>
               </w:rPr>
-              <w:t>ausfuehren</w:t>
+              <w:t>ausführen</w:t>
             </w:r>
             <w:proofErr w:type="spellEnd"/>
             <w:r>
@@ -3927,7 +3928,7 @@
                 <w:sz w:val="20"/>
                 <w:szCs w:val="20"/>
               </w:rPr>
-              <w:t>geschuetzte</w:t>
+              <w:t>geschützte</w:t>
             </w:r>
             <w:proofErr w:type="spellEnd"/>
             <w:r>
@@ -4019,7 +4020,7 @@
                 <w:sz w:val="20"/>
                 <w:szCs w:val="20"/>
               </w:rPr>
-              <w:t>fuer</w:t>
+              <w:t>für</w:t>
             </w:r>
             <w:proofErr w:type="spellEnd"/>
             <w:r>
@@ -4035,7 +4036,7 @@
                 <w:sz w:val="20"/>
                 <w:szCs w:val="20"/>
               </w:rPr>
-              <w:t>ueber</w:t>
+              <w:t>über</w:t>
             </w:r>
             <w:proofErr w:type="spellEnd"/>
             <w:r>
@@ -4203,7 +4204,7 @@
                 <w:sz w:val="20"/>
                 <w:szCs w:val="20"/>
               </w:rPr>
-              <w:t>Uebergang</w:t>
+              <w:t>Übergang</w:t>
             </w:r>
             <w:proofErr w:type="spellEnd"/>
             <w:r>
@@ -4295,7 +4296,7 @@
                 <w:sz w:val="20"/>
                 <w:szCs w:val="20"/>
               </w:rPr>
-              <w:t>ausgeloester</w:t>
+              <w:t>ausgelöster</w:t>
             </w:r>
             <w:proofErr w:type="spellEnd"/>
             <w:r>
@@ -4387,7 +4388,7 @@
                 <w:sz w:val="20"/>
                 <w:szCs w:val="20"/>
               </w:rPr>
-              <w:t>ausgeloeste</w:t>
+              <w:t>ausgelöste</w:t>
             </w:r>
             <w:proofErr w:type="spellEnd"/>
             <w:r>
@@ -4419,7 +4420,7 @@
                 <w:sz w:val="20"/>
                 <w:szCs w:val="20"/>
               </w:rPr>
-              <w:t>Geraet</w:t>
+              <w:t>Gerät</w:t>
             </w:r>
             <w:proofErr w:type="spellEnd"/>
             <w:r>
@@ -4469,7 +4470,7 @@
                 <w:bCs/>
                 <w:color w:val="2E75B6"/>
               </w:rPr>
-              <w:t>Pruefungstipp</w:t>
+              <w:t>Prüfungstipp</w:t>
             </w:r>
             <w:proofErr w:type="spellEnd"/>
           </w:p>
@@ -4482,7 +4483,7 @@
             </w:r>
             <w:proofErr w:type="spellStart"/>
             <w:r>
-              <w:t>schuetzt</w:t>
+              <w:t>schützt</w:t>
             </w:r>
             <w:proofErr w:type="spellEnd"/>
             <w:r>
@@ -4490,7 +4491,7 @@
             </w:r>
             <w:proofErr w:type="spellStart"/>
             <w:r>
-              <w:t>ueber</w:t>
+              <w:t>über</w:t>
             </w:r>
             <w:proofErr w:type="spellEnd"/>
             <w:r>
@@ -4527,7 +4528,7 @@
       </w:r>
       <w:proofErr w:type="spellStart"/>
       <w:r>
-        <w:t>fuer</w:t>
+        <w:t>für</w:t>
       </w:r>
       <w:proofErr w:type="spellEnd"/>
       <w:r>
@@ -4535,7 +4536,7 @@
       </w:r>
       <w:proofErr w:type="spellStart"/>
       <w:r>
-        <w:t>darueberliegende</w:t>
+        <w:t>darüberliegende</w:t>
       </w:r>
       <w:proofErr w:type="spellEnd"/>
       <w:r>
@@ -4782,7 +4783,7 @@
                 <w:sz w:val="20"/>
                 <w:szCs w:val="20"/>
               </w:rPr>
-              <w:t>koennen</w:t>
+              <w:t>können</w:t>
             </w:r>
             <w:proofErr w:type="spellEnd"/>
             <w:r>
@@ -4798,7 +4799,7 @@
                 <w:sz w:val="20"/>
                 <w:szCs w:val="20"/>
               </w:rPr>
-              <w:t>gefaehrden</w:t>
+              <w:t>gefährden</w:t>
             </w:r>
             <w:proofErr w:type="spellEnd"/>
             <w:r>
@@ -4886,7 +4887,7 @@
                 <w:sz w:val="20"/>
                 <w:szCs w:val="20"/>
               </w:rPr>
-              <w:t>Modularitaet</w:t>
+              <w:t>Modularität</w:t>
             </w:r>
             <w:proofErr w:type="spellEnd"/>
             <w:r>
@@ -4933,7 +4934,7 @@
                 <w:sz w:val="20"/>
                 <w:szCs w:val="20"/>
               </w:rPr>
-              <w:t>zusaetzlichen</w:t>
+              <w:t>zusätzlichen</w:t>
             </w:r>
             <w:proofErr w:type="spellEnd"/>
             <w:r>
@@ -4947,13 +4948,14 @@
         </w:tc>
       </w:tr>
     </w:tbl>
+    <w:p/>
     <w:p>
       <w:pPr>
         <w:pStyle w:val="berschrift3"/>
       </w:pPr>
       <w:proofErr w:type="spellStart"/>
       <w:r>
-        <w:t>Uebungsfragen</w:t>
+        <w:t>Übungsfragen</w:t>
       </w:r>
       <w:proofErr w:type="spellEnd"/>
     </w:p>
@@ -4999,7 +5001,7 @@
       </w:r>
       <w:proofErr w:type="spellStart"/>
       <w:r>
-        <w:t>darueberliegenden</w:t>
+        <w:t>darüberliegenden</w:t>
       </w:r>
       <w:proofErr w:type="spellEnd"/>
       <w:r>
@@ -5043,7 +5045,7 @@
       </w:r>
       <w:proofErr w:type="spellStart"/>
       <w:r>
-        <w:t>ausgeloest</w:t>
+        <w:t>ausgelöst</w:t>
       </w:r>
       <w:proofErr w:type="spellEnd"/>
       <w:r>
@@ -5051,7 +5053,7 @@
       </w:r>
       <w:proofErr w:type="spellStart"/>
       <w:r>
-        <w:t>ausgeloest</w:t>
+        <w:t>ausgelöst</w:t>
       </w:r>
       <w:proofErr w:type="spellEnd"/>
       <w:r>
@@ -5067,7 +5069,7 @@
       </w:r>
       <w:proofErr w:type="spellStart"/>
       <w:r>
-        <w:t>Geraet</w:t>
+        <w:t>Gerät</w:t>
       </w:r>
       <w:proofErr w:type="spellEnd"/>
       <w:r>
@@ -5119,7 +5121,7 @@
       </w:r>
       <w:proofErr w:type="spellStart"/>
       <w:r>
-        <w:t>ueber</w:t>
+        <w:t>über</w:t>
       </w:r>
       <w:proofErr w:type="spellEnd"/>
       <w:r>
@@ -5154,7 +5156,7 @@
       </w:r>
       <w:proofErr w:type="spellStart"/>
       <w:r>
-        <w:t>Ausfuehrung</w:t>
+        <w:t>Ausführung</w:t>
       </w:r>
       <w:proofErr w:type="spellEnd"/>
       <w:r>
@@ -5335,7 +5337,7 @@
                 <w:sz w:val="20"/>
                 <w:szCs w:val="20"/>
               </w:rPr>
-              <w:t>Ausfuehrung</w:t>
+              <w:t>Ausführung</w:t>
             </w:r>
             <w:proofErr w:type="spellEnd"/>
             <w:r>
@@ -5414,7 +5416,7 @@
                 <w:sz w:val="20"/>
                 <w:szCs w:val="20"/>
               </w:rPr>
-              <w:t>Benoetigt</w:t>
+              <w:t>Benötigt</w:t>
             </w:r>
             <w:proofErr w:type="spellEnd"/>
             <w:r>
@@ -5551,7 +5553,7 @@
       </w:r>
       <w:proofErr w:type="spellStart"/>
       <w:r>
-        <w:t>Prioritaet</w:t>
+        <w:t>Priorität</w:t>
       </w:r>
       <w:proofErr w:type="spellEnd"/>
       <w:r>
@@ -5572,7 +5574,7 @@
       </w:r>
       <w:proofErr w:type="spellStart"/>
       <w:r>
-        <w:t>geoeffnete</w:t>
+        <w:t>geöffnete</w:t>
       </w:r>
       <w:proofErr w:type="spellEnd"/>
       <w:r>
@@ -5580,7 +5582,7 @@
       </w:r>
       <w:proofErr w:type="spellStart"/>
       <w:r>
-        <w:t>Kommunikationskanaele</w:t>
+        <w:t>Kommunikationskanäle</w:t>
       </w:r>
       <w:proofErr w:type="spellEnd"/>
       <w:r>
@@ -5771,7 +5773,7 @@
                 <w:sz w:val="20"/>
                 <w:szCs w:val="20"/>
               </w:rPr>
-              <w:t>vollstaendig</w:t>
+              <w:t>vollständig</w:t>
             </w:r>
             <w:proofErr w:type="spellEnd"/>
             <w:r>
@@ -5862,7 +5864,7 @@
                 <w:sz w:val="20"/>
                 <w:szCs w:val="20"/>
               </w:rPr>
-              <w:t>koennte</w:t>
+              <w:t>könnte</w:t>
             </w:r>
             <w:proofErr w:type="spellEnd"/>
             <w:r>
@@ -6172,7 +6174,7 @@
       </w:r>
       <w:proofErr w:type="spellStart"/>
       <w:r>
-        <w:t>Ausfuehrungspfade</w:t>
+        <w:t>Ausführungspfade</w:t>
       </w:r>
       <w:proofErr w:type="spellEnd"/>
       <w:r>
@@ -6392,7 +6394,7 @@
                 <w:sz w:val="20"/>
                 <w:szCs w:val="20"/>
               </w:rPr>
-              <w:t>moeglich</w:t>
+              <w:t>möglich</w:t>
             </w:r>
             <w:proofErr w:type="spellEnd"/>
             <w:r>
@@ -6408,7 +6410,7 @@
                 <w:sz w:val="20"/>
                 <w:szCs w:val="20"/>
               </w:rPr>
-              <w:t>koennen</w:t>
+              <w:t>können</w:t>
             </w:r>
             <w:proofErr w:type="spellEnd"/>
             <w:r>
@@ -6455,7 +6457,7 @@
                 <w:sz w:val="20"/>
                 <w:szCs w:val="20"/>
               </w:rPr>
-              <w:t>Parallelitaet</w:t>
+              <w:t>Parallelität</w:t>
             </w:r>
             <w:proofErr w:type="spellEnd"/>
             <w:r>
@@ -6541,7 +6543,7 @@
                 <w:sz w:val="20"/>
                 <w:szCs w:val="20"/>
               </w:rPr>
-              <w:t>Unterstuetzung</w:t>
+              <w:t>Unterstützung</w:t>
             </w:r>
             <w:proofErr w:type="spellEnd"/>
             <w:r>
@@ -6578,7 +6580,7 @@
       </w:pPr>
       <w:proofErr w:type="spellStart"/>
       <w:r>
-        <w:t>Uebungsfragen</w:t>
+        <w:t>Übungsfragen</w:t>
       </w:r>
       <w:proofErr w:type="spellEnd"/>
     </w:p>
@@ -6612,7 +6614,7 @@
           <w:b/>
           <w:bCs/>
         </w:rPr>
-        <w:t>fuer</w:t>
+        <w:t>für</w:t>
       </w:r>
       <w:proofErr w:type="spellEnd"/>
       <w:r>
@@ -6648,7 +6650,7 @@
       </w:r>
       <w:proofErr w:type="spellStart"/>
       <w:r>
-        <w:t>hoeher</w:t>
+        <w:t>höher</w:t>
       </w:r>
       <w:proofErr w:type="spellEnd"/>
       <w:r>
@@ -6680,7 +6682,7 @@
           <w:b/>
           <w:bCs/>
         </w:rPr>
-        <w:t>Parallelitaet</w:t>
+        <w:t>Parallelität</w:t>
       </w:r>
       <w:proofErr w:type="spellEnd"/>
       <w:r>
@@ -6696,7 +6698,7 @@
           <w:b/>
           <w:bCs/>
         </w:rPr>
-        <w:t>Nebenlaeuftigkeit</w:t>
+        <w:t>Nebenläufigkeit</w:t>
       </w:r>
       <w:proofErr w:type="spellEnd"/>
       <w:r>
@@ -6724,7 +6726,7 @@
       </w:r>
       <w:proofErr w:type="spellStart"/>
       <w:r>
-        <w:t>Parallelitaet</w:t>
+        <w:t>Parallelität</w:t>
       </w:r>
       <w:proofErr w:type="spellEnd"/>
       <w:r>
@@ -6732,7 +6734,7 @@
       </w:r>
       <w:proofErr w:type="spellStart"/>
       <w:r>
-        <w:t>Ausfuehrung</w:t>
+        <w:t>Ausführung</w:t>
       </w:r>
       <w:proofErr w:type="spellEnd"/>
       <w:r>
@@ -6740,7 +6742,7 @@
       </w:r>
       <w:proofErr w:type="spellStart"/>
       <w:r>
-        <w:t>Nebenlaeuftigkeit</w:t>
+        <w:t>Nebenläufigkeit</w:t>
       </w:r>
       <w:proofErr w:type="spellEnd"/>
       <w:r>
@@ -6800,7 +6802,7 @@
       </w:r>
       <w:proofErr w:type="spellStart"/>
       <w:r>
-        <w:t>Prioritaet</w:t>
+        <w:t>Priorität</w:t>
       </w:r>
       <w:proofErr w:type="spellEnd"/>
       <w:r>
@@ -6867,7 +6869,7 @@
       </w:r>
       <w:proofErr w:type="spellStart"/>
       <w:r>
-        <w:t>Naechstes</w:t>
+        <w:t>Nächstes</w:t>
       </w:r>
       <w:proofErr w:type="spellEnd"/>
       <w:r>
@@ -6875,7 +6877,7 @@
       </w:r>
       <w:proofErr w:type="spellStart"/>
       <w:r>
-        <w:t>erhaelt</w:t>
+        <w:t>erhält</w:t>
       </w:r>
       <w:proofErr w:type="spellEnd"/>
       <w:r>
@@ -6883,7 +6885,7 @@
       </w:r>
       <w:proofErr w:type="spellStart"/>
       <w:r>
-        <w:t>Echtzeitfaehigkeit</w:t>
+        <w:t>Echtzeitfähigkeit</w:t>
       </w:r>
       <w:proofErr w:type="spellEnd"/>
       <w:r>
@@ -7147,7 +7149,7 @@
                 <w:sz w:val="20"/>
                 <w:szCs w:val="20"/>
               </w:rPr>
-              <w:t>laeuft</w:t>
+              <w:t>läuft</w:t>
             </w:r>
             <w:proofErr w:type="spellEnd"/>
             <w:r>
@@ -7225,7 +7227,7 @@
                 <w:sz w:val="20"/>
                 <w:szCs w:val="20"/>
               </w:rPr>
-              <w:t>koennen</w:t>
+              <w:t>können</w:t>
             </w:r>
             <w:proofErr w:type="spellEnd"/>
             <w:r>
@@ -7319,7 +7321,7 @@
                 <w:sz w:val="20"/>
                 <w:szCs w:val="20"/>
               </w:rPr>
-              <w:t>Kuerzester</w:t>
+              <w:t>Kürzester</w:t>
             </w:r>
             <w:proofErr w:type="spellEnd"/>
             <w:r>
@@ -7397,7 +7399,7 @@
                 <w:sz w:val="20"/>
                 <w:szCs w:val="20"/>
               </w:rPr>
-              <w:t>geschaetzt</w:t>
+              <w:t>geschätzt</w:t>
             </w:r>
             <w:proofErr w:type="spellEnd"/>
             <w:r>
@@ -7413,7 +7415,7 @@
                 <w:sz w:val="20"/>
                 <w:szCs w:val="20"/>
               </w:rPr>
-              <w:t>koennen</w:t>
+              <w:t>können</w:t>
             </w:r>
             <w:proofErr w:type="spellEnd"/>
             <w:r>
@@ -7552,7 +7554,7 @@
                 <w:sz w:val="20"/>
                 <w:szCs w:val="20"/>
               </w:rPr>
-              <w:t>fuer</w:t>
+              <w:t>für</w:t>
             </w:r>
             <w:proofErr w:type="spellEnd"/>
             <w:r>
@@ -7636,7 +7638,7 @@
                 <w:sz w:val="20"/>
                 <w:szCs w:val="20"/>
               </w:rPr>
-              <w:t>Prioritaets</w:t>
+              <w:t>Prioritäts</w:t>
             </w:r>
             <w:proofErr w:type="spellEnd"/>
             <w:r>
@@ -7684,7 +7686,7 @@
                 <w:sz w:val="20"/>
                 <w:szCs w:val="20"/>
               </w:rPr>
-              <w:t>hoeherer</w:t>
+              <w:t>höherer</w:t>
             </w:r>
             <w:proofErr w:type="spellEnd"/>
             <w:r>
@@ -7700,7 +7702,7 @@
                 <w:sz w:val="20"/>
                 <w:szCs w:val="20"/>
               </w:rPr>
-              <w:t>Prioritaet</w:t>
+              <w:t>Priorität</w:t>
             </w:r>
             <w:proofErr w:type="spellEnd"/>
             <w:r>
@@ -7747,7 +7749,7 @@
                 <w:sz w:val="20"/>
                 <w:szCs w:val="20"/>
               </w:rPr>
-              <w:t>fuer</w:t>
+              <w:t>für</w:t>
             </w:r>
             <w:proofErr w:type="spellEnd"/>
             <w:r>
@@ -7794,7 +7796,7 @@
                 <w:sz w:val="20"/>
                 <w:szCs w:val="20"/>
               </w:rPr>
-              <w:t>Prioritaet</w:t>
+              <w:t>Priorität</w:t>
             </w:r>
             <w:proofErr w:type="spellEnd"/>
             <w:r>
@@ -7886,7 +7888,7 @@
                 <w:sz w:val="20"/>
                 <w:szCs w:val="20"/>
               </w:rPr>
-              <w:t>abhaengig</w:t>
+              <w:t>abhängig</w:t>
             </w:r>
             <w:proofErr w:type="spellEnd"/>
             <w:r>
@@ -7933,7 +7935,7 @@
                 <w:sz w:val="20"/>
                 <w:szCs w:val="20"/>
               </w:rPr>
-              <w:t>fuer</w:t>
+              <w:t>für</w:t>
             </w:r>
             <w:proofErr w:type="spellEnd"/>
             <w:r>
@@ -8014,7 +8016,7 @@
                 <w:bCs/>
                 <w:color w:val="2E75B6"/>
               </w:rPr>
-              <w:t>Pruefungstipp</w:t>
+              <w:t>Prüfungstipp</w:t>
             </w:r>
             <w:proofErr w:type="spellEnd"/>
           </w:p>
@@ -8027,7 +8029,7 @@
             </w:r>
             <w:proofErr w:type="spellStart"/>
             <w:r>
-              <w:t>erwaehnen</w:t>
+              <w:t>erwähnen</w:t>
             </w:r>
             <w:proofErr w:type="spellEnd"/>
             <w:r>
@@ -8043,7 +8045,7 @@
             </w:r>
             <w:proofErr w:type="spellStart"/>
             <w:r>
-              <w:t>aehnelt</w:t>
+              <w:t>ähnelt</w:t>
             </w:r>
             <w:proofErr w:type="spellEnd"/>
             <w:r>
@@ -8131,7 +8133,7 @@
                 <w:sz w:val="20"/>
                 <w:szCs w:val="20"/>
               </w:rPr>
-              <w:t>Praemptives</w:t>
+              <w:t>Präemptives</w:t>
             </w:r>
             <w:proofErr w:type="spellEnd"/>
             <w:r>
@@ -8318,7 +8320,7 @@
                 <w:sz w:val="20"/>
                 <w:szCs w:val="20"/>
               </w:rPr>
-              <w:t>Reaktionsfaehigkeit</w:t>
+              <w:t>Reaktionsfähigkeit</w:t>
             </w:r>
             <w:proofErr w:type="spellEnd"/>
             <w:r>
@@ -8403,7 +8405,7 @@
                 <w:sz w:val="20"/>
                 <w:szCs w:val="20"/>
               </w:rPr>
-              <w:t>Benoetigt</w:t>
+              <w:t>Benötigt</w:t>
             </w:r>
             <w:proofErr w:type="spellEnd"/>
             <w:r>
@@ -8417,6 +8419,7 @@
         </w:tc>
       </w:tr>
     </w:tbl>
+    <w:p/>
     <w:p>
       <w:pPr>
         <w:pStyle w:val="berschrift2"/>
@@ -8526,7 +8529,7 @@
                 <w:sz w:val="20"/>
                 <w:szCs w:val="20"/>
               </w:rPr>
-              <w:t>Erklaerung</w:t>
+              <w:t>Erklärung</w:t>
             </w:r>
             <w:proofErr w:type="spellEnd"/>
           </w:p>
@@ -8850,7 +8853,7 @@
                 <w:sz w:val="20"/>
                 <w:szCs w:val="20"/>
               </w:rPr>
-              <w:t>fuer</w:t>
+              <w:t>für</w:t>
             </w:r>
             <w:proofErr w:type="spellEnd"/>
             <w:r>
@@ -8897,7 +8900,7 @@
                 <w:sz w:val="20"/>
                 <w:szCs w:val="20"/>
               </w:rPr>
-              <w:t>noetig</w:t>
+              <w:t>nötig</w:t>
             </w:r>
             <w:proofErr w:type="spellEnd"/>
             <w:r>
@@ -8983,7 +8986,7 @@
                 <w:sz w:val="20"/>
                 <w:szCs w:val="20"/>
               </w:rPr>
-              <w:t>ueber</w:t>
+              <w:t>über</w:t>
             </w:r>
             <w:proofErr w:type="spellEnd"/>
             <w:r>
@@ -9100,7 +9103,7 @@
                 <w:sz w:val="20"/>
                 <w:szCs w:val="20"/>
               </w:rPr>
-              <w:t>ueber</w:t>
+              <w:t>über</w:t>
             </w:r>
             <w:proofErr w:type="spellEnd"/>
             <w:r>
@@ -9145,6 +9148,7 @@
         </w:tc>
       </w:tr>
     </w:tbl>
+    <w:p/>
     <w:p>
       <w:pPr>
         <w:pStyle w:val="berschrift3"/>
@@ -9162,7 +9166,7 @@
       </w:r>
       <w:proofErr w:type="spellStart"/>
       <w:r>
-        <w:t>veraendert</w:t>
+        <w:t>verändert</w:t>
       </w:r>
       <w:proofErr w:type="spellEnd"/>
       <w:r>
@@ -9336,7 +9340,7 @@
                 <w:sz w:val="20"/>
                 <w:szCs w:val="20"/>
               </w:rPr>
-              <w:t>Zaehlerbasierter</w:t>
+              <w:t>Zählerbasierter</w:t>
             </w:r>
             <w:proofErr w:type="spellEnd"/>
             <w:r>
@@ -9562,7 +9566,7 @@
                 <w:sz w:val="20"/>
                 <w:szCs w:val="20"/>
               </w:rPr>
-              <w:t>erfuellt</w:t>
+              <w:t>erfüllt</w:t>
             </w:r>
             <w:proofErr w:type="spellEnd"/>
             <w:r>
@@ -9865,7 +9869,7 @@
                 <w:sz w:val="20"/>
                 <w:szCs w:val="20"/>
               </w:rPr>
-              <w:t>haelt</w:t>
+              <w:t>hält</w:t>
             </w:r>
             <w:proofErr w:type="spellEnd"/>
             <w:r>
@@ -9974,7 +9978,7 @@
                 <w:sz w:val="20"/>
                 <w:szCs w:val="20"/>
               </w:rPr>
-              <w:t>koennen</w:t>
+              <w:t>können</w:t>
             </w:r>
             <w:proofErr w:type="spellEnd"/>
             <w:r>
@@ -10119,7 +10123,7 @@
             </w:r>
             <w:proofErr w:type="spellStart"/>
             <w:r>
-              <w:t>zirkulaeres</w:t>
+              <w:t>zirkuläres</w:t>
             </w:r>
             <w:proofErr w:type="spellEnd"/>
             <w:r>
@@ -10129,6 +10133,7 @@
         </w:tc>
       </w:tr>
     </w:tbl>
+    <w:p/>
     <w:p>
       <w:pPr>
         <w:spacing w:after="120" w:line="264" w:lineRule="auto"/>
@@ -10155,8 +10160,7 @@
       </w:pPr>
       <w:proofErr w:type="spellStart"/>
       <w:r>
-        <w:lastRenderedPageBreak/>
-        <w:t>Uebungsfragen</w:t>
+        <w:t>Übungsfragen</w:t>
       </w:r>
       <w:proofErr w:type="spellEnd"/>
     </w:p>
@@ -10197,7 +10201,7 @@
       </w:r>
       <w:proofErr w:type="spellStart"/>
       <w:r>
-        <w:t>Empfaenger</w:t>
+        <w:t>Empfänger</w:t>
       </w:r>
       <w:proofErr w:type="spellEnd"/>
       <w:r>
@@ -10222,7 +10226,7 @@
           <w:b/>
           <w:bCs/>
         </w:rPr>
-        <w:t>Erlaeutere</w:t>
+        <w:t>Erläutere</w:t>
       </w:r>
       <w:proofErr w:type="spellEnd"/>
       <w:r>
@@ -10250,7 +10254,7 @@
       </w:r>
       <w:proofErr w:type="spellStart"/>
       <w:r>
-        <w:t>benoedigten</w:t>
+        <w:t>benötigten</w:t>
       </w:r>
       <w:proofErr w:type="spellEnd"/>
       <w:r>
@@ -10258,7 +10262,7 @@
       </w:r>
       <w:proofErr w:type="spellStart"/>
       <w:r>
-        <w:t>vollstaendig</w:t>
+        <w:t>vollständig</w:t>
       </w:r>
       <w:proofErr w:type="spellEnd"/>
       <w:r>
@@ -10302,7 +10306,7 @@
       </w:r>
       <w:proofErr w:type="spellStart"/>
       <w:r>
-        <w:t>Empfaengern</w:t>
+        <w:t>Empfängern</w:t>
       </w:r>
       <w:proofErr w:type="spellEnd"/>
       <w:r>
@@ -10324,7 +10328,7 @@
       </w:r>
       <w:proofErr w:type="spellStart"/>
       <w:r>
-        <w:t>Geraetetreiber</w:t>
+        <w:t>Gerätetreiber</w:t>
       </w:r>
       <w:bookmarkEnd w:id="7"/>
       <w:proofErr w:type="spellEnd"/>
@@ -10569,7 +10573,7 @@
                 <w:sz w:val="20"/>
                 <w:szCs w:val="20"/>
               </w:rPr>
-              <w:t>fuer</w:t>
+              <w:t>für</w:t>
             </w:r>
             <w:proofErr w:type="spellEnd"/>
             <w:r>
@@ -10648,7 +10652,7 @@
                 <w:sz w:val="20"/>
                 <w:szCs w:val="20"/>
               </w:rPr>
-              <w:t>Geraet</w:t>
+              <w:t>Gerät</w:t>
             </w:r>
             <w:proofErr w:type="spellEnd"/>
             <w:r>
@@ -10664,7 +10668,7 @@
                 <w:sz w:val="20"/>
                 <w:szCs w:val="20"/>
               </w:rPr>
-              <w:t>selbststaendig</w:t>
+              <w:t>selbstständig</w:t>
             </w:r>
             <w:proofErr w:type="spellEnd"/>
             <w:r>
@@ -10711,7 +10715,7 @@
                 <w:sz w:val="20"/>
                 <w:szCs w:val="20"/>
               </w:rPr>
-              <w:t>benoetigt</w:t>
+              <w:t>benötigt</w:t>
             </w:r>
             <w:proofErr w:type="spellEnd"/>
             <w:r>
@@ -10727,7 +10731,7 @@
                 <w:sz w:val="20"/>
                 <w:szCs w:val="20"/>
               </w:rPr>
-              <w:t>Prioritaeten</w:t>
+              <w:t>Prioritäten</w:t>
             </w:r>
             <w:proofErr w:type="spellEnd"/>
             <w:r>
@@ -10813,7 +10817,7 @@
                 <w:sz w:val="20"/>
                 <w:szCs w:val="20"/>
               </w:rPr>
-              <w:t>uebertraegt</w:t>
+              <w:t>überträgt</w:t>
             </w:r>
             <w:proofErr w:type="spellEnd"/>
             <w:r>
@@ -10829,7 +10833,7 @@
                 <w:sz w:val="20"/>
                 <w:szCs w:val="20"/>
               </w:rPr>
-              <w:t>Geraet</w:t>
+              <w:t>Gerät</w:t>
             </w:r>
             <w:proofErr w:type="spellEnd"/>
             <w:r>
@@ -10874,13 +10878,14 @@
         </w:tc>
       </w:tr>
     </w:tbl>
+    <w:p/>
     <w:p>
       <w:pPr>
         <w:pStyle w:val="berschrift3"/>
       </w:pPr>
       <w:proofErr w:type="spellStart"/>
       <w:r>
-        <w:t>Geraetetreiber</w:t>
+        <w:t>Gerätetreiber</w:t>
       </w:r>
       <w:proofErr w:type="spellEnd"/>
     </w:p>
@@ -10898,7 +10903,7 @@
       </w:r>
       <w:proofErr w:type="spellStart"/>
       <w:r>
-        <w:t>Geraetetreiber</w:t>
+        <w:t>Gerätetreiber</w:t>
       </w:r>
       <w:proofErr w:type="spellEnd"/>
       <w:r>
@@ -10906,7 +10911,7 @@
       </w:r>
       <w:proofErr w:type="spellStart"/>
       <w:r>
-        <w:t>Geraete</w:t>
+        <w:t>Geräte</w:t>
       </w:r>
       <w:proofErr w:type="spellEnd"/>
       <w:r>
@@ -10914,7 +10919,7 @@
       </w:r>
       <w:proofErr w:type="spellStart"/>
       <w:r>
-        <w:t>fuer</w:t>
+        <w:t>für</w:t>
       </w:r>
       <w:proofErr w:type="spellEnd"/>
       <w:r>
@@ -10932,7 +10937,7 @@
       </w:pPr>
       <w:proofErr w:type="spellStart"/>
       <w:r>
-        <w:t>Uebersetzt</w:t>
+        <w:t>Übersetzt</w:t>
       </w:r>
       <w:proofErr w:type="spellEnd"/>
       <w:r>
@@ -10956,7 +10961,7 @@
       </w:r>
       <w:proofErr w:type="spellStart"/>
       <w:r>
-        <w:t>geraetespezifische</w:t>
+        <w:t>gerätespezifische</w:t>
       </w:r>
       <w:proofErr w:type="spellEnd"/>
       <w:r>
@@ -10977,7 +10982,7 @@
       </w:r>
       <w:proofErr w:type="spellStart"/>
       <w:r>
-        <w:t>Geraeteadresse</w:t>
+        <w:t>Geräteadresse</w:t>
       </w:r>
       <w:proofErr w:type="spellEnd"/>
       <w:r>
@@ -10995,7 +11000,7 @@
       </w:pPr>
       <w:proofErr w:type="spellStart"/>
       <w:r>
-        <w:t>Geraeteunabhaengige</w:t>
+        <w:t>Geräteunabhängige</w:t>
       </w:r>
       <w:proofErr w:type="spellEnd"/>
       <w:r>
@@ -11003,7 +11008,7 @@
       </w:r>
       <w:proofErr w:type="spellStart"/>
       <w:r>
-        <w:t>Geraete</w:t>
+        <w:t>Geräte</w:t>
       </w:r>
       <w:proofErr w:type="spellEnd"/>
       <w:r>
@@ -11011,7 +11016,7 @@
       </w:r>
       <w:proofErr w:type="spellStart"/>
       <w:r>
-        <w:t>moeglichst</w:t>
+        <w:t>möglichst</w:t>
       </w:r>
       <w:proofErr w:type="spellEnd"/>
       <w:r>
@@ -11071,7 +11076,7 @@
                 <w:bCs/>
                 <w:color w:val="2E75B6"/>
               </w:rPr>
-              <w:t>Pruefungstipp</w:t>
+              <w:t>Prüfungstipp</w:t>
             </w:r>
             <w:proofErr w:type="spellEnd"/>
           </w:p>
@@ -11084,7 +11089,7 @@
             </w:r>
             <w:proofErr w:type="spellStart"/>
             <w:r>
-              <w:t>erklaeren</w:t>
+              <w:t>erklären</w:t>
             </w:r>
             <w:proofErr w:type="spellEnd"/>
             <w:r>
@@ -11092,7 +11097,7 @@
             </w:r>
             <w:proofErr w:type="spellStart"/>
             <w:r>
-              <w:t>erwaehnen</w:t>
+              <w:t>erwähnen</w:t>
             </w:r>
             <w:proofErr w:type="spellEnd"/>
             <w:r>
@@ -11100,7 +11105,7 @@
             </w:r>
             <w:proofErr w:type="spellStart"/>
             <w:r>
-              <w:t>Prioritaeten</w:t>
+              <w:t>Prioritäten</w:t>
             </w:r>
             <w:proofErr w:type="spellEnd"/>
             <w:r>
@@ -11369,7 +11374,7 @@
                 <w:sz w:val="20"/>
                 <w:szCs w:val="20"/>
               </w:rPr>
-              <w:t>fluechtig</w:t>
+              <w:t>flüchtig</w:t>
             </w:r>
             <w:proofErr w:type="spellEnd"/>
             <w:r>
@@ -11417,7 +11422,7 @@
                 <w:sz w:val="20"/>
                 <w:szCs w:val="20"/>
               </w:rPr>
-              <w:t>Sekundaerspeicher</w:t>
+              <w:t>Sekundärspeicher</w:t>
             </w:r>
             <w:proofErr w:type="spellEnd"/>
           </w:p>
@@ -11543,7 +11548,7 @@
                 <w:sz w:val="20"/>
                 <w:szCs w:val="20"/>
               </w:rPr>
-              <w:t>Programmausfuehrung</w:t>
+              <w:t>Programmausführung</w:t>
             </w:r>
             <w:proofErr w:type="spellEnd"/>
             <w:r>
@@ -11557,6 +11562,7 @@
         </w:tc>
       </w:tr>
     </w:tbl>
+    <w:p/>
     <w:p>
       <w:pPr>
         <w:spacing w:after="120" w:line="264" w:lineRule="auto"/>
@@ -11566,7 +11572,7 @@
       </w:r>
       <w:proofErr w:type="spellStart"/>
       <w:r>
-        <w:t>uebersetzt</w:t>
+        <w:t>übersetzt</w:t>
       </w:r>
       <w:proofErr w:type="spellEnd"/>
       <w:r>
@@ -11840,7 +11846,7 @@
                 <w:sz w:val="20"/>
                 <w:szCs w:val="20"/>
               </w:rPr>
-              <w:t>Groesse</w:t>
+              <w:t>Größe</w:t>
             </w:r>
             <w:proofErr w:type="spellEnd"/>
             <w:r>
@@ -11931,7 +11937,7 @@
                 <w:sz w:val="20"/>
                 <w:szCs w:val="20"/>
               </w:rPr>
-              <w:t>enthaelt</w:t>
+              <w:t>enthält</w:t>
             </w:r>
             <w:proofErr w:type="spellEnd"/>
             <w:r>
@@ -12024,7 +12030,7 @@
                 <w:sz w:val="20"/>
                 <w:szCs w:val="20"/>
               </w:rPr>
-              <w:t>Benoetigte</w:t>
+              <w:t>Benötigte</w:t>
             </w:r>
             <w:proofErr w:type="spellEnd"/>
             <w:r>
@@ -12115,7 +12121,7 @@
                 <w:sz w:val="20"/>
                 <w:szCs w:val="20"/>
               </w:rPr>
-              <w:t>benoetigt</w:t>
+              <w:t>benötigt</w:t>
             </w:r>
             <w:proofErr w:type="spellEnd"/>
             <w:r>
@@ -12281,7 +12287,7 @@
                 <w:sz w:val="20"/>
                 <w:szCs w:val="20"/>
               </w:rPr>
-              <w:t>Erklaerung</w:t>
+              <w:t>Erklärung</w:t>
             </w:r>
             <w:proofErr w:type="spellEnd"/>
           </w:p>
@@ -12365,7 +12371,7 @@
                 <w:sz w:val="20"/>
                 <w:szCs w:val="20"/>
               </w:rPr>
-              <w:t>groesser</w:t>
+              <w:t>größer</w:t>
             </w:r>
             <w:proofErr w:type="spellEnd"/>
             <w:r>
@@ -12381,7 +12387,7 @@
                 <w:sz w:val="20"/>
                 <w:szCs w:val="20"/>
               </w:rPr>
-              <w:t>tatsaechlich</w:t>
+              <w:t>tatsächlich</w:t>
             </w:r>
             <w:proofErr w:type="spellEnd"/>
             <w:r>
@@ -12397,7 +12403,7 @@
                 <w:sz w:val="20"/>
                 <w:szCs w:val="20"/>
               </w:rPr>
-              <w:t>benoetigt</w:t>
+              <w:t>benötigt</w:t>
             </w:r>
             <w:proofErr w:type="spellEnd"/>
             <w:r>
@@ -12488,7 +12494,7 @@
                 <w:sz w:val="20"/>
                 <w:szCs w:val="20"/>
               </w:rPr>
-              <w:t>waere</w:t>
+              <w:t>wäre</w:t>
             </w:r>
             <w:proofErr w:type="spellEnd"/>
             <w:r>
@@ -12504,7 +12510,7 @@
                 <w:sz w:val="20"/>
                 <w:szCs w:val="20"/>
               </w:rPr>
-              <w:t>zusammenhaengend</w:t>
+              <w:t>zusammenhängend</w:t>
             </w:r>
             <w:proofErr w:type="spellEnd"/>
             <w:r>
@@ -12595,7 +12601,7 @@
                 <w:sz w:val="20"/>
                 <w:szCs w:val="20"/>
               </w:rPr>
-              <w:t>groessere</w:t>
+              <w:t>größere</w:t>
             </w:r>
             <w:proofErr w:type="spellEnd"/>
             <w:r>
@@ -12611,7 +12617,7 @@
                 <w:sz w:val="20"/>
                 <w:szCs w:val="20"/>
               </w:rPr>
-              <w:t>zusammenhaengende</w:t>
+              <w:t>zusammenhängende</w:t>
             </w:r>
             <w:proofErr w:type="spellEnd"/>
             <w:r>
@@ -12677,7 +12683,7 @@
             </w:r>
             <w:proofErr w:type="spellStart"/>
             <w:r>
-              <w:t>loest</w:t>
+              <w:t>löst</w:t>
             </w:r>
             <w:proofErr w:type="spellEnd"/>
             <w:r>
@@ -12685,7 +12691,7 @@
             </w:r>
             <w:proofErr w:type="spellStart"/>
             <w:r>
-              <w:t>zusammenhaengender</w:t>
+              <w:t>zusammenhängender</w:t>
             </w:r>
             <w:proofErr w:type="spellEnd"/>
             <w:r>
@@ -12693,7 +12699,7 @@
             </w:r>
             <w:proofErr w:type="spellStart"/>
             <w:r>
-              <w:t>moegliche</w:t>
+              <w:t>mögliche</w:t>
             </w:r>
             <w:proofErr w:type="spellEnd"/>
             <w:r>
@@ -12722,7 +12728,7 @@
       </w:pPr>
       <w:proofErr w:type="spellStart"/>
       <w:r>
-        <w:t>Uebungsfragen</w:t>
+        <w:t>Übungsfragen</w:t>
       </w:r>
       <w:proofErr w:type="spellEnd"/>
     </w:p>
@@ -12763,7 +12769,7 @@
       </w:r>
       <w:proofErr w:type="spellStart"/>
       <w:r>
-        <w:t>zusammengehoerige</w:t>
+        <w:t>zusammengehörige</w:t>
       </w:r>
       <w:proofErr w:type="spellEnd"/>
       <w:r>
@@ -12851,7 +12857,7 @@
       </w:r>
       <w:proofErr w:type="spellStart"/>
       <w:r>
-        <w:t>flueechtiger</w:t>
+        <w:t>flüchtiger</w:t>
       </w:r>
       <w:proofErr w:type="spellEnd"/>
       <w:r>
@@ -12859,7 +12865,7 @@
       </w:r>
       <w:proofErr w:type="spellStart"/>
       <w:r>
-        <w:t>fluechtig</w:t>
+        <w:t>flüchtig</w:t>
       </w:r>
       <w:proofErr w:type="spellEnd"/>
       <w:r>
@@ -12867,7 +12873,7 @@
       </w:r>
       <w:proofErr w:type="spellStart"/>
       <w:r>
-        <w:t>enthaelt</w:t>
+        <w:t>enthält</w:t>
       </w:r>
       <w:proofErr w:type="spellEnd"/>
       <w:r>
@@ -13120,7 +13126,7 @@
                 <w:sz w:val="20"/>
                 <w:szCs w:val="20"/>
               </w:rPr>
-              <w:t>ausgewaehlten</w:t>
+              <w:t>ausgewählten</w:t>
             </w:r>
             <w:proofErr w:type="spellEnd"/>
             <w:r>
@@ -13243,7 +13249,7 @@
                 <w:sz w:val="20"/>
                 <w:szCs w:val="20"/>
               </w:rPr>
-              <w:t>Aenderungen</w:t>
+              <w:t>Änderungen</w:t>
             </w:r>
             <w:proofErr w:type="spellEnd"/>
             <w:r>
@@ -13290,7 +13296,7 @@
                 <w:sz w:val="20"/>
                 <w:szCs w:val="20"/>
               </w:rPr>
-              <w:t>benoetigt</w:t>
+              <w:t>benötigt</w:t>
             </w:r>
             <w:proofErr w:type="spellEnd"/>
             <w:r>
@@ -13382,7 +13388,7 @@
                 <w:sz w:val="20"/>
                 <w:szCs w:val="20"/>
               </w:rPr>
-              <w:t>Aenderungen</w:t>
+              <w:t>Änderungen</w:t>
             </w:r>
             <w:proofErr w:type="spellEnd"/>
             <w:r>
@@ -13429,7 +13435,7 @@
                 <w:sz w:val="20"/>
                 <w:szCs w:val="20"/>
               </w:rPr>
-              <w:t>waechst</w:t>
+              <w:t>wächst</w:t>
             </w:r>
             <w:proofErr w:type="spellEnd"/>
             <w:r>
@@ -13553,7 +13559,7 @@
                 <w:sz w:val="20"/>
                 <w:szCs w:val="20"/>
               </w:rPr>
-              <w:t>fuer</w:t>
+              <w:t>für</w:t>
             </w:r>
             <w:proofErr w:type="spellEnd"/>
             <w:r>
@@ -13680,7 +13686,7 @@
                 <w:sz w:val="20"/>
                 <w:szCs w:val="20"/>
               </w:rPr>
-              <w:t>Einschaetzung</w:t>
+              <w:t>Einschätzung</w:t>
             </w:r>
             <w:proofErr w:type="spellEnd"/>
           </w:p>
@@ -13882,7 +13888,7 @@
                 <w:sz w:val="20"/>
                 <w:szCs w:val="20"/>
               </w:rPr>
-              <w:t>Datenttraeger</w:t>
+              <w:t>Datenträger</w:t>
             </w:r>
             <w:proofErr w:type="spellEnd"/>
             <w:r>
@@ -13930,7 +13936,7 @@
                 <w:sz w:val="20"/>
                 <w:szCs w:val="20"/>
               </w:rPr>
-              <w:t>Verfuegbarkeit</w:t>
+              <w:t>Verfügbarkeit</w:t>
             </w:r>
             <w:proofErr w:type="spellEnd"/>
             <w:r>
@@ -13946,7 +13952,7 @@
                 <w:sz w:val="20"/>
                 <w:szCs w:val="20"/>
               </w:rPr>
-              <w:t>Kapazitaet</w:t>
+              <w:t>Kapazität</w:t>
             </w:r>
             <w:proofErr w:type="spellEnd"/>
             <w:r>
@@ -14047,7 +14053,7 @@
                 <w:sz w:val="20"/>
                 <w:szCs w:val="20"/>
               </w:rPr>
-              <w:t>Paritaet</w:t>
+              <w:t>Parität</w:t>
             </w:r>
             <w:proofErr w:type="spellEnd"/>
             <w:r>
@@ -14187,7 +14193,7 @@
                 <w:sz w:val="20"/>
                 <w:szCs w:val="20"/>
               </w:rPr>
-              <w:t>Paritaetsinformationen</w:t>
+              <w:t>Paritätsinformationen</w:t>
             </w:r>
             <w:proofErr w:type="spellEnd"/>
             <w:r>
@@ -14235,7 +14241,7 @@
                 <w:sz w:val="20"/>
                 <w:szCs w:val="20"/>
               </w:rPr>
-              <w:t>Ausfaelle</w:t>
+              <w:t>Ausfälle</w:t>
             </w:r>
             <w:proofErr w:type="spellEnd"/>
             <w:r>
@@ -14420,7 +14426,7 @@
             </w:r>
             <w:proofErr w:type="spellStart"/>
             <w:r>
-              <w:t>schuetzt</w:t>
+              <w:t>schützt</w:t>
             </w:r>
             <w:proofErr w:type="spellEnd"/>
             <w:r>
@@ -14428,15 +14434,15 @@
             </w:r>
             <w:proofErr w:type="spellStart"/>
             <w:r>
-              <w:t>Datenttraeger</w:t>
+              <w:t>Datenträger</w:t>
             </w:r>
             <w:proofErr w:type="spellEnd"/>
             <w:r>
-              <w:t xml:space="preserve">, aber nicht vor Loeschen, </w:t>
+              <w:t xml:space="preserve">, aber nicht vor Löschen, </w:t>
             </w:r>
             <w:proofErr w:type="spellStart"/>
             <w:r>
-              <w:t>Verschluesselungstrojanern</w:t>
+              <w:t>Verschlüsselungstrojanern</w:t>
             </w:r>
             <w:proofErr w:type="spellEnd"/>
             <w:r>
@@ -14457,7 +14463,7 @@
       </w:pPr>
       <w:proofErr w:type="spellStart"/>
       <w:r>
-        <w:t>Uebungsfragen</w:t>
+        <w:t>Übungsfragen</w:t>
       </w:r>
       <w:proofErr w:type="spellEnd"/>
     </w:p>
@@ -14506,7 +14512,7 @@
       </w:r>
       <w:proofErr w:type="spellStart"/>
       <w:r>
-        <w:t>ueber</w:t>
+        <w:t>über</w:t>
       </w:r>
       <w:proofErr w:type="spellEnd"/>
       <w:r>
@@ -14514,7 +14520,7 @@
       </w:r>
       <w:proofErr w:type="spellStart"/>
       <w:r>
-        <w:t>Faellt</w:t>
+        <w:t>Fällt</w:t>
       </w:r>
       <w:proofErr w:type="spellEnd"/>
       <w:r>
@@ -14546,7 +14552,7 @@
           <w:b/>
           <w:bCs/>
         </w:rPr>
-        <w:t>duerfen</w:t>
+        <w:t>dürfen</w:t>
       </w:r>
       <w:proofErr w:type="spellEnd"/>
       <w:r>
@@ -14574,7 +14580,7 @@
       </w:r>
       <w:proofErr w:type="spellStart"/>
       <w:r>
-        <w:t>duerfen</w:t>
+        <w:t>dürfen</w:t>
       </w:r>
       <w:proofErr w:type="spellEnd"/>
       <w:r>
@@ -14582,7 +14588,7 @@
       </w:r>
       <w:proofErr w:type="spellStart"/>
       <w:r>
-        <w:t>Paritaetsinformationen</w:t>
+        <w:t>Paritätsinformationen</w:t>
       </w:r>
       <w:proofErr w:type="spellEnd"/>
       <w:r>
@@ -14590,7 +14596,7 @@
       </w:r>
       <w:proofErr w:type="spellStart"/>
       <w:r>
-        <w:t>fuehrt</w:t>
+        <w:t>führt</w:t>
       </w:r>
       <w:proofErr w:type="spellEnd"/>
       <w:r>
@@ -14650,7 +14656,7 @@
       </w:r>
       <w:proofErr w:type="spellStart"/>
       <w:r>
-        <w:t>Datenbloecke</w:t>
+        <w:t>Datenblöcke</w:t>
       </w:r>
       <w:proofErr w:type="spellEnd"/>
       <w:r>
@@ -14884,7 +14890,7 @@
                 <w:sz w:val="20"/>
                 <w:szCs w:val="20"/>
               </w:rPr>
-              <w:t>duerfen</w:t>
+              <w:t>dürfen</w:t>
             </w:r>
             <w:proofErr w:type="spellEnd"/>
             <w:r>
@@ -14924,7 +14930,7 @@
                 <w:sz w:val="20"/>
                 <w:szCs w:val="20"/>
               </w:rPr>
-              <w:t>Verschluesselung</w:t>
+              <w:t>Verschlüsselung</w:t>
             </w:r>
             <w:proofErr w:type="spellEnd"/>
             <w:r>
@@ -14972,7 +14978,7 @@
                 <w:sz w:val="20"/>
                 <w:szCs w:val="20"/>
               </w:rPr>
-              <w:t>Integritaet</w:t>
+              <w:t>Integrität</w:t>
             </w:r>
             <w:proofErr w:type="spellEnd"/>
           </w:p>
@@ -15013,7 +15019,7 @@
                 <w:sz w:val="20"/>
                 <w:szCs w:val="20"/>
               </w:rPr>
-              <w:t>duerfen</w:t>
+              <w:t>dürfen</w:t>
             </w:r>
             <w:proofErr w:type="spellEnd"/>
             <w:r>
@@ -15029,7 +15035,7 @@
                 <w:sz w:val="20"/>
                 <w:szCs w:val="20"/>
               </w:rPr>
-              <w:t>veraendert</w:t>
+              <w:t>verändert</w:t>
             </w:r>
             <w:proofErr w:type="spellEnd"/>
             <w:r>
@@ -15108,7 +15114,7 @@
                 <w:sz w:val="20"/>
                 <w:szCs w:val="20"/>
               </w:rPr>
-              <w:t>Verfuegbarkeit</w:t>
+              <w:t>Verfügbarkeit</w:t>
             </w:r>
             <w:proofErr w:type="spellEnd"/>
           </w:p>
@@ -15149,7 +15155,7 @@
                 <w:sz w:val="20"/>
                 <w:szCs w:val="20"/>
               </w:rPr>
-              <w:t>muessen</w:t>
+              <w:t>müssen</w:t>
             </w:r>
             <w:proofErr w:type="spellEnd"/>
             <w:r>
@@ -15228,7 +15234,7 @@
                 <w:sz w:val="20"/>
                 <w:szCs w:val="20"/>
               </w:rPr>
-              <w:t>Authentizitaet</w:t>
+              <w:t>Authentizität</w:t>
             </w:r>
             <w:proofErr w:type="spellEnd"/>
           </w:p>
@@ -15262,7 +15268,7 @@
                 <w:sz w:val="20"/>
                 <w:szCs w:val="20"/>
               </w:rPr>
-              <w:t>Identitaet</w:t>
+              <w:t>Identität</w:t>
             </w:r>
             <w:proofErr w:type="spellEnd"/>
             <w:r>
@@ -15462,7 +15468,7 @@
                 <w:sz w:val="20"/>
                 <w:szCs w:val="20"/>
               </w:rPr>
-              <w:t>Anhaengen</w:t>
+              <w:t>Anhängen</w:t>
             </w:r>
             <w:proofErr w:type="spellEnd"/>
             <w:r>
@@ -15550,7 +15556,7 @@
                 <w:sz w:val="20"/>
                 <w:szCs w:val="20"/>
               </w:rPr>
-              <w:t>selbststaendig</w:t>
+              <w:t>selbstständig</w:t>
             </w:r>
             <w:proofErr w:type="spellEnd"/>
             <w:r>
@@ -15566,7 +15572,7 @@
                 <w:sz w:val="20"/>
                 <w:szCs w:val="20"/>
               </w:rPr>
-              <w:t>ueber</w:t>
+              <w:t>über</w:t>
             </w:r>
             <w:proofErr w:type="spellEnd"/>
             <w:r>
@@ -15654,7 +15660,7 @@
                 <w:sz w:val="20"/>
                 <w:szCs w:val="20"/>
               </w:rPr>
-              <w:t>nuetzliches</w:t>
+              <w:t>nützliches</w:t>
             </w:r>
             <w:proofErr w:type="spellEnd"/>
             <w:r>
@@ -15670,7 +15676,7 @@
                 <w:sz w:val="20"/>
                 <w:szCs w:val="20"/>
               </w:rPr>
-              <w:t>fuehrt</w:t>
+              <w:t>führt</w:t>
             </w:r>
             <w:proofErr w:type="spellEnd"/>
             <w:r>
@@ -15686,7 +15692,7 @@
                 <w:sz w:val="20"/>
                 <w:szCs w:val="20"/>
               </w:rPr>
-              <w:t>schaedliche</w:t>
+              <w:t>schädliche</w:t>
             </w:r>
             <w:proofErr w:type="spellEnd"/>
             <w:r>
@@ -15840,7 +15846,7 @@
                 <w:sz w:val="20"/>
                 <w:szCs w:val="20"/>
               </w:rPr>
-              <w:t>Taueschung</w:t>
+              <w:t>Täuschung</w:t>
             </w:r>
             <w:proofErr w:type="spellEnd"/>
             <w:r>
@@ -15928,7 +15934,7 @@
                 <w:sz w:val="20"/>
                 <w:szCs w:val="20"/>
               </w:rPr>
-              <w:t>ueber</w:t>
+              <w:t>über</w:t>
             </w:r>
             <w:proofErr w:type="spellEnd"/>
             <w:r>
@@ -16052,7 +16058,7 @@
                 <w:sz w:val="20"/>
                 <w:szCs w:val="20"/>
               </w:rPr>
-              <w:t>Erklaerung</w:t>
+              <w:t>Erklärung</w:t>
             </w:r>
             <w:proofErr w:type="spellEnd"/>
           </w:p>
@@ -16131,7 +16137,7 @@
                 <w:sz w:val="20"/>
                 <w:szCs w:val="20"/>
               </w:rPr>
-              <w:t>Identitaetsnachweis</w:t>
+              <w:t>Identitätsnachweis</w:t>
             </w:r>
             <w:proofErr w:type="spellEnd"/>
             <w:r>
@@ -16217,7 +16223,7 @@
                 <w:sz w:val="20"/>
                 <w:szCs w:val="20"/>
               </w:rPr>
-              <w:t>prueft</w:t>
+              <w:t>prüft</w:t>
             </w:r>
             <w:proofErr w:type="spellEnd"/>
             <w:r>
@@ -16303,7 +16309,7 @@
                 <w:sz w:val="20"/>
                 <w:szCs w:val="20"/>
               </w:rPr>
-              <w:t>Pruefung</w:t>
+              <w:t>Prüfung</w:t>
             </w:r>
             <w:proofErr w:type="spellEnd"/>
             <w:r>
@@ -16317,13 +16323,14 @@
         </w:tc>
       </w:tr>
     </w:tbl>
+    <w:p/>
     <w:p>
       <w:pPr>
         <w:spacing w:after="120" w:line="264" w:lineRule="auto"/>
       </w:pPr>
       <w:proofErr w:type="spellStart"/>
       <w:r>
-        <w:t>Identitaet</w:t>
+        <w:t>Identität</w:t>
       </w:r>
       <w:proofErr w:type="spellEnd"/>
       <w:r>
@@ -16331,7 +16338,7 @@
       </w:r>
       <w:proofErr w:type="spellStart"/>
       <w:r>
-        <w:t>ueber</w:t>
+        <w:t>über</w:t>
       </w:r>
       <w:proofErr w:type="spellEnd"/>
       <w:r>
@@ -16354,7 +16361,7 @@
       </w:r>
       <w:proofErr w:type="spellStart"/>
       <w:r>
-        <w:t>Zustaende</w:t>
+        <w:t>Zustände</w:t>
       </w:r>
       <w:proofErr w:type="spellEnd"/>
       <w:r>
@@ -16362,7 +16369,7 @@
       </w:r>
       <w:proofErr w:type="spellStart"/>
       <w:r>
-        <w:t>beruecksichtigen</w:t>
+        <w:t>berücksichtigen</w:t>
       </w:r>
       <w:proofErr w:type="spellEnd"/>
       <w:r>
@@ -16385,7 +16392,7 @@
       </w:r>
       <w:proofErr w:type="spellStart"/>
       <w:r>
-        <w:t>Integritaet</w:t>
+        <w:t>Integrität</w:t>
       </w:r>
       <w:proofErr w:type="spellEnd"/>
       <w:r>
@@ -16393,7 +16400,7 @@
       </w:r>
       <w:proofErr w:type="spellStart"/>
       <w:r>
-        <w:t>Authentizitaet</w:t>
+        <w:t>Authentizität</w:t>
       </w:r>
       <w:proofErr w:type="spellEnd"/>
       <w:r>
@@ -16401,7 +16408,7 @@
       </w:r>
       <w:proofErr w:type="spellStart"/>
       <w:r>
-        <w:t>Schluessel</w:t>
+        <w:t>Schlüssel</w:t>
       </w:r>
       <w:proofErr w:type="spellEnd"/>
       <w:r>
@@ -16409,7 +16416,7 @@
       </w:r>
       <w:proofErr w:type="spellStart"/>
       <w:r>
-        <w:t>oeffentlichen</w:t>
+        <w:t>öffentlichen</w:t>
       </w:r>
       <w:proofErr w:type="spellEnd"/>
       <w:r>
@@ -16417,7 +16424,7 @@
       </w:r>
       <w:proofErr w:type="spellStart"/>
       <w:r>
-        <w:t>Schluessel</w:t>
+        <w:t>Schlüssel</w:t>
       </w:r>
       <w:proofErr w:type="spellEnd"/>
       <w:r>
@@ -16425,7 +16432,7 @@
       </w:r>
       <w:proofErr w:type="spellStart"/>
       <w:r>
-        <w:t>geprueft</w:t>
+        <w:t>geprüft</w:t>
       </w:r>
       <w:proofErr w:type="spellEnd"/>
       <w:r>
@@ -16443,7 +16450,7 @@
       </w:pPr>
       <w:proofErr w:type="spellStart"/>
       <w:r>
-        <w:t>Uebungsfragen</w:t>
+        <w:t>Übungsfragen</w:t>
       </w:r>
       <w:proofErr w:type="spellEnd"/>
     </w:p>
@@ -16482,7 +16489,7 @@
           <w:b/>
           <w:bCs/>
         </w:rPr>
-        <w:t>durchlaeuft</w:t>
+        <w:t>durchläuft</w:t>
       </w:r>
       <w:proofErr w:type="spellEnd"/>
       <w:r>
@@ -16510,7 +16517,7 @@
       </w:r>
       <w:proofErr w:type="spellStart"/>
       <w:r>
-        <w:t>Anhaengen</w:t>
+        <w:t>Anhängen</w:t>
       </w:r>
       <w:proofErr w:type="spellEnd"/>
       <w:r>
@@ -16518,7 +16525,7 @@
       </w:r>
       <w:proofErr w:type="spellStart"/>
       <w:r>
-        <w:t>Ausloesen</w:t>
+        <w:t>Auslösen</w:t>
       </w:r>
       <w:proofErr w:type="spellEnd"/>
       <w:r>
@@ -16598,7 +16605,7 @@
       </w:r>
       <w:proofErr w:type="spellStart"/>
       <w:r>
-        <w:t>prueft</w:t>
+        <w:t>prüft</w:t>
       </w:r>
       <w:proofErr w:type="spellEnd"/>
       <w:r>
@@ -16901,7 +16908,7 @@
                 <w:sz w:val="20"/>
                 <w:szCs w:val="20"/>
               </w:rPr>
-              <w:t>fuer</w:t>
+              <w:t>für</w:t>
             </w:r>
             <w:proofErr w:type="spellEnd"/>
             <w:r>
@@ -16989,7 +16996,7 @@
                 <w:sz w:val="20"/>
                 <w:szCs w:val="20"/>
               </w:rPr>
-              <w:t>Empfaenger</w:t>
+              <w:t>Empfänger</w:t>
             </w:r>
             <w:proofErr w:type="spellEnd"/>
             <w:r>
@@ -17005,7 +17012,7 @@
                 <w:sz w:val="20"/>
                 <w:szCs w:val="20"/>
               </w:rPr>
-              <w:t>ueber</w:t>
+              <w:t>über</w:t>
             </w:r>
             <w:proofErr w:type="spellEnd"/>
             <w:r>
@@ -17253,7 +17260,7 @@
                 <w:sz w:val="20"/>
                 <w:szCs w:val="20"/>
               </w:rPr>
-              <w:t>vollstaendig</w:t>
+              <w:t>vollständig</w:t>
             </w:r>
             <w:proofErr w:type="spellEnd"/>
             <w:r>
@@ -17528,7 +17535,7 @@
                 <w:sz w:val="20"/>
                 <w:szCs w:val="20"/>
               </w:rPr>
-              <w:t>persoenlicher</w:t>
+              <w:t>persönlicher</w:t>
             </w:r>
             <w:proofErr w:type="spellEnd"/>
             <w:r>
@@ -17639,7 +17646,7 @@
                 <w:sz w:val="20"/>
                 <w:szCs w:val="20"/>
               </w:rPr>
-              <w:t>Gebaeude</w:t>
+              <w:t>Gebäude</w:t>
             </w:r>
             <w:proofErr w:type="spellEnd"/>
             <w:r>
@@ -18154,7 +18161,7 @@
                 <w:sz w:val="20"/>
                 <w:szCs w:val="20"/>
               </w:rPr>
-              <w:t>koennen</w:t>
+              <w:t>können</w:t>
             </w:r>
             <w:proofErr w:type="spellEnd"/>
             <w:r>
@@ -18242,7 +18249,7 @@
                 <w:sz w:val="20"/>
                 <w:szCs w:val="20"/>
               </w:rPr>
-              <w:t>Ausfaelle</w:t>
+              <w:t>Ausfälle</w:t>
             </w:r>
             <w:proofErr w:type="spellEnd"/>
             <w:r>
@@ -18572,7 +18579,7 @@
                 <w:sz w:val="20"/>
                 <w:szCs w:val="20"/>
               </w:rPr>
-              <w:t>fuer</w:t>
+              <w:t>für</w:t>
             </w:r>
             <w:proofErr w:type="spellEnd"/>
             <w:r>
@@ -18695,7 +18702,7 @@
                 <w:sz w:val="20"/>
                 <w:szCs w:val="20"/>
               </w:rPr>
-              <w:t>Verschluesselung</w:t>
+              <w:t>Verschlüsselung</w:t>
             </w:r>
             <w:proofErr w:type="spellEnd"/>
             <w:r>
@@ -18925,7 +18932,7 @@
                 <w:sz w:val="20"/>
                 <w:szCs w:val="20"/>
               </w:rPr>
-              <w:t>Zuverlaessigkeit</w:t>
+              <w:t>Zuverlässigkeit</w:t>
             </w:r>
             <w:proofErr w:type="spellEnd"/>
             <w:r>
@@ -19230,7 +19237,7 @@
                 <w:sz w:val="20"/>
                 <w:szCs w:val="20"/>
               </w:rPr>
-              <w:t>Bituebertragung</w:t>
+              <w:t>Bitübertragung</w:t>
             </w:r>
             <w:proofErr w:type="spellEnd"/>
           </w:p>
@@ -19271,7 +19278,7 @@
                 <w:sz w:val="20"/>
                 <w:szCs w:val="20"/>
               </w:rPr>
-              <w:t>Uebertragung</w:t>
+              <w:t>Übertragung</w:t>
             </w:r>
             <w:proofErr w:type="spellEnd"/>
             <w:r>
@@ -19649,7 +19656,7 @@
                 <w:sz w:val="20"/>
                 <w:szCs w:val="20"/>
               </w:rPr>
-              <w:t>ueber</w:t>
+              <w:t>über</w:t>
             </w:r>
             <w:proofErr w:type="spellEnd"/>
             <w:r>
@@ -19879,7 +19886,7 @@
                 <w:sz w:val="20"/>
                 <w:szCs w:val="20"/>
               </w:rPr>
-              <w:t>Uebertragung</w:t>
+              <w:t>Übertragung</w:t>
             </w:r>
             <w:proofErr w:type="spellEnd"/>
             <w:r>
@@ -19940,7 +19947,7 @@
             </w:r>
             <w:proofErr w:type="spellStart"/>
             <w:r>
-              <w:t>Erklaeren</w:t>
+              <w:t>Erklären</w:t>
             </w:r>
             <w:proofErr w:type="spellEnd"/>
             <w:r>
@@ -19948,7 +19955,7 @@
             </w:r>
             <w:proofErr w:type="spellStart"/>
             <w:r>
-              <w:t>staerker</w:t>
+              <w:t>stärker</w:t>
             </w:r>
             <w:proofErr w:type="spellEnd"/>
             <w:r>
@@ -19973,7 +19980,7 @@
       </w:r>
       <w:proofErr w:type="spellStart"/>
       <w:r>
-        <w:t>Bituebertragungsschicht</w:t>
+        <w:t>Bitübertragungsschicht</w:t>
       </w:r>
       <w:bookmarkEnd w:id="14"/>
       <w:proofErr w:type="spellEnd"/>
@@ -20176,7 +20183,7 @@
                 <w:sz w:val="20"/>
                 <w:szCs w:val="20"/>
               </w:rPr>
-              <w:t>Stoerungsreduktion</w:t>
+              <w:t>Störungsreduktion</w:t>
             </w:r>
             <w:proofErr w:type="spellEnd"/>
             <w:r>
@@ -20335,7 +20342,7 @@
                 <w:sz w:val="20"/>
                 <w:szCs w:val="20"/>
               </w:rPr>
-              <w:t>Uebertragung</w:t>
+              <w:t>Übertragung</w:t>
             </w:r>
             <w:proofErr w:type="spellEnd"/>
             <w:r>
@@ -20351,7 +20358,7 @@
                 <w:sz w:val="20"/>
                 <w:szCs w:val="20"/>
               </w:rPr>
-              <w:t>Daempfung</w:t>
+              <w:t>Dämpfung</w:t>
             </w:r>
             <w:proofErr w:type="spellEnd"/>
             <w:r>
@@ -20367,7 +20374,7 @@
                 <w:sz w:val="20"/>
                 <w:szCs w:val="20"/>
               </w:rPr>
-              <w:t>Stoerungen</w:t>
+              <w:t>Störungen</w:t>
             </w:r>
             <w:proofErr w:type="spellEnd"/>
             <w:r>
@@ -20451,7 +20458,7 @@
                 <w:sz w:val="20"/>
                 <w:szCs w:val="20"/>
               </w:rPr>
-              <w:t>Ungefuehrte</w:t>
+              <w:t>Ungeführte</w:t>
             </w:r>
             <w:proofErr w:type="spellEnd"/>
             <w:r>
@@ -20467,7 +20474,7 @@
                 <w:sz w:val="20"/>
                 <w:szCs w:val="20"/>
               </w:rPr>
-              <w:t>Uebertragung</w:t>
+              <w:t>Übertragung</w:t>
             </w:r>
             <w:proofErr w:type="spellEnd"/>
             <w:r>
@@ -20483,7 +20490,7 @@
                 <w:sz w:val="20"/>
                 <w:szCs w:val="20"/>
               </w:rPr>
-              <w:t>Stoerungsfragen</w:t>
+              <w:t>Störungsfragen</w:t>
             </w:r>
             <w:proofErr w:type="spellEnd"/>
             <w:r>
@@ -20656,7 +20663,7 @@
                 <w:sz w:val="20"/>
                 <w:szCs w:val="20"/>
               </w:rPr>
-              <w:t>uebertragen</w:t>
+              <w:t>übertragen</w:t>
             </w:r>
             <w:proofErr w:type="spellEnd"/>
             <w:r>
@@ -20709,7 +20716,7 @@
                 <w:sz w:val="20"/>
                 <w:szCs w:val="20"/>
               </w:rPr>
-              <w:t>Bandpassuebertragung</w:t>
+              <w:t>Bandpassübertragung</w:t>
             </w:r>
             <w:proofErr w:type="spellEnd"/>
           </w:p>
@@ -20749,7 +20756,7 @@
                 <w:sz w:val="20"/>
                 <w:szCs w:val="20"/>
               </w:rPr>
-              <w:t>Traegersignal</w:t>
+              <w:t>Trägersignal</w:t>
             </w:r>
             <w:proofErr w:type="spellEnd"/>
             <w:r>
@@ -20915,7 +20922,7 @@
                 <w:sz w:val="20"/>
                 <w:szCs w:val="20"/>
               </w:rPr>
-              <w:t>Kanaele</w:t>
+              <w:t>Kanäle</w:t>
             </w:r>
             <w:proofErr w:type="spellEnd"/>
             <w:r>
@@ -20931,7 +20938,7 @@
                 <w:sz w:val="20"/>
                 <w:szCs w:val="20"/>
               </w:rPr>
-              <w:t>Wellenlaengen</w:t>
+              <w:t>Wellenlängen</w:t>
             </w:r>
             <w:proofErr w:type="spellEnd"/>
             <w:r>
@@ -21173,7 +21180,7 @@
                 <w:sz w:val="20"/>
                 <w:szCs w:val="20"/>
               </w:rPr>
-              <w:t>Untertraeger</w:t>
+              <w:t>Unterträger</w:t>
             </w:r>
             <w:proofErr w:type="spellEnd"/>
             <w:r>
@@ -21223,7 +21230,7 @@
                 <w:bCs/>
                 <w:color w:val="2E75B6"/>
               </w:rPr>
-              <w:t>Pruefungstipp</w:t>
+              <w:t>Prüfungstipp</w:t>
             </w:r>
             <w:proofErr w:type="spellEnd"/>
           </w:p>
@@ -21236,7 +21243,7 @@
             </w:r>
             <w:proofErr w:type="spellStart"/>
             <w:r>
-              <w:t>Bituebertragung</w:t>
+              <w:t>Bitübertragung</w:t>
             </w:r>
             <w:proofErr w:type="spellEnd"/>
             <w:r>
@@ -21244,7 +21251,7 @@
             </w:r>
             <w:proofErr w:type="spellStart"/>
             <w:r>
-              <w:t>Stoerungen</w:t>
+              <w:t>Störungen</w:t>
             </w:r>
             <w:proofErr w:type="spellEnd"/>
             <w:r>
@@ -21371,7 +21378,7 @@
                 <w:sz w:val="20"/>
                 <w:szCs w:val="20"/>
               </w:rPr>
-              <w:t>Erklaerung</w:t>
+              <w:t>Erklärung</w:t>
             </w:r>
             <w:proofErr w:type="spellEnd"/>
           </w:p>
@@ -21450,7 +21457,7 @@
                 <w:sz w:val="20"/>
                 <w:szCs w:val="20"/>
               </w:rPr>
-              <w:t>Pruefinformationen</w:t>
+              <w:t>Prüfinformationen</w:t>
             </w:r>
             <w:proofErr w:type="spellEnd"/>
             <w:r>
@@ -21498,7 +21505,7 @@
                 <w:sz w:val="20"/>
                 <w:szCs w:val="20"/>
               </w:rPr>
-              <w:t>Laengenfeld</w:t>
+              <w:t>Längenfeld</w:t>
             </w:r>
             <w:proofErr w:type="spellEnd"/>
           </w:p>
@@ -21538,7 +21545,7 @@
                 <w:sz w:val="20"/>
                 <w:szCs w:val="20"/>
               </w:rPr>
-              <w:t>enthaelt</w:t>
+              <w:t>enthält</w:t>
             </w:r>
             <w:proofErr w:type="spellEnd"/>
             <w:r>
@@ -21554,7 +21561,7 @@
                 <w:sz w:val="20"/>
                 <w:szCs w:val="20"/>
               </w:rPr>
-              <w:t>Laenge</w:t>
+              <w:t>Länge</w:t>
             </w:r>
             <w:proofErr w:type="spellEnd"/>
             <w:r>
@@ -21728,7 +21735,7 @@
                 <w:sz w:val="20"/>
                 <w:szCs w:val="20"/>
               </w:rPr>
-              <w:t>entschaerft</w:t>
+              <w:t>entschärft</w:t>
             </w:r>
             <w:proofErr w:type="spellEnd"/>
             <w:r>
@@ -21816,7 +21823,7 @@
                 <w:sz w:val="20"/>
                 <w:szCs w:val="20"/>
               </w:rPr>
-              <w:t>Ungueltige</w:t>
+              <w:t>Ungültige</w:t>
             </w:r>
             <w:proofErr w:type="spellEnd"/>
             <w:r>
@@ -21832,7 +21839,7 @@
                 <w:sz w:val="20"/>
                 <w:szCs w:val="20"/>
               </w:rPr>
-              <w:t>Zustaende</w:t>
+              <w:t>Zustände</w:t>
             </w:r>
             <w:proofErr w:type="spellEnd"/>
             <w:r>
@@ -21959,7 +21966,7 @@
                 <w:sz w:val="20"/>
                 <w:szCs w:val="20"/>
               </w:rPr>
-              <w:t>Paritaetsbit</w:t>
+              <w:t>Paritätsbit</w:t>
             </w:r>
             <w:proofErr w:type="spellEnd"/>
           </w:p>
@@ -21999,7 +22006,7 @@
                 <w:sz w:val="20"/>
                 <w:szCs w:val="20"/>
               </w:rPr>
-              <w:t>zusaetzliches</w:t>
+              <w:t>zusätzliches</w:t>
             </w:r>
             <w:proofErr w:type="spellEnd"/>
             <w:r>
@@ -22047,7 +22054,7 @@
                 <w:sz w:val="20"/>
                 <w:szCs w:val="20"/>
               </w:rPr>
-              <w:t>Pruef</w:t>
+              <w:t>Prüf</w:t>
             </w:r>
             <w:proofErr w:type="spellEnd"/>
             <w:r>
@@ -22094,7 +22101,7 @@
                 <w:sz w:val="20"/>
                 <w:szCs w:val="20"/>
               </w:rPr>
-              <w:t>ueber</w:t>
+              <w:t>über</w:t>
             </w:r>
             <w:proofErr w:type="spellEnd"/>
             <w:r>
@@ -22250,7 +22257,7 @@
                 <w:sz w:val="20"/>
                 <w:szCs w:val="20"/>
               </w:rPr>
-              <w:t>Rueckmeldung</w:t>
+              <w:t>Rückmeldung</w:t>
             </w:r>
             <w:proofErr w:type="spellEnd"/>
             <w:r>
@@ -22266,7 +22273,7 @@
                 <w:sz w:val="20"/>
                 <w:szCs w:val="20"/>
               </w:rPr>
-              <w:t>ueber</w:t>
+              <w:t>über</w:t>
             </w:r>
             <w:proofErr w:type="spellEnd"/>
             <w:r>
@@ -22370,7 +22377,7 @@
                 <w:sz w:val="20"/>
                 <w:szCs w:val="20"/>
               </w:rPr>
-              <w:t>duerfen</w:t>
+              <w:t>dürfen</w:t>
             </w:r>
             <w:proofErr w:type="spellEnd"/>
             <w:r>
@@ -22386,7 +22393,7 @@
                 <w:sz w:val="20"/>
                 <w:szCs w:val="20"/>
               </w:rPr>
-              <w:t>unbestaetigt</w:t>
+              <w:t>unbestätigt</w:t>
             </w:r>
             <w:proofErr w:type="spellEnd"/>
             <w:r>
@@ -22762,6 +22769,7 @@
         </w:tc>
       </w:tr>
     </w:tbl>
+    <w:p/>
     <w:p>
       <w:pPr>
         <w:spacing w:before="100" w:after="30" w:line="260" w:lineRule="auto"/>
@@ -22787,7 +22795,7 @@
           <w:b/>
           <w:bCs/>
         </w:rPr>
-        <w:t>noetig</w:t>
+        <w:t>nötig</w:t>
       </w:r>
       <w:proofErr w:type="spellEnd"/>
       <w:r>
@@ -22815,7 +22823,7 @@
       </w:r>
       <w:proofErr w:type="spellStart"/>
       <w:r>
-        <w:t>koennen</w:t>
+        <w:t>können</w:t>
       </w:r>
       <w:proofErr w:type="spellEnd"/>
       <w:r>
@@ -22823,7 +22831,7 @@
       </w:r>
       <w:proofErr w:type="spellStart"/>
       <w:r>
-        <w:t>zuverlaessig</w:t>
+        <w:t>zuverlässig</w:t>
       </w:r>
       <w:proofErr w:type="spellEnd"/>
       <w:r>
@@ -22914,7 +22922,7 @@
                 <w:sz w:val="20"/>
                 <w:szCs w:val="20"/>
               </w:rPr>
-              <w:t>Geraet</w:t>
+              <w:t>Gerät</w:t>
             </w:r>
             <w:proofErr w:type="spellEnd"/>
           </w:p>
@@ -23495,6 +23503,7 @@
         </w:tc>
       </w:tr>
     </w:tbl>
+    <w:p/>
     <w:p>
       <w:pPr>
         <w:spacing w:after="120" w:line="264" w:lineRule="auto"/>
@@ -23551,7 +23560,7 @@
       </w:r>
       <w:proofErr w:type="spellStart"/>
       <w:r>
-        <w:t>Domaenen</w:t>
+        <w:t>Domänen</w:t>
       </w:r>
       <w:proofErr w:type="spellEnd"/>
       <w:r>
@@ -23559,7 +23568,7 @@
       </w:r>
       <w:proofErr w:type="spellStart"/>
       <w:r>
-        <w:t>gehoert</w:t>
+        <w:t>gehört</w:t>
       </w:r>
       <w:proofErr w:type="spellEnd"/>
       <w:r>
@@ -23663,7 +23672,7 @@
                 <w:sz w:val="20"/>
                 <w:szCs w:val="20"/>
               </w:rPr>
-              <w:t>Erklaerung</w:t>
+              <w:t>Erklärung</w:t>
             </w:r>
             <w:proofErr w:type="spellEnd"/>
           </w:p>
@@ -23742,7 +23751,7 @@
                 <w:sz w:val="20"/>
                 <w:szCs w:val="20"/>
               </w:rPr>
-              <w:t>fuer</w:t>
+              <w:t>für</w:t>
             </w:r>
             <w:proofErr w:type="spellEnd"/>
             <w:r>
@@ -24047,7 +24056,7 @@
                 <w:sz w:val="20"/>
                 <w:szCs w:val="20"/>
               </w:rPr>
-              <w:t>Prioritaeten</w:t>
+              <w:t>Prioritäten</w:t>
             </w:r>
             <w:proofErr w:type="spellEnd"/>
             <w:r>
@@ -24061,6 +24070,7 @@
         </w:tc>
       </w:tr>
     </w:tbl>
+    <w:p/>
     <w:p>
       <w:pPr>
         <w:spacing w:before="100" w:after="30" w:line="260" w:lineRule="auto"/>
@@ -24079,7 +24089,7 @@
           <w:b/>
           <w:bCs/>
         </w:rPr>
-        <w:t>Wofuer</w:t>
+        <w:t>Wofür</w:t>
       </w:r>
       <w:proofErr w:type="spellEnd"/>
       <w:r>
@@ -24123,7 +24133,7 @@
       </w:r>
       <w:proofErr w:type="spellStart"/>
       <w:r>
-        <w:t>Stuerme</w:t>
+        <w:t>Stürme</w:t>
       </w:r>
       <w:proofErr w:type="spellEnd"/>
       <w:r>
@@ -24175,7 +24185,7 @@
       </w:r>
       <w:proofErr w:type="spellStart"/>
       <w:r>
-        <w:t>Domaenen</w:t>
+        <w:t>Domänen</w:t>
       </w:r>
       <w:proofErr w:type="spellEnd"/>
       <w:r>
@@ -24183,7 +24193,7 @@
       </w:r>
       <w:proofErr w:type="spellStart"/>
       <w:r>
-        <w:t>erhoeht</w:t>
+        <w:t>erhöht</w:t>
       </w:r>
       <w:proofErr w:type="spellEnd"/>
       <w:r>
@@ -24191,7 +24201,7 @@
       </w:r>
       <w:proofErr w:type="spellStart"/>
       <w:r>
-        <w:t>ueber</w:t>
+        <w:t>über</w:t>
       </w:r>
       <w:proofErr w:type="spellEnd"/>
       <w:r>
@@ -24320,7 +24330,7 @@
                 <w:sz w:val="20"/>
                 <w:szCs w:val="20"/>
               </w:rPr>
-              <w:t>Erklaerung</w:t>
+              <w:t>Erklärung</w:t>
             </w:r>
             <w:proofErr w:type="spellEnd"/>
           </w:p>
@@ -24404,7 +24414,7 @@
                 <w:sz w:val="20"/>
                 <w:szCs w:val="20"/>
               </w:rPr>
-              <w:t>traegt</w:t>
+              <w:t>trägt</w:t>
             </w:r>
             <w:proofErr w:type="spellEnd"/>
             <w:r>
@@ -24420,7 +24430,7 @@
                 <w:sz w:val="20"/>
                 <w:szCs w:val="20"/>
               </w:rPr>
-              <w:t>unabhaengig</w:t>
+              <w:t>unabhängig</w:t>
             </w:r>
             <w:proofErr w:type="spellEnd"/>
             <w:r>
@@ -24511,7 +24521,7 @@
                 <w:sz w:val="20"/>
                 <w:szCs w:val="20"/>
               </w:rPr>
-              <w:t>Uebertragung</w:t>
+              <w:t>Übertragung</w:t>
             </w:r>
             <w:proofErr w:type="spellEnd"/>
             <w:r>
@@ -24620,7 +24630,7 @@
                 <w:sz w:val="20"/>
                 <w:szCs w:val="20"/>
               </w:rPr>
-              <w:t>guenstigste</w:t>
+              <w:t>günstigste</w:t>
             </w:r>
             <w:proofErr w:type="spellEnd"/>
             <w:r>
@@ -25015,7 +25025,7 @@
             </w:r>
             <w:proofErr w:type="spellStart"/>
             <w:r>
-              <w:t>Praefixen</w:t>
+              <w:t>Präfixen</w:t>
             </w:r>
             <w:proofErr w:type="spellEnd"/>
             <w:r>
@@ -25025,6 +25035,7 @@
         </w:tc>
       </w:tr>
     </w:tbl>
+    <w:p/>
     <w:p>
       <w:pPr>
         <w:spacing w:after="120" w:line="264" w:lineRule="auto"/>
@@ -25042,7 +25053,7 @@
       </w:r>
       <w:proofErr w:type="spellStart"/>
       <w:r>
-        <w:t>Paketgroesse</w:t>
+        <w:t>Paketgröße</w:t>
       </w:r>
       <w:proofErr w:type="spellEnd"/>
       <w:r>
@@ -25050,7 +25061,7 @@
       </w:r>
       <w:proofErr w:type="spellStart"/>
       <w:r>
-        <w:t>groesser</w:t>
+        <w:t>größer</w:t>
       </w:r>
       <w:proofErr w:type="spellEnd"/>
       <w:r>
@@ -25058,7 +25069,7 @@
       </w:r>
       <w:proofErr w:type="spellStart"/>
       <w:r>
-        <w:t>erhoeht</w:t>
+        <w:t>erhöht</w:t>
       </w:r>
       <w:proofErr w:type="spellEnd"/>
       <w:r>
@@ -25066,7 +25077,7 @@
       </w:r>
       <w:proofErr w:type="spellStart"/>
       <w:r>
-        <w:t>Fehleranfaelligkeit</w:t>
+        <w:t>Fehleranfälligkeit</w:t>
       </w:r>
       <w:proofErr w:type="spellEnd"/>
       <w:r>
@@ -25089,7 +25100,7 @@
       </w:r>
       <w:proofErr w:type="spellStart"/>
       <w:r>
-        <w:t>urspruengliche</w:t>
+        <w:t>ursprüngliche</w:t>
       </w:r>
       <w:proofErr w:type="spellEnd"/>
       <w:r>
@@ -25165,7 +25176,7 @@
       </w:r>
       <w:proofErr w:type="spellStart"/>
       <w:r>
-        <w:t>waehlt</w:t>
+        <w:t>wählt</w:t>
       </w:r>
       <w:proofErr w:type="spellEnd"/>
       <w:r>
@@ -25173,7 +25184,7 @@
       </w:r>
       <w:proofErr w:type="spellStart"/>
       <w:r>
-        <w:t>laengsten</w:t>
+        <w:t>längsten</w:t>
       </w:r>
       <w:proofErr w:type="spellEnd"/>
       <w:r>
@@ -25181,7 +25192,7 @@
       </w:r>
       <w:proofErr w:type="spellStart"/>
       <w:r>
-        <w:t>Netzpraefix</w:t>
+        <w:t>Netzpräfix</w:t>
       </w:r>
       <w:proofErr w:type="spellEnd"/>
       <w:r>
@@ -25428,7 +25439,7 @@
                 <w:sz w:val="20"/>
                 <w:szCs w:val="20"/>
               </w:rPr>
-              <w:t>fuer</w:t>
+              <w:t>für</w:t>
             </w:r>
             <w:proofErr w:type="spellEnd"/>
             <w:r>
@@ -26010,7 +26021,7 @@
                 <w:sz w:val="20"/>
                 <w:szCs w:val="20"/>
               </w:rPr>
-              <w:t>haeufig</w:t>
+              <w:t>häufig</w:t>
             </w:r>
             <w:proofErr w:type="spellEnd"/>
             <w:r>
@@ -26026,7 +26037,7 @@
                 <w:sz w:val="20"/>
                 <w:szCs w:val="20"/>
               </w:rPr>
-              <w:t>fuer</w:t>
+              <w:t>für</w:t>
             </w:r>
             <w:proofErr w:type="spellEnd"/>
             <w:r>
@@ -26095,7 +26106,7 @@
             </w:r>
             <w:proofErr w:type="spellStart"/>
             <w:r>
-              <w:t>zusaetzliche</w:t>
+              <w:t>zusätzliche</w:t>
             </w:r>
             <w:proofErr w:type="spellEnd"/>
             <w:r>
@@ -26103,7 +26114,7 @@
             </w:r>
             <w:proofErr w:type="spellStart"/>
             <w:r>
-              <w:t>fuer</w:t>
+              <w:t>für</w:t>
             </w:r>
             <w:proofErr w:type="spellEnd"/>
             <w:r>
@@ -26113,6 +26124,7 @@
         </w:tc>
       </w:tr>
     </w:tbl>
+    <w:p/>
     <w:p>
       <w:pPr>
         <w:spacing w:after="120" w:line="264" w:lineRule="auto"/>
@@ -26137,7 +26149,7 @@
       </w:r>
       <w:proofErr w:type="spellStart"/>
       <w:r>
-        <w:t>uebersetzt</w:t>
+        <w:t>übersetzt</w:t>
       </w:r>
       <w:proofErr w:type="spellEnd"/>
       <w:r>
@@ -26145,7 +26157,7 @@
       </w:r>
       <w:proofErr w:type="spellStart"/>
       <w:r>
-        <w:t>oeffentliche</w:t>
+        <w:t>öffentliche</w:t>
       </w:r>
       <w:proofErr w:type="spellEnd"/>
       <w:r>
@@ -26168,7 +26180,7 @@
       </w:r>
       <w:proofErr w:type="spellStart"/>
       <w:r>
-        <w:t>aufgeraeumt</w:t>
+        <w:t>aufgeräumt</w:t>
       </w:r>
       <w:proofErr w:type="spellEnd"/>
       <w:r>
@@ -26176,7 +26188,7 @@
       </w:r>
       <w:proofErr w:type="spellStart"/>
       <w:r>
-        <w:t>ueber</w:t>
+        <w:t>über</w:t>
       </w:r>
       <w:proofErr w:type="spellEnd"/>
       <w:r>
@@ -26892,7 +26904,7 @@
                 <w:sz w:val="20"/>
                 <w:szCs w:val="20"/>
               </w:rPr>
-              <w:t>Zuverlaessige</w:t>
+              <w:t>Zuverlässige</w:t>
             </w:r>
             <w:proofErr w:type="spellEnd"/>
             <w:r>
@@ -26908,7 +26920,7 @@
                 <w:sz w:val="20"/>
                 <w:szCs w:val="20"/>
               </w:rPr>
-              <w:t>Uebertragung</w:t>
+              <w:t>Übertragung</w:t>
             </w:r>
             <w:proofErr w:type="spellEnd"/>
             <w:r>
@@ -26955,7 +26967,7 @@
                 <w:sz w:val="20"/>
                 <w:szCs w:val="20"/>
               </w:rPr>
-              <w:t>fuer</w:t>
+              <w:t>für</w:t>
             </w:r>
             <w:proofErr w:type="spellEnd"/>
             <w:r>
@@ -27296,7 +27308,7 @@
                 <w:sz w:val="20"/>
                 <w:szCs w:val="20"/>
               </w:rPr>
-              <w:t>aufloesen</w:t>
+              <w:t>auflösen</w:t>
             </w:r>
             <w:proofErr w:type="spellEnd"/>
             <w:r>
@@ -27388,7 +27400,7 @@
                 <w:sz w:val="20"/>
                 <w:szCs w:val="20"/>
               </w:rPr>
-              <w:t>zusaetzlich</w:t>
+              <w:t>zusätzlich</w:t>
             </w:r>
             <w:proofErr w:type="spellEnd"/>
             <w:r>
@@ -27404,7 +27416,7 @@
                 <w:sz w:val="20"/>
                 <w:szCs w:val="20"/>
               </w:rPr>
-              <w:t>verschluesselt</w:t>
+              <w:t>verschlüsselt</w:t>
             </w:r>
             <w:proofErr w:type="spellEnd"/>
             <w:r>
@@ -27420,7 +27432,7 @@
                 <w:sz w:val="20"/>
                 <w:szCs w:val="20"/>
               </w:rPr>
-              <w:t>ueber</w:t>
+              <w:t>über</w:t>
             </w:r>
             <w:proofErr w:type="spellEnd"/>
             <w:r>
@@ -27664,7 +27676,7 @@
                 <w:sz w:val="20"/>
                 <w:szCs w:val="20"/>
               </w:rPr>
-              <w:t>Dateiuebertragung</w:t>
+              <w:t>Dateiübertragung</w:t>
             </w:r>
             <w:proofErr w:type="spellEnd"/>
             <w:r>
@@ -27790,7 +27802,7 @@
                 <w:bCs/>
                 <w:color w:val="2E75B6"/>
               </w:rPr>
-              <w:t>Pruefungstipp</w:t>
+              <w:t>Prüfungstipp</w:t>
             </w:r>
             <w:proofErr w:type="spellEnd"/>
           </w:p>
@@ -27803,7 +27815,7 @@
             </w:r>
             <w:proofErr w:type="spellStart"/>
             <w:r>
-              <w:t>zuverlaessig</w:t>
+              <w:t>zuverlässig</w:t>
             </w:r>
             <w:proofErr w:type="spellEnd"/>
             <w:r>
@@ -27828,7 +27840,7 @@
       </w:r>
       <w:proofErr w:type="spellStart"/>
       <w:r>
-        <w:t>Ergaenzungen</w:t>
+        <w:t>Ergänzungen</w:t>
       </w:r>
       <w:proofErr w:type="spellEnd"/>
       <w:r>
@@ -27855,7 +27867,7 @@
       </w:r>
       <w:proofErr w:type="spellStart"/>
       <w:r>
-        <w:t>fuer</w:t>
+        <w:t>für</w:t>
       </w:r>
       <w:proofErr w:type="spellEnd"/>
       <w:r>
@@ -28224,7 +28236,7 @@
                 <w:sz w:val="20"/>
                 <w:szCs w:val="20"/>
               </w:rPr>
-              <w:t>haeufig</w:t>
+              <w:t>häufig</w:t>
             </w:r>
             <w:proofErr w:type="spellEnd"/>
             <w:r>
@@ -28304,6 +28316,7 @@
         </w:tc>
       </w:tr>
     </w:tbl>
+    <w:p/>
     <w:p>
       <w:pPr>
         <w:spacing w:after="120" w:line="264" w:lineRule="auto"/>
@@ -28427,7 +28440,7 @@
                 <w:sz w:val="20"/>
                 <w:szCs w:val="20"/>
               </w:rPr>
-              <w:t>Erklaerung</w:t>
+              <w:t>Erklärung</w:t>
             </w:r>
             <w:proofErr w:type="spellEnd"/>
           </w:p>
@@ -28511,7 +28524,7 @@
                 <w:sz w:val="20"/>
                 <w:szCs w:val="20"/>
               </w:rPr>
-              <w:t>fuer</w:t>
+              <w:t>für</w:t>
             </w:r>
             <w:proofErr w:type="spellEnd"/>
             <w:r>
@@ -28602,7 +28615,7 @@
                 <w:sz w:val="20"/>
                 <w:szCs w:val="20"/>
               </w:rPr>
-              <w:t>fuer</w:t>
+              <w:t>für</w:t>
             </w:r>
             <w:proofErr w:type="spellEnd"/>
             <w:r>
@@ -28693,7 +28706,7 @@
                 <w:sz w:val="20"/>
                 <w:szCs w:val="20"/>
               </w:rPr>
-              <w:t>ausgefuehrt</w:t>
+              <w:t>ausgeführt</w:t>
             </w:r>
             <w:proofErr w:type="spellEnd"/>
             <w:r>
@@ -28784,7 +28797,7 @@
                 <w:sz w:val="20"/>
                 <w:szCs w:val="20"/>
               </w:rPr>
-              <w:t>uebersetzt</w:t>
+              <w:t>übersetzt</w:t>
             </w:r>
             <w:proofErr w:type="spellEnd"/>
             <w:r>
@@ -28884,7 +28897,7 @@
                 <w:sz w:val="20"/>
                 <w:szCs w:val="20"/>
               </w:rPr>
-              <w:t>abhaengig</w:t>
+              <w:t>abhängig</w:t>
             </w:r>
             <w:proofErr w:type="spellEnd"/>
             <w:r>
@@ -28900,7 +28913,7 @@
                 <w:sz w:val="20"/>
                 <w:szCs w:val="20"/>
               </w:rPr>
-              <w:t>ausgefuehrt</w:t>
+              <w:t>ausgeführt</w:t>
             </w:r>
             <w:proofErr w:type="spellEnd"/>
             <w:r>
@@ -29110,7 +29123,7 @@
                 <w:sz w:val="20"/>
                 <w:szCs w:val="20"/>
               </w:rPr>
-              <w:t>Abhaengigkeiten</w:t>
+              <w:t>Abhängigkeiten</w:t>
             </w:r>
             <w:proofErr w:type="spellEnd"/>
           </w:p>
@@ -29143,7 +29156,7 @@
                 <w:sz w:val="20"/>
                 <w:szCs w:val="20"/>
               </w:rPr>
-              <w:t>Benoetigte</w:t>
+              <w:t>Benötigte</w:t>
             </w:r>
             <w:proofErr w:type="spellEnd"/>
             <w:r>
@@ -29234,7 +29247,7 @@
                 <w:sz w:val="20"/>
                 <w:szCs w:val="20"/>
               </w:rPr>
-              <w:t>Abhaengigkeiten</w:t>
+              <w:t>Abhängigkeiten</w:t>
             </w:r>
             <w:proofErr w:type="spellEnd"/>
             <w:r>
@@ -29418,7 +29431,7 @@
                 <w:sz w:val="20"/>
                 <w:szCs w:val="20"/>
               </w:rPr>
-              <w:t>fuer</w:t>
+              <w:t>für</w:t>
             </w:r>
             <w:proofErr w:type="spellEnd"/>
             <w:r>
@@ -29504,7 +29517,7 @@
                 <w:sz w:val="20"/>
                 <w:szCs w:val="20"/>
               </w:rPr>
-              <w:t>Aelteres</w:t>
+              <w:t>Älteres</w:t>
             </w:r>
             <w:proofErr w:type="spellEnd"/>
             <w:r>
@@ -29565,7 +29578,7 @@
             </w:r>
             <w:proofErr w:type="spellStart"/>
             <w:r>
-              <w:t>vertrauenswuerdigen</w:t>
+              <w:t>vertrauenswürdigen</w:t>
             </w:r>
             <w:proofErr w:type="spellEnd"/>
             <w:r>
@@ -29581,7 +29594,7 @@
             </w:r>
             <w:proofErr w:type="spellStart"/>
             <w:r>
-              <w:t>Abhaengigkeitsauflosung</w:t>
+              <w:t>Abhängigkeitsauflösung</w:t>
             </w:r>
             <w:proofErr w:type="spellEnd"/>
             <w:r>
@@ -29602,7 +29615,7 @@
       </w:pPr>
       <w:proofErr w:type="spellStart"/>
       <w:r>
-        <w:t>Uebungsfragen</w:t>
+        <w:t>Übungsfragen</w:t>
       </w:r>
       <w:proofErr w:type="spellEnd"/>
     </w:p>
@@ -29692,7 +29705,7 @@
       </w:r>
       <w:proofErr w:type="spellStart"/>
       <w:r>
-        <w:t>prueft</w:t>
+        <w:t>prüft</w:t>
       </w:r>
       <w:proofErr w:type="spellEnd"/>
       <w:r>
@@ -29700,7 +29713,7 @@
       </w:r>
       <w:proofErr w:type="spellStart"/>
       <w:r>
-        <w:t>vertrauenswuerdigen</w:t>
+        <w:t>vertrauenswürdigen</w:t>
       </w:r>
       <w:proofErr w:type="spellEnd"/>
       <w:r>
@@ -29708,7 +29721,7 @@
       </w:r>
       <w:proofErr w:type="spellStart"/>
       <w:r>
-        <w:t>Schluesseln</w:t>
+        <w:t>Schlüsseln</w:t>
       </w:r>
       <w:proofErr w:type="spellEnd"/>
       <w:r>
@@ -29724,7 +29737,7 @@
       </w:r>
       <w:proofErr w:type="spellStart"/>
       <w:r>
-        <w:t>gueltige</w:t>
+        <w:t>gültige</w:t>
       </w:r>
       <w:proofErr w:type="spellEnd"/>
       <w:r>
@@ -29768,7 +29781,7 @@
       </w:r>
       <w:proofErr w:type="spellStart"/>
       <w:r>
-        <w:t>Abhaengigkeiten</w:t>
+        <w:t>Abhängigkeiten</w:t>
       </w:r>
       <w:proofErr w:type="spellEnd"/>
       <w:r>
@@ -29776,7 +29789,7 @@
       </w:r>
       <w:proofErr w:type="spellStart"/>
       <w:r>
-        <w:t>benoetigte</w:t>
+        <w:t>benötigte</w:t>
       </w:r>
       <w:proofErr w:type="spellEnd"/>
       <w:r>
@@ -29828,7 +29841,7 @@
       </w:r>
       <w:proofErr w:type="spellStart"/>
       <w:r>
-        <w:t>erhaelt</w:t>
+        <w:t>erhält</w:t>
       </w:r>
       <w:proofErr w:type="spellEnd"/>
       <w:r>
@@ -29844,7 +29857,7 @@
       </w:r>
       <w:proofErr w:type="spellStart"/>
       <w:r>
-        <w:t>hoehere</w:t>
+        <w:t>höhere</w:t>
       </w:r>
       <w:proofErr w:type="spellEnd"/>
       <w:r>
@@ -29933,7 +29946,7 @@
       </w:r>
       <w:proofErr w:type="spellStart"/>
       <w:r>
-        <w:t>aeltere</w:t>
+        <w:t>ältere</w:t>
       </w:r>
       <w:proofErr w:type="spellEnd"/>
       <w:r>
@@ -30656,7 +30669,7 @@
                 <w:sz w:val="20"/>
                 <w:szCs w:val="20"/>
               </w:rPr>
-              <w:t>regelmaessig</w:t>
+              <w:t>regelmäßig</w:t>
             </w:r>
             <w:proofErr w:type="spellEnd"/>
             <w:r>
@@ -30704,7 +30717,7 @@
                 <w:sz w:val="20"/>
                 <w:szCs w:val="20"/>
               </w:rPr>
-              <w:t>selbststaendig</w:t>
+              <w:t>selbstständig</w:t>
             </w:r>
             <w:proofErr w:type="spellEnd"/>
             <w:r>
@@ -30760,7 +30773,7 @@
                 <w:sz w:val="20"/>
                 <w:szCs w:val="20"/>
               </w:rPr>
-              <w:t>koennen</w:t>
+              <w:t>können</w:t>
             </w:r>
             <w:proofErr w:type="spellEnd"/>
             <w:r>
@@ -30896,7 +30909,7 @@
                 <w:sz w:val="20"/>
                 <w:szCs w:val="20"/>
               </w:rPr>
-              <w:t>zuverlaessige</w:t>
+              <w:t>zuverlässige</w:t>
             </w:r>
             <w:proofErr w:type="spellEnd"/>
             <w:r>
@@ -30910,6 +30923,7 @@
         </w:tc>
       </w:tr>
     </w:tbl>
+    <w:p/>
     <w:p>
       <w:pPr>
         <w:pStyle w:val="berschrift3"/>
@@ -30980,7 +30994,7 @@
       </w:r>
       <w:proofErr w:type="spellStart"/>
       <w:r>
-        <w:t>Aenderung</w:t>
+        <w:t>Änderung</w:t>
       </w:r>
       <w:proofErr w:type="spellEnd"/>
       <w:r>
@@ -30988,7 +31002,7 @@
       </w:r>
       <w:proofErr w:type="spellStart"/>
       <w:r>
-        <w:t>durchfuehren</w:t>
+        <w:t>durchführen</w:t>
       </w:r>
       <w:proofErr w:type="spellEnd"/>
       <w:r>
@@ -30996,7 +31010,7 @@
       </w:r>
       <w:proofErr w:type="spellStart"/>
       <w:r>
-        <w:t>pruefen</w:t>
+        <w:t>prüfen</w:t>
       </w:r>
       <w:proofErr w:type="spellEnd"/>
       <w:r>
@@ -31020,7 +31034,7 @@
       </w:r>
       <w:proofErr w:type="spellStart"/>
       <w:r>
-        <w:t>Loesung</w:t>
+        <w:t>Lösung</w:t>
       </w:r>
       <w:proofErr w:type="spellEnd"/>
       <w:r>
@@ -31201,7 +31215,7 @@
                 <w:sz w:val="20"/>
                 <w:szCs w:val="20"/>
               </w:rPr>
-              <w:t>geloeschte</w:t>
+              <w:t>gelöschte</w:t>
             </w:r>
             <w:proofErr w:type="spellEnd"/>
             <w:r>
@@ -31287,7 +31301,7 @@
                 <w:sz w:val="20"/>
                 <w:szCs w:val="20"/>
               </w:rPr>
-              <w:t>stuerzt</w:t>
+              <w:t>stürzt</w:t>
             </w:r>
             <w:proofErr w:type="spellEnd"/>
             <w:r>
@@ -31468,7 +31482,7 @@
       </w:pPr>
       <w:proofErr w:type="spellStart"/>
       <w:r>
-        <w:t>Uebungsfragen</w:t>
+        <w:t>Übungsfragen</w:t>
       </w:r>
       <w:proofErr w:type="spellEnd"/>
     </w:p>
@@ -31502,7 +31516,7 @@
           <w:b/>
           <w:bCs/>
         </w:rPr>
-        <w:t>Daemons</w:t>
+        <w:t>Dämons</w:t>
       </w:r>
       <w:proofErr w:type="spellEnd"/>
       <w:r>
@@ -31530,7 +31544,7 @@
       </w:r>
       <w:proofErr w:type="spellStart"/>
       <w:r>
-        <w:t>Daemons</w:t>
+        <w:t>Dämons</w:t>
       </w:r>
       <w:proofErr w:type="spellEnd"/>
       <w:r>
@@ -31538,7 +31552,7 @@
       </w:r>
       <w:proofErr w:type="spellStart"/>
       <w:r>
-        <w:t>ueber</w:t>
+        <w:t>über</w:t>
       </w:r>
       <w:proofErr w:type="spellEnd"/>
       <w:r>
@@ -31630,7 +31644,7 @@
       </w:r>
       <w:proofErr w:type="spellStart"/>
       <w:r>
-        <w:t>faellt</w:t>
+        <w:t>fällt</w:t>
       </w:r>
       <w:proofErr w:type="spellEnd"/>
       <w:r>
@@ -31662,7 +31676,7 @@
           <w:b/>
           <w:bCs/>
         </w:rPr>
-        <w:t>fuer</w:t>
+        <w:t>für</w:t>
       </w:r>
       <w:proofErr w:type="spellEnd"/>
       <w:r>
@@ -31706,7 +31720,7 @@
       </w:r>
       <w:proofErr w:type="spellStart"/>
       <w:r>
-        <w:t>Komplexitaet</w:t>
+        <w:t>Komplexität</w:t>
       </w:r>
       <w:proofErr w:type="spellEnd"/>
       <w:r>
@@ -31714,7 +31728,7 @@
       </w:r>
       <w:proofErr w:type="spellStart"/>
       <w:r>
-        <w:t>fuer</w:t>
+        <w:t>für</w:t>
       </w:r>
       <w:proofErr w:type="spellEnd"/>
       <w:r>
@@ -31733,8 +31747,7 @@
       <w:bookmarkStart w:id="23" w:name="_Toc232080270"/>
       <w:proofErr w:type="spellStart"/>
       <w:r>
-        <w:lastRenderedPageBreak/>
-        <w:t>Muendliche</w:t>
+        <w:t>Mündliche</w:t>
       </w:r>
       <w:proofErr w:type="spellEnd"/>
       <w:r>
@@ -31742,7 +31755,7 @@
       </w:r>
       <w:proofErr w:type="spellStart"/>
       <w:r>
-        <w:t>Pruefungsfragen</w:t>
+        <w:t>Prüfungsfragen</w:t>
       </w:r>
       <w:proofErr w:type="spellEnd"/>
       <w:r>
@@ -31797,7 +31810,7 @@
       </w:r>
       <w:proofErr w:type="spellStart"/>
       <w:r>
-        <w:t>schuetzt</w:t>
+        <w:t>schützt</w:t>
       </w:r>
       <w:proofErr w:type="spellEnd"/>
       <w:r>
@@ -31805,7 +31818,7 @@
       </w:r>
       <w:proofErr w:type="spellStart"/>
       <w:r>
-        <w:t>ueber</w:t>
+        <w:t>über</w:t>
       </w:r>
       <w:proofErr w:type="spellEnd"/>
       <w:r>
@@ -31885,7 +31898,7 @@
       </w:r>
       <w:proofErr w:type="spellStart"/>
       <w:r>
-        <w:t>naechsten</w:t>
+        <w:t>nächsten</w:t>
       </w:r>
       <w:proofErr w:type="spellEnd"/>
       <w:r>
@@ -31929,7 +31942,7 @@
       </w:r>
       <w:proofErr w:type="spellStart"/>
       <w:r>
-        <w:t>ueber</w:t>
+        <w:t>über</w:t>
       </w:r>
       <w:proofErr w:type="spellEnd"/>
       <w:r>
@@ -32009,7 +32022,7 @@
       </w:r>
       <w:proofErr w:type="spellStart"/>
       <w:r>
-        <w:t>Geraet</w:t>
+        <w:t>Gerät</w:t>
       </w:r>
       <w:proofErr w:type="spellEnd"/>
       <w:r>
@@ -32017,7 +32030,7 @@
       </w:r>
       <w:proofErr w:type="spellStart"/>
       <w:r>
-        <w:t>selbststaendig</w:t>
+        <w:t>selbstständig</w:t>
       </w:r>
       <w:proofErr w:type="spellEnd"/>
       <w:r>
@@ -32025,7 +32038,7 @@
       </w:r>
       <w:proofErr w:type="spellStart"/>
       <w:r>
-        <w:t>loest</w:t>
+        <w:t>löst</w:t>
       </w:r>
       <w:proofErr w:type="spellEnd"/>
       <w:r>
@@ -32129,7 +32142,7 @@
       </w:r>
       <w:proofErr w:type="spellStart"/>
       <w:r>
-        <w:t>erhoeht</w:t>
+        <w:t>erhöht</w:t>
       </w:r>
       <w:proofErr w:type="spellEnd"/>
       <w:r>
@@ -32137,7 +32150,7 @@
       </w:r>
       <w:proofErr w:type="spellStart"/>
       <w:r>
-        <w:t>Verfuegbarkeit</w:t>
+        <w:t>Verfügbarkeit</w:t>
       </w:r>
       <w:proofErr w:type="spellEnd"/>
       <w:r>
@@ -32145,11 +32158,11 @@
       </w:r>
       <w:proofErr w:type="spellStart"/>
       <w:r>
-        <w:t>schuetzt</w:t>
+        <w:t>schützt</w:t>
       </w:r>
       <w:proofErr w:type="spellEnd"/>
       <w:r>
-        <w:t xml:space="preserve"> aber nicht vor Loeschen, Malware, Fehlbedienung oder Standortverlust.</w:t>
+        <w:t xml:space="preserve"> aber nicht vor Löschen, Malware, Fehlbedienung oder Standortverlust.</w:t>
       </w:r>
     </w:p>
     <w:p>
@@ -32305,7 +32318,7 @@
       </w:r>
       <w:proofErr w:type="spellStart"/>
       <w:r>
-        <w:t>Praefixen</w:t>
+        <w:t>Präfixen</w:t>
       </w:r>
       <w:proofErr w:type="spellEnd"/>
       <w:r>
@@ -32349,7 +32362,7 @@
       </w:r>
       <w:proofErr w:type="spellStart"/>
       <w:r>
-        <w:t>uebersetzt</w:t>
+        <w:t>übersetzt</w:t>
       </w:r>
       <w:proofErr w:type="spellEnd"/>
       <w:r>
@@ -32357,7 +32370,7 @@
       </w:r>
       <w:proofErr w:type="spellStart"/>
       <w:r>
-        <w:t>oeffentliche</w:t>
+        <w:t>öffentliche</w:t>
       </w:r>
       <w:proofErr w:type="spellEnd"/>
       <w:r>
@@ -32401,7 +32414,7 @@
       </w:r>
       <w:proofErr w:type="spellStart"/>
       <w:r>
-        <w:t>zuverlaessig</w:t>
+        <w:t>zuverlässig</w:t>
       </w:r>
       <w:proofErr w:type="spellEnd"/>
       <w:r>
@@ -32482,7 +32495,7 @@
       </w:r>
       <w:proofErr w:type="spellStart"/>
       <w:r>
-        <w:t>loest</w:t>
+        <w:t>löst</w:t>
       </w:r>
       <w:proofErr w:type="spellEnd"/>
       <w:r>
@@ -32490,7 +32503,7 @@
       </w:r>
       <w:proofErr w:type="spellStart"/>
       <w:r>
-        <w:t>Ressourceneintraege</w:t>
+        <w:t>Ressourceneinträge</w:t>
       </w:r>
       <w:proofErr w:type="spellEnd"/>
       <w:r>
@@ -32534,7 +32547,7 @@
       </w:r>
       <w:proofErr w:type="spellStart"/>
       <w:r>
-        <w:t>Binaerdatenbank</w:t>
+        <w:t>Binärdatenbank</w:t>
       </w:r>
       <w:proofErr w:type="spellEnd"/>
       <w:r>
@@ -32902,7 +32915,7 @@
                 <w:sz w:val="20"/>
                 <w:szCs w:val="20"/>
               </w:rPr>
-              <w:t>Ausfuehrungspfad</w:t>
+              <w:t>Ausführungspfad</w:t>
             </w:r>
             <w:proofErr w:type="spellEnd"/>
             <w:r>
@@ -33210,7 +33223,7 @@
                 <w:sz w:val="20"/>
                 <w:szCs w:val="20"/>
               </w:rPr>
-              <w:t>moeglich</w:t>
+              <w:t>möglich</w:t>
             </w:r>
             <w:proofErr w:type="spellEnd"/>
             <w:r>
@@ -33366,7 +33379,7 @@
                 <w:sz w:val="20"/>
                 <w:szCs w:val="20"/>
               </w:rPr>
-              <w:t>prueft</w:t>
+              <w:t>prüft</w:t>
             </w:r>
             <w:proofErr w:type="spellEnd"/>
             <w:r>
@@ -33382,7 +33395,7 @@
                 <w:sz w:val="20"/>
                 <w:szCs w:val="20"/>
               </w:rPr>
-              <w:t>Zustaenden</w:t>
+              <w:t>Zuständen</w:t>
             </w:r>
             <w:proofErr w:type="spellEnd"/>
             <w:r>
@@ -33468,7 +33481,7 @@
                 <w:sz w:val="20"/>
                 <w:szCs w:val="20"/>
               </w:rPr>
-              <w:t>Bituebertragung</w:t>
+              <w:t>Bitübertragung</w:t>
             </w:r>
             <w:proofErr w:type="spellEnd"/>
             <w:r>
@@ -33687,7 +33700,7 @@
                 <w:sz w:val="20"/>
                 <w:szCs w:val="20"/>
               </w:rPr>
-              <w:t>Praefix</w:t>
+              <w:t>Präfix</w:t>
             </w:r>
             <w:proofErr w:type="spellEnd"/>
             <w:r>
@@ -33798,7 +33811,7 @@
                 <w:sz w:val="20"/>
                 <w:szCs w:val="20"/>
               </w:rPr>
-              <w:t>Uebersetzt</w:t>
+              <w:t>Übersetzt</w:t>
             </w:r>
             <w:proofErr w:type="spellEnd"/>
             <w:r>
@@ -33877,7 +33890,7 @@
                 <w:sz w:val="20"/>
                 <w:szCs w:val="20"/>
               </w:rPr>
-              <w:t>Zuverlaessigkeit</w:t>
+              <w:t>Zuverlässigkeit</w:t>
             </w:r>
             <w:proofErr w:type="spellEnd"/>
             <w:r>
@@ -34033,7 +34046,7 @@
                 <w:sz w:val="20"/>
                 <w:szCs w:val="20"/>
               </w:rPr>
-              <w:t>Abhaengigkeiten</w:t>
+              <w:t>Abhängigkeiten</w:t>
             </w:r>
             <w:proofErr w:type="spellEnd"/>
             <w:r>
@@ -34047,6 +34060,7 @@
         </w:tc>
       </w:tr>
     </w:tbl>
+    <w:p/>
     <w:p>
       <w:pPr>
         <w:pStyle w:val="berschrift1"/>
@@ -34054,7 +34068,7 @@
       <w:bookmarkStart w:id="25" w:name="_Toc232080272"/>
       <w:proofErr w:type="spellStart"/>
       <w:r>
-        <w:t>Abkuerzungsverzeichnis</w:t>
+        <w:t>Abkürzungsverzeichnis</w:t>
       </w:r>
       <w:bookmarkEnd w:id="25"/>
       <w:proofErr w:type="spellEnd"/>
@@ -34122,7 +34136,7 @@
                 <w:sz w:val="20"/>
                 <w:szCs w:val="20"/>
               </w:rPr>
-              <w:t>Abkuerzung</w:t>
+              <w:t>Abkürzung</w:t>
             </w:r>
             <w:proofErr w:type="spellEnd"/>
           </w:p>
@@ -34488,7 +34502,7 @@
                 <w:sz w:val="20"/>
                 <w:szCs w:val="20"/>
               </w:rPr>
-              <w:t>uebersetzt</w:t>
+              <w:t>übersetzt</w:t>
             </w:r>
             <w:proofErr w:type="spellEnd"/>
             <w:r>
@@ -34583,7 +34597,7 @@
                 <w:sz w:val="20"/>
                 <w:szCs w:val="20"/>
               </w:rPr>
-              <w:t>Geraet</w:t>
+              <w:t>Gerät</w:t>
             </w:r>
             <w:proofErr w:type="spellEnd"/>
             <w:r>
@@ -34685,7 +34699,7 @@
                 <w:sz w:val="20"/>
                 <w:szCs w:val="20"/>
               </w:rPr>
-              <w:t>Datenttraeger</w:t>
+              <w:t>Datenträger</w:t>
             </w:r>
             <w:proofErr w:type="spellEnd"/>
             <w:r>
@@ -35006,7 +35020,7 @@
                 <w:sz w:val="20"/>
                 <w:szCs w:val="20"/>
               </w:rPr>
-              <w:t>Paketgroesse</w:t>
+              <w:t>Paketgröße</w:t>
             </w:r>
             <w:proofErr w:type="spellEnd"/>
             <w:r>
@@ -35102,7 +35116,7 @@
                 <w:sz w:val="20"/>
                 <w:szCs w:val="20"/>
               </w:rPr>
-              <w:t>Praefixschreibweise</w:t>
+              <w:t>Präfixschreibweise</w:t>
             </w:r>
             <w:proofErr w:type="spellEnd"/>
             <w:r>
@@ -35118,7 +35132,7 @@
                 <w:sz w:val="20"/>
                 <w:szCs w:val="20"/>
               </w:rPr>
-              <w:t>fuer</w:t>
+              <w:t>für</w:t>
             </w:r>
             <w:proofErr w:type="spellEnd"/>
             <w:r>
@@ -35220,7 +35234,7 @@
                 <w:sz w:val="20"/>
                 <w:szCs w:val="20"/>
               </w:rPr>
-              <w:t>Portuebersetzung</w:t>
+              <w:t>Portübersetzung</w:t>
             </w:r>
             <w:proofErr w:type="spellEnd"/>
             <w:r>

</xml_diff>

<commit_message>
Visuelle Überarbeitung aller Lernscripte
- Diagramme eingefügt: OSI-Modell, Prozesszustände, UML-Klassendiagramm,
  ER-Diagramm, SQL-Joins, B-Baum, Von-Neumann, Pipeline, Logikgatter,
  Transistoren, OPV-Schaltungen, Diodenkennlinie u.v.m.
- Betriebssysteme & OOP: Titelbild-Fehler behoben (Bild lag auf Titelseite
  statt im richtigen Abschnitt)
- Systemanalyse: abgeschnittene Screenshots durch saubere Diagramme ersetzt
  (Wasserfallmodell, Spiralmodell, V-Modell XT, Burndown-Chart u.a.)
- ER-Diagramm in Datenbanken neu gestaltet (Chen-Notation mit Legende)
- Zeilenumbrüche zwischen allen Tabellen ergänzt

Co-Authored-By: Claude Sonnet 4.6 <noreply@anthropic.com>
</commit_message>
<xml_diff>
--- a/Betriebssysteme-Rechnernetze.docx
+++ b/Betriebssysteme-Rechnernetze.docx
@@ -3017,12 +3017,7 @@
         </w:tc>
       </w:tr>
     </w:tbl>
-    <w:p>
-      <w:pPr>
-        <w:pStyle w:val="berschrift1"/>
-      </w:pPr>
-      <w:bookmarkStart w:id="2" w:name="_Toc232080249"/>
-    </w:p>
+    <w:p/>
     <w:p>
       <w:pPr>
         <w:pStyle w:val="berschrift1"/>
@@ -4501,11 +4496,7 @@
         </w:tc>
       </w:tr>
     </w:tbl>
-    <w:p>
-      <w:pPr>
-        <w:pStyle w:val="berschrift3"/>
-      </w:pPr>
-    </w:p>
+    <w:p/>
     <w:p>
       <w:pPr>
         <w:pStyle w:val="berschrift3"/>
@@ -5144,6 +5135,57 @@
     </w:p>
     <w:p>
       <w:pPr>
+        <w:jc w:val="center"/>
+      </w:pPr>
+      <w:r>
+        <w:drawing>
+          <wp:inline xmlns:a="http://schemas.openxmlformats.org/drawingml/2006/main" xmlns:pic="http://schemas.openxmlformats.org/drawingml/2006/picture">
+            <wp:extent cx="5486400" cy="3244893"/>
+            <wp:docPr id="2" name="Picture 2"/>
+            <wp:cNvGraphicFramePr>
+              <a:graphicFrameLocks noChangeAspect="1"/>
+            </wp:cNvGraphicFramePr>
+            <a:graphic>
+              <a:graphicData uri="http://schemas.openxmlformats.org/drawingml/2006/picture">
+                <pic:pic>
+                  <pic:nvPicPr>
+                    <pic:cNvPr id="0" name="prozesszustaende.png"/>
+                    <pic:cNvPicPr/>
+                  </pic:nvPicPr>
+                  <pic:blipFill>
+                    <a:blip r:embed="rId11"/>
+                    <a:stretch>
+                      <a:fillRect/>
+                    </a:stretch>
+                  </pic:blipFill>
+                  <pic:spPr>
+                    <a:xfrm>
+                      <a:off x="0" y="0"/>
+                      <a:ext cx="5486400" cy="3244893"/>
+                    </a:xfrm>
+                    <a:prstGeom prst="rect"/>
+                  </pic:spPr>
+                </pic:pic>
+              </a:graphicData>
+            </a:graphic>
+          </wp:inline>
+        </w:drawing>
+      </w:r>
+    </w:p>
+    <w:p>
+      <w:pPr>
+        <w:jc w:val="center"/>
+      </w:pPr>
+      <w:r>
+        <w:rPr>
+          <w:i/>
+          <w:sz w:val="16"/>
+        </w:rPr>
+        <w:t>Abb.: Prozesszustände</w:t>
+      </w:r>
+    </w:p>
+    <w:p>
+      <w:pPr>
         <w:pStyle w:val="berschrift2"/>
       </w:pPr>
     </w:p>
@@ -5500,11 +5542,7 @@
         </w:tc>
       </w:tr>
     </w:tbl>
-    <w:p>
-      <w:pPr>
-        <w:pStyle w:val="berschrift3"/>
-      </w:pPr>
-    </w:p>
+    <w:p/>
     <w:p>
       <w:pPr>
         <w:pStyle w:val="berschrift3"/>
@@ -6152,6 +6190,7 @@
         </w:tc>
       </w:tr>
     </w:tbl>
+    <w:p/>
     <w:p>
       <w:pPr>
         <w:pStyle w:val="berschrift3"/>
@@ -9580,6 +9619,7 @@
         </w:tc>
       </w:tr>
     </w:tbl>
+    <w:p/>
     <w:p>
       <w:pPr>
         <w:pStyle w:val="berschrift3"/>
@@ -11115,6 +11155,7 @@
         </w:tc>
       </w:tr>
     </w:tbl>
+    <w:p/>
     <w:p>
       <w:pPr>
         <w:pStyle w:val="berschrift2"/>
@@ -12717,6 +12758,7 @@
         </w:tc>
       </w:tr>
     </w:tbl>
+    <w:p/>
     <w:p>
       <w:pPr>
         <w:pStyle w:val="berschrift3"/>
@@ -14452,6 +14494,7 @@
         </w:tc>
       </w:tr>
     </w:tbl>
+    <w:p/>
     <w:p>
       <w:pPr>
         <w:pStyle w:val="berschrift3"/>
@@ -15948,6 +15991,7 @@
         </w:tc>
       </w:tr>
     </w:tbl>
+    <w:p/>
     <w:p>
       <w:pPr>
         <w:pStyle w:val="berschrift3"/>
@@ -19965,6 +20009,58 @@
         </w:tc>
       </w:tr>
     </w:tbl>
+    <w:p/>
+    <w:p>
+      <w:pPr>
+        <w:jc w:val="center"/>
+      </w:pPr>
+      <w:r>
+        <w:drawing>
+          <wp:inline xmlns:a="http://schemas.openxmlformats.org/drawingml/2006/main" xmlns:pic="http://schemas.openxmlformats.org/drawingml/2006/picture">
+            <wp:extent cx="4114800" cy="3441203"/>
+            <wp:docPr id="1" name="Picture 1"/>
+            <wp:cNvGraphicFramePr>
+              <a:graphicFrameLocks noChangeAspect="1"/>
+            </wp:cNvGraphicFramePr>
+            <a:graphic>
+              <a:graphicData uri="http://schemas.openxmlformats.org/drawingml/2006/picture">
+                <pic:pic>
+                  <pic:nvPicPr>
+                    <pic:cNvPr id="0" name="osi_modell.png"/>
+                    <pic:cNvPicPr/>
+                  </pic:nvPicPr>
+                  <pic:blipFill>
+                    <a:blip r:embed="rId10"/>
+                    <a:stretch>
+                      <a:fillRect/>
+                    </a:stretch>
+                  </pic:blipFill>
+                  <pic:spPr>
+                    <a:xfrm>
+                      <a:off x="0" y="0"/>
+                      <a:ext cx="4114800" cy="3441203"/>
+                    </a:xfrm>
+                    <a:prstGeom prst="rect"/>
+                  </pic:spPr>
+                </pic:pic>
+              </a:graphicData>
+            </a:graphic>
+          </wp:inline>
+        </w:drawing>
+      </w:r>
+    </w:p>
+    <w:p>
+      <w:pPr>
+        <w:jc w:val="center"/>
+      </w:pPr>
+      <w:r>
+        <w:rPr>
+          <w:i/>
+          <w:sz w:val="16"/>
+        </w:rPr>
+        <w:t>Abb.: OSI-Referenzmodell</w:t>
+      </w:r>
+    </w:p>
     <w:p>
       <w:pPr>
         <w:pStyle w:val="berschrift2"/>
@@ -21261,6 +21357,7 @@
         </w:tc>
       </w:tr>
     </w:tbl>
+    <w:p/>
     <w:p>
       <w:pPr>
         <w:pStyle w:val="berschrift2"/>
@@ -27825,6 +27922,7 @@
         </w:tc>
       </w:tr>
     </w:tbl>
+    <w:p/>
     <w:p>
       <w:pPr>
         <w:pStyle w:val="berschrift1"/>
@@ -29604,6 +29702,7 @@
         </w:tc>
       </w:tr>
     </w:tbl>
+    <w:p/>
     <w:p>
       <w:pPr>
         <w:pStyle w:val="berschrift3"/>
@@ -31471,6 +31570,7 @@
         </w:tc>
       </w:tr>
     </w:tbl>
+    <w:p/>
     <w:p>
       <w:pPr>
         <w:pStyle w:val="berschrift3"/>

</xml_diff>

<commit_message>
Betriebssysteme: Zeilenumbrüche vor allen Tabellen ergänzt
31 fehlende Leerzeilen vor Tabellen eingefügt, sodass jede Tabelle
oben und unten durch einen leeren Absatz vom umliegenden Text getrennt ist.

Co-Authored-By: Claude Sonnet 4.6 <noreply@anthropic.com>
</commit_message>
<xml_diff>
--- a/Betriebssysteme-Rechnernetze.docx
+++ b/Betriebssysteme-Rechnernetze.docx
@@ -1722,6 +1722,7 @@
         <w:t xml:space="preserve"> jeden Begriff in drei Stufen:</w:t>
       </w:r>
     </w:p>
+    <w:p/>
     <w:tbl>
       <w:tblPr>
         <w:tblW w:w="9638" w:type="dxa"/>
@@ -2383,6 +2384,7 @@
       </w:r>
       <w:bookmarkEnd w:id="1"/>
     </w:p>
+    <w:p/>
     <w:tbl>
       <w:tblPr>
         <w:tblW w:w="9638" w:type="dxa"/>
@@ -3045,6 +3047,7 @@
         <w:t>Ein Betriebssystem ist die zentrale Softwareschicht zwischen Hardware und Anwendungsprogrammen. Es versteckt Hardwaredetails, stellt einheitliche Schnittstellen bereit und verwaltet begrenzte Ressourcen.</w:t>
       </w:r>
     </w:p>
+    <w:p/>
     <w:tbl>
       <w:tblPr>
         <w:tblW w:w="9638" w:type="dxa"/>
@@ -4534,6 +4537,7 @@
         <w:t xml:space="preserve"> bereit.</w:t>
       </w:r>
     </w:p>
+    <w:p/>
     <w:tbl>
       <w:tblPr>
         <w:tblW w:w="9638" w:type="dxa"/>
@@ -5205,6 +5209,7 @@
         <w:t xml:space="preserve"> befindliches Programm mit eigenem Adressraum, Zustand und Verwaltungsinformationen.</w:t>
       </w:r>
     </w:p>
+    <w:p/>
     <w:tbl>
       <w:tblPr>
         <w:tblW w:w="9638" w:type="dxa"/>
@@ -5627,6 +5632,7 @@
         <w:t xml:space="preserve"> und Rechteinformationen.</w:t>
       </w:r>
     </w:p>
+    <w:p/>
     <w:tbl>
       <w:tblPr>
         <w:tblW w:w="9638" w:type="dxa"/>
@@ -6220,6 +6226,7 @@
         <w:t xml:space="preserve"> innerhalb eines Prozesses. Mehrere Threads eines Prozesses teilen sich denselben Adressraum, besitzen aber jeweils eigenen Stack, Registerzustand und Threadkontrollblock.</w:t>
       </w:r>
     </w:p>
+    <w:p/>
     <w:tbl>
       <w:tblPr>
         <w:tblW w:w="9638" w:type="dxa"/>
@@ -6931,6 +6938,7 @@
         <w:t xml:space="preserve"> und geringe Wartezeiten.</w:t>
       </w:r>
     </w:p>
+    <w:p/>
     <w:tbl>
       <w:tblPr>
         <w:tblW w:w="9638" w:type="dxa"/>
@@ -8470,6 +8478,7 @@
       </w:r>
       <w:bookmarkEnd w:id="6"/>
     </w:p>
+    <w:p/>
     <w:tbl>
       <w:tblPr>
         <w:tblW w:w="9638" w:type="dxa"/>
@@ -9212,6 +9221,7 @@
         <w:t xml:space="preserve"> werden.</w:t>
       </w:r>
     </w:p>
+    <w:p/>
     <w:tbl>
       <w:tblPr>
         <w:tblW w:w="9638" w:type="dxa"/>
@@ -9639,6 +9649,1994 @@
       </w:pPr>
       <w:r>
         <w:t>Ein Deadlock entsteht, wenn Prozesse dauerhaft auf Ressourcen warten, die jeweils von anderen wartenden Prozessen gehalten werden.</w:t>
+      </w:r>
+    </w:p>
+    <w:p/>
+    <w:tbl>
+      <w:tblPr>
+        <w:tblW w:w="9638" w:type="dxa"/>
+        <w:tblBorders>
+          <w:top w:val="single" w:sz="4" w:space="0" w:color="auto"/>
+          <w:left w:val="single" w:sz="4" w:space="0" w:color="auto"/>
+          <w:bottom w:val="single" w:sz="4" w:space="0" w:color="auto"/>
+          <w:right w:val="single" w:sz="4" w:space="0" w:color="auto"/>
+          <w:insideH w:val="single" w:sz="4" w:space="0" w:color="auto"/>
+          <w:insideV w:val="single" w:sz="4" w:space="0" w:color="auto"/>
+        </w:tblBorders>
+        <w:tblLayout w:type="fixed"/>
+        <w:tblCellMar>
+          <w:left w:w="10" w:type="dxa"/>
+          <w:right w:w="10" w:type="dxa"/>
+        </w:tblCellMar>
+        <w:tblLook w:val="0000" w:firstRow="0" w:lastRow="0" w:firstColumn="0" w:lastColumn="0" w:noHBand="0" w:noVBand="0"/>
+      </w:tblPr>
+      <w:tblGrid>
+        <w:gridCol w:w="26"/>
+        <w:gridCol w:w="2766"/>
+        <w:gridCol w:w="6819"/>
+        <w:gridCol w:w="27"/>
+      </w:tblGrid>
+      <w:tr>
+        <w:tblPrEx>
+          <w:tblCellMar>
+            <w:top w:w="0" w:type="dxa"/>
+            <w:bottom w:w="0" w:type="dxa"/>
+          </w:tblCellMar>
+        </w:tblPrEx>
+        <w:trPr>
+          <w:gridAfter w:val="1"/>
+          <w:wAfter w:w="27" w:type="dxa"/>
+          <w:tblHeader/>
+        </w:trPr>
+        <w:tc>
+          <w:tcPr>
+            <w:tcW w:w="2800" w:type="dxa"/>
+            <w:gridSpan w:val="2"/>
+            <w:tcBorders>
+              <w:top w:val="single" w:sz="2" w:space="0" w:color="C7D2DD"/>
+              <w:left w:val="single" w:sz="2" w:space="0" w:color="C7D2DD"/>
+              <w:bottom w:val="single" w:sz="2" w:space="0" w:color="C7D2DD"/>
+              <w:right w:val="single" w:sz="2" w:space="0" w:color="C7D2DD"/>
+            </w:tcBorders>
+            <w:shd w:val="clear" w:color="auto" w:fill="2E75B6"/>
+            <w:tcMar>
+              <w:top w:w="60" w:type="dxa"/>
+              <w:left w:w="110" w:type="dxa"/>
+              <w:bottom w:w="60" w:type="dxa"/>
+              <w:right w:w="110" w:type="dxa"/>
+            </w:tcMar>
+            <w:vAlign w:val="center"/>
+          </w:tcPr>
+          <w:p>
+            <w:pPr>
+              <w:spacing w:line="248" w:lineRule="auto"/>
+            </w:pPr>
+            <w:r>
+              <w:rPr>
+                <w:b/>
+                <w:bCs/>
+                <w:color w:val="FFFFFF"/>
+                <w:sz w:val="20"/>
+                <w:szCs w:val="20"/>
+              </w:rPr>
+              <w:t>Deadlock-Bedingung</w:t>
+            </w:r>
+          </w:p>
+        </w:tc>
+        <w:tc>
+          <w:tcPr>
+            <w:tcW w:w="6838" w:type="dxa"/>
+            <w:tcBorders>
+              <w:top w:val="single" w:sz="2" w:space="0" w:color="C7D2DD"/>
+              <w:left w:val="single" w:sz="2" w:space="0" w:color="C7D2DD"/>
+              <w:bottom w:val="single" w:sz="2" w:space="0" w:color="C7D2DD"/>
+              <w:right w:val="single" w:sz="2" w:space="0" w:color="C7D2DD"/>
+            </w:tcBorders>
+            <w:shd w:val="clear" w:color="auto" w:fill="2E75B6"/>
+            <w:tcMar>
+              <w:top w:w="60" w:type="dxa"/>
+              <w:left w:w="110" w:type="dxa"/>
+              <w:bottom w:w="60" w:type="dxa"/>
+              <w:right w:w="110" w:type="dxa"/>
+            </w:tcMar>
+            <w:vAlign w:val="center"/>
+          </w:tcPr>
+          <w:p>
+            <w:pPr>
+              <w:spacing w:line="248" w:lineRule="auto"/>
+            </w:pPr>
+            <w:r>
+              <w:rPr>
+                <w:b/>
+                <w:bCs/>
+                <w:color w:val="FFFFFF"/>
+                <w:sz w:val="20"/>
+                <w:szCs w:val="20"/>
+              </w:rPr>
+              <w:t>Bedeutung</w:t>
+            </w:r>
+          </w:p>
+        </w:tc>
+      </w:tr>
+      <w:tr>
+        <w:tblPrEx>
+          <w:tblCellMar>
+            <w:top w:w="0" w:type="dxa"/>
+            <w:bottom w:w="0" w:type="dxa"/>
+          </w:tblCellMar>
+        </w:tblPrEx>
+        <w:trPr>
+          <w:gridAfter w:val="1"/>
+          <w:wAfter w:w="27" w:type="dxa"/>
+        </w:trPr>
+        <w:tc>
+          <w:tcPr>
+            <w:tcW w:w="2800" w:type="dxa"/>
+            <w:gridSpan w:val="2"/>
+            <w:tcBorders>
+              <w:top w:val="single" w:sz="2" w:space="0" w:color="C7D2DD"/>
+              <w:left w:val="single" w:sz="2" w:space="0" w:color="C7D2DD"/>
+              <w:bottom w:val="single" w:sz="2" w:space="0" w:color="C7D2DD"/>
+              <w:right w:val="single" w:sz="2" w:space="0" w:color="C7D2DD"/>
+            </w:tcBorders>
+            <w:shd w:val="clear" w:color="auto" w:fill="FFFFFF"/>
+            <w:tcMar>
+              <w:top w:w="60" w:type="dxa"/>
+              <w:left w:w="110" w:type="dxa"/>
+              <w:bottom w:w="60" w:type="dxa"/>
+              <w:right w:w="110" w:type="dxa"/>
+            </w:tcMar>
+            <w:vAlign w:val="center"/>
+          </w:tcPr>
+          <w:p>
+            <w:pPr>
+              <w:spacing w:line="248" w:lineRule="auto"/>
+            </w:pPr>
+            <w:r>
+              <w:rPr>
+                <w:sz w:val="20"/>
+                <w:szCs w:val="20"/>
+              </w:rPr>
+              <w:t xml:space="preserve">Mutual </w:t>
+            </w:r>
+            <w:proofErr w:type="spellStart"/>
+            <w:r>
+              <w:rPr>
+                <w:sz w:val="20"/>
+                <w:szCs w:val="20"/>
+              </w:rPr>
+              <w:t>Exclusion</w:t>
+            </w:r>
+            <w:proofErr w:type="spellEnd"/>
+          </w:p>
+        </w:tc>
+        <w:tc>
+          <w:tcPr>
+            <w:tcW w:w="6838" w:type="dxa"/>
+            <w:tcBorders>
+              <w:top w:val="single" w:sz="2" w:space="0" w:color="C7D2DD"/>
+              <w:left w:val="single" w:sz="2" w:space="0" w:color="C7D2DD"/>
+              <w:bottom w:val="single" w:sz="2" w:space="0" w:color="C7D2DD"/>
+              <w:right w:val="single" w:sz="2" w:space="0" w:color="C7D2DD"/>
+            </w:tcBorders>
+            <w:shd w:val="clear" w:color="auto" w:fill="FFFFFF"/>
+            <w:tcMar>
+              <w:top w:w="60" w:type="dxa"/>
+              <w:left w:w="110" w:type="dxa"/>
+              <w:bottom w:w="60" w:type="dxa"/>
+              <w:right w:w="110" w:type="dxa"/>
+            </w:tcMar>
+            <w:vAlign w:val="center"/>
+          </w:tcPr>
+          <w:p>
+            <w:pPr>
+              <w:spacing w:line="248" w:lineRule="auto"/>
+            </w:pPr>
+            <w:r>
+              <w:rPr>
+                <w:sz w:val="20"/>
+                <w:szCs w:val="20"/>
+              </w:rPr>
+              <w:t>Eine Ressource kann nicht gleichzeitig von mehreren Prozessen genutzt werden.</w:t>
+            </w:r>
+          </w:p>
+        </w:tc>
+      </w:tr>
+      <w:tr>
+        <w:tblPrEx>
+          <w:tblCellMar>
+            <w:top w:w="0" w:type="dxa"/>
+            <w:bottom w:w="0" w:type="dxa"/>
+          </w:tblCellMar>
+        </w:tblPrEx>
+        <w:trPr>
+          <w:gridAfter w:val="1"/>
+          <w:wAfter w:w="27" w:type="dxa"/>
+        </w:trPr>
+        <w:tc>
+          <w:tcPr>
+            <w:tcW w:w="2800" w:type="dxa"/>
+            <w:gridSpan w:val="2"/>
+            <w:tcBorders>
+              <w:top w:val="single" w:sz="2" w:space="0" w:color="C7D2DD"/>
+              <w:left w:val="single" w:sz="2" w:space="0" w:color="C7D2DD"/>
+              <w:bottom w:val="single" w:sz="2" w:space="0" w:color="C7D2DD"/>
+              <w:right w:val="single" w:sz="2" w:space="0" w:color="C7D2DD"/>
+            </w:tcBorders>
+            <w:shd w:val="clear" w:color="auto" w:fill="EAF1F8"/>
+            <w:tcMar>
+              <w:top w:w="60" w:type="dxa"/>
+              <w:left w:w="110" w:type="dxa"/>
+              <w:bottom w:w="60" w:type="dxa"/>
+              <w:right w:w="110" w:type="dxa"/>
+            </w:tcMar>
+            <w:vAlign w:val="center"/>
+          </w:tcPr>
+          <w:p>
+            <w:pPr>
+              <w:spacing w:line="248" w:lineRule="auto"/>
+            </w:pPr>
+            <w:r>
+              <w:rPr>
+                <w:sz w:val="20"/>
+                <w:szCs w:val="20"/>
+              </w:rPr>
+              <w:t>Hold and Wait</w:t>
+            </w:r>
+          </w:p>
+        </w:tc>
+        <w:tc>
+          <w:tcPr>
+            <w:tcW w:w="6838" w:type="dxa"/>
+            <w:tcBorders>
+              <w:top w:val="single" w:sz="2" w:space="0" w:color="C7D2DD"/>
+              <w:left w:val="single" w:sz="2" w:space="0" w:color="C7D2DD"/>
+              <w:bottom w:val="single" w:sz="2" w:space="0" w:color="C7D2DD"/>
+              <w:right w:val="single" w:sz="2" w:space="0" w:color="C7D2DD"/>
+            </w:tcBorders>
+            <w:shd w:val="clear" w:color="auto" w:fill="EAF1F8"/>
+            <w:tcMar>
+              <w:top w:w="60" w:type="dxa"/>
+              <w:left w:w="110" w:type="dxa"/>
+              <w:bottom w:w="60" w:type="dxa"/>
+              <w:right w:w="110" w:type="dxa"/>
+            </w:tcMar>
+            <w:vAlign w:val="center"/>
+          </w:tcPr>
+          <w:p>
+            <w:pPr>
+              <w:spacing w:line="248" w:lineRule="auto"/>
+            </w:pPr>
+            <w:r>
+              <w:rPr>
+                <w:sz w:val="20"/>
+                <w:szCs w:val="20"/>
+              </w:rPr>
+              <w:t xml:space="preserve">Ein Prozess </w:t>
+            </w:r>
+            <w:proofErr w:type="spellStart"/>
+            <w:r>
+              <w:rPr>
+                <w:sz w:val="20"/>
+                <w:szCs w:val="20"/>
+              </w:rPr>
+              <w:t>hält</w:t>
+            </w:r>
+            <w:proofErr w:type="spellEnd"/>
+            <w:r>
+              <w:rPr>
+                <w:sz w:val="20"/>
+                <w:szCs w:val="20"/>
+              </w:rPr>
+              <w:t xml:space="preserve"> Ressourcen und wartet gleichzeitig auf weitere.</w:t>
+            </w:r>
+          </w:p>
+        </w:tc>
+      </w:tr>
+      <w:tr>
+        <w:tblPrEx>
+          <w:tblCellMar>
+            <w:top w:w="0" w:type="dxa"/>
+            <w:bottom w:w="0" w:type="dxa"/>
+          </w:tblCellMar>
+        </w:tblPrEx>
+        <w:trPr>
+          <w:gridAfter w:val="1"/>
+          <w:wAfter w:w="27" w:type="dxa"/>
+        </w:trPr>
+        <w:tc>
+          <w:tcPr>
+            <w:tcW w:w="2800" w:type="dxa"/>
+            <w:gridSpan w:val="2"/>
+            <w:tcBorders>
+              <w:top w:val="single" w:sz="2" w:space="0" w:color="C7D2DD"/>
+              <w:left w:val="single" w:sz="2" w:space="0" w:color="C7D2DD"/>
+              <w:bottom w:val="single" w:sz="2" w:space="0" w:color="C7D2DD"/>
+              <w:right w:val="single" w:sz="2" w:space="0" w:color="C7D2DD"/>
+            </w:tcBorders>
+            <w:shd w:val="clear" w:color="auto" w:fill="FFFFFF"/>
+            <w:tcMar>
+              <w:top w:w="60" w:type="dxa"/>
+              <w:left w:w="110" w:type="dxa"/>
+              <w:bottom w:w="60" w:type="dxa"/>
+              <w:right w:w="110" w:type="dxa"/>
+            </w:tcMar>
+            <w:vAlign w:val="center"/>
+          </w:tcPr>
+          <w:p>
+            <w:pPr>
+              <w:spacing w:line="248" w:lineRule="auto"/>
+            </w:pPr>
+            <w:proofErr w:type="spellStart"/>
+            <w:r>
+              <w:rPr>
+                <w:sz w:val="20"/>
+                <w:szCs w:val="20"/>
+              </w:rPr>
+              <w:t>No</w:t>
+            </w:r>
+            <w:proofErr w:type="spellEnd"/>
+            <w:r>
+              <w:rPr>
+                <w:sz w:val="20"/>
+                <w:szCs w:val="20"/>
+              </w:rPr>
+              <w:t xml:space="preserve"> </w:t>
+            </w:r>
+            <w:proofErr w:type="spellStart"/>
+            <w:r>
+              <w:rPr>
+                <w:sz w:val="20"/>
+                <w:szCs w:val="20"/>
+              </w:rPr>
+              <w:t>Preemption</w:t>
+            </w:r>
+            <w:proofErr w:type="spellEnd"/>
+          </w:p>
+        </w:tc>
+        <w:tc>
+          <w:tcPr>
+            <w:tcW w:w="6838" w:type="dxa"/>
+            <w:tcBorders>
+              <w:top w:val="single" w:sz="2" w:space="0" w:color="C7D2DD"/>
+              <w:left w:val="single" w:sz="2" w:space="0" w:color="C7D2DD"/>
+              <w:bottom w:val="single" w:sz="2" w:space="0" w:color="C7D2DD"/>
+              <w:right w:val="single" w:sz="2" w:space="0" w:color="C7D2DD"/>
+            </w:tcBorders>
+            <w:shd w:val="clear" w:color="auto" w:fill="FFFFFF"/>
+            <w:tcMar>
+              <w:top w:w="60" w:type="dxa"/>
+              <w:left w:w="110" w:type="dxa"/>
+              <w:bottom w:w="60" w:type="dxa"/>
+              <w:right w:w="110" w:type="dxa"/>
+            </w:tcMar>
+            <w:vAlign w:val="center"/>
+          </w:tcPr>
+          <w:p>
+            <w:pPr>
+              <w:spacing w:line="248" w:lineRule="auto"/>
+            </w:pPr>
+            <w:r>
+              <w:rPr>
+                <w:sz w:val="20"/>
+                <w:szCs w:val="20"/>
+              </w:rPr>
+              <w:t xml:space="preserve">Ressourcen </w:t>
+            </w:r>
+            <w:proofErr w:type="spellStart"/>
+            <w:r>
+              <w:rPr>
+                <w:sz w:val="20"/>
+                <w:szCs w:val="20"/>
+              </w:rPr>
+              <w:t>können</w:t>
+            </w:r>
+            <w:proofErr w:type="spellEnd"/>
+            <w:r>
+              <w:rPr>
+                <w:sz w:val="20"/>
+                <w:szCs w:val="20"/>
+              </w:rPr>
+              <w:t xml:space="preserve"> nicht zwangsweise entzogen werden.</w:t>
+            </w:r>
+          </w:p>
+        </w:tc>
+      </w:tr>
+      <w:tr>
+        <w:tblPrEx>
+          <w:tblCellMar>
+            <w:top w:w="0" w:type="dxa"/>
+            <w:bottom w:w="0" w:type="dxa"/>
+          </w:tblCellMar>
+        </w:tblPrEx>
+        <w:trPr>
+          <w:gridAfter w:val="1"/>
+          <w:wAfter w:w="27" w:type="dxa"/>
+        </w:trPr>
+        <w:tc>
+          <w:tcPr>
+            <w:tcW w:w="2800" w:type="dxa"/>
+            <w:gridSpan w:val="2"/>
+            <w:tcBorders>
+              <w:top w:val="single" w:sz="2" w:space="0" w:color="C7D2DD"/>
+              <w:left w:val="single" w:sz="2" w:space="0" w:color="C7D2DD"/>
+              <w:bottom w:val="single" w:sz="2" w:space="0" w:color="C7D2DD"/>
+              <w:right w:val="single" w:sz="2" w:space="0" w:color="C7D2DD"/>
+            </w:tcBorders>
+            <w:shd w:val="clear" w:color="auto" w:fill="EAF1F8"/>
+            <w:tcMar>
+              <w:top w:w="60" w:type="dxa"/>
+              <w:left w:w="110" w:type="dxa"/>
+              <w:bottom w:w="60" w:type="dxa"/>
+              <w:right w:w="110" w:type="dxa"/>
+            </w:tcMar>
+            <w:vAlign w:val="center"/>
+          </w:tcPr>
+          <w:p>
+            <w:pPr>
+              <w:spacing w:line="248" w:lineRule="auto"/>
+            </w:pPr>
+            <w:proofErr w:type="spellStart"/>
+            <w:r>
+              <w:rPr>
+                <w:sz w:val="20"/>
+                <w:szCs w:val="20"/>
+              </w:rPr>
+              <w:t>Circular</w:t>
+            </w:r>
+            <w:proofErr w:type="spellEnd"/>
+            <w:r>
+              <w:rPr>
+                <w:sz w:val="20"/>
+                <w:szCs w:val="20"/>
+              </w:rPr>
+              <w:t xml:space="preserve"> Wait</w:t>
+            </w:r>
+          </w:p>
+        </w:tc>
+        <w:tc>
+          <w:tcPr>
+            <w:tcW w:w="6838" w:type="dxa"/>
+            <w:tcBorders>
+              <w:top w:val="single" w:sz="2" w:space="0" w:color="C7D2DD"/>
+              <w:left w:val="single" w:sz="2" w:space="0" w:color="C7D2DD"/>
+              <w:bottom w:val="single" w:sz="2" w:space="0" w:color="C7D2DD"/>
+              <w:right w:val="single" w:sz="2" w:space="0" w:color="C7D2DD"/>
+            </w:tcBorders>
+            <w:shd w:val="clear" w:color="auto" w:fill="EAF1F8"/>
+            <w:tcMar>
+              <w:top w:w="60" w:type="dxa"/>
+              <w:left w:w="110" w:type="dxa"/>
+              <w:bottom w:w="60" w:type="dxa"/>
+              <w:right w:w="110" w:type="dxa"/>
+            </w:tcMar>
+            <w:vAlign w:val="center"/>
+          </w:tcPr>
+          <w:p>
+            <w:pPr>
+              <w:spacing w:line="248" w:lineRule="auto"/>
+            </w:pPr>
+            <w:r>
+              <w:rPr>
+                <w:sz w:val="20"/>
+                <w:szCs w:val="20"/>
+              </w:rPr>
+              <w:t>Es existiert eine geschlossene Warteschleife.</w:t>
+            </w:r>
+          </w:p>
+        </w:tc>
+      </w:tr>
+      <w:tr>
+        <w:tblPrEx>
+          <w:tblCellMar>
+            <w:top w:w="0" w:type="dxa"/>
+            <w:bottom w:w="0" w:type="dxa"/>
+          </w:tblCellMar>
+        </w:tblPrEx>
+        <w:trPr>
+          <w:gridBefore w:val="1"/>
+          <w:wBefore w:w="27" w:type="dxa"/>
+        </w:trPr>
+        <w:tc>
+          <w:tcPr>
+            <w:tcW w:w="9638" w:type="dxa"/>
+            <w:gridSpan w:val="3"/>
+            <w:tcBorders>
+              <w:left w:val="single" w:sz="24" w:space="0" w:color="2E75B6"/>
+            </w:tcBorders>
+            <w:shd w:val="clear" w:color="auto" w:fill="EAF1F8"/>
+            <w:tcMar>
+              <w:top w:w="120" w:type="dxa"/>
+              <w:left w:w="200" w:type="dxa"/>
+              <w:bottom w:w="120" w:type="dxa"/>
+              <w:right w:w="160" w:type="dxa"/>
+            </w:tcMar>
+          </w:tcPr>
+          <w:p>
+            <w:pPr>
+              <w:spacing w:after="60" w:line="260" w:lineRule="auto"/>
+            </w:pPr>
+            <w:r>
+              <w:rPr>
+                <w:b/>
+                <w:bCs/>
+                <w:color w:val="2E75B6"/>
+              </w:rPr>
+              <w:t>Merksatz</w:t>
+            </w:r>
+          </w:p>
+          <w:p>
+            <w:pPr>
+              <w:spacing w:line="260" w:lineRule="auto"/>
+            </w:pPr>
+            <w:r>
+              <w:t xml:space="preserve">Um Deadlocks zu verhindern, muss mindestens eine der vier notwendigen Bedingungen ausgeschlossen werden. Tipp: </w:t>
+            </w:r>
+            <w:proofErr w:type="spellStart"/>
+            <w:r>
+              <w:t>zirkuläres</w:t>
+            </w:r>
+            <w:proofErr w:type="spellEnd"/>
+            <w:r>
+              <w:t xml:space="preserve"> Warten verhindern.</w:t>
+            </w:r>
+          </w:p>
+        </w:tc>
+      </w:tr>
+    </w:tbl>
+    <w:p/>
+    <w:p>
+      <w:pPr>
+        <w:spacing w:after="120" w:line="264" w:lineRule="auto"/>
+      </w:pPr>
+      <w:r>
+        <w:rPr>
+          <w:b/>
+          <w:bCs/>
+        </w:rPr>
+        <w:t xml:space="preserve">Erzeuger-Verbraucher-Problem: </w:t>
+      </w:r>
+      <w:r>
+        <w:t>Ein Erzeuger legt Daten in einen Puffer, ein Verbraucher entnimmt sie. Ist der Puffer voll, muss der Erzeuger warten; ist er leer, muss der Verbraucher warten.</w:t>
+      </w:r>
+    </w:p>
+    <w:p>
+      <w:r>
+        <w:br w:type="page"/>
+      </w:r>
+    </w:p>
+    <w:p>
+      <w:pPr>
+        <w:pStyle w:val="berschrift3"/>
+      </w:pPr>
+      <w:proofErr w:type="spellStart"/>
+      <w:r>
+        <w:t>Übungsfragen</w:t>
+      </w:r>
+      <w:proofErr w:type="spellEnd"/>
+    </w:p>
+    <w:p>
+      <w:pPr>
+        <w:spacing w:before="100" w:after="30" w:line="260" w:lineRule="auto"/>
+      </w:pPr>
+      <w:r>
+        <w:rPr>
+          <w:b/>
+          <w:bCs/>
+          <w:color w:val="2E75B6"/>
+        </w:rPr>
+        <w:t xml:space="preserve">Frage: </w:t>
+      </w:r>
+      <w:r>
+        <w:rPr>
+          <w:b/>
+          <w:bCs/>
+        </w:rPr>
+        <w:t>Was unterscheidet synchrone und asynchrone Kommunikation?</w:t>
+      </w:r>
+    </w:p>
+    <w:p>
+      <w:pPr>
+        <w:spacing w:after="120" w:line="260" w:lineRule="auto"/>
+      </w:pPr>
+      <w:r>
+        <w:rPr>
+          <w:b/>
+          <w:bCs/>
+          <w:color w:val="44546A"/>
+        </w:rPr>
+        <w:t xml:space="preserve">Antwort: </w:t>
+      </w:r>
+      <w:r>
+        <w:t xml:space="preserve">Bei synchroner Kommunikation wartet der Sender, bis der </w:t>
+      </w:r>
+      <w:proofErr w:type="spellStart"/>
+      <w:r>
+        <w:t>Empfänger</w:t>
+      </w:r>
+      <w:proofErr w:type="spellEnd"/>
+      <w:r>
+        <w:t xml:space="preserve"> bereit ist. Bei asynchroner Kommunikation sendet er und arbeitet sofort weiter; die Nachricht wird gepuffert.</w:t>
+      </w:r>
+    </w:p>
+    <w:p>
+      <w:pPr>
+        <w:spacing w:before="100" w:after="30" w:line="260" w:lineRule="auto"/>
+      </w:pPr>
+      <w:r>
+        <w:rPr>
+          <w:b/>
+          <w:bCs/>
+          <w:color w:val="2E75B6"/>
+        </w:rPr>
+        <w:t xml:space="preserve">Frage: </w:t>
+      </w:r>
+      <w:proofErr w:type="spellStart"/>
+      <w:r>
+        <w:rPr>
+          <w:b/>
+          <w:bCs/>
+        </w:rPr>
+        <w:t>Erläutere</w:t>
+      </w:r>
+      <w:proofErr w:type="spellEnd"/>
+      <w:r>
+        <w:rPr>
+          <w:b/>
+          <w:bCs/>
+        </w:rPr>
+        <w:t xml:space="preserve"> die Strategie der atomaren Ressourcenzuteilung.</w:t>
+      </w:r>
+    </w:p>
+    <w:p>
+      <w:pPr>
+        <w:spacing w:after="120" w:line="260" w:lineRule="auto"/>
+      </w:pPr>
+      <w:r>
+        <w:rPr>
+          <w:b/>
+          <w:bCs/>
+          <w:color w:val="44546A"/>
+        </w:rPr>
+        <w:t xml:space="preserve">Antwort: </w:t>
+      </w:r>
+      <w:r>
+        <w:t xml:space="preserve">Ein Prozess fordert alle </w:t>
+      </w:r>
+      <w:proofErr w:type="spellStart"/>
+      <w:r>
+        <w:t>benötigten</w:t>
+      </w:r>
+      <w:proofErr w:type="spellEnd"/>
+      <w:r>
+        <w:t xml:space="preserve"> Ressourcen auf einmal an und bekommt sie entweder </w:t>
+      </w:r>
+      <w:proofErr w:type="spellStart"/>
+      <w:r>
+        <w:t>vollständig</w:t>
+      </w:r>
+      <w:proofErr w:type="spellEnd"/>
+      <w:r>
+        <w:t xml:space="preserve"> oder gar nicht. Dadurch wird 'Hold and Wait' vermieden.</w:t>
+      </w:r>
+    </w:p>
+    <w:p>
+      <w:pPr>
+        <w:spacing w:before="100" w:after="30" w:line="260" w:lineRule="auto"/>
+      </w:pPr>
+      <w:r>
+        <w:rPr>
+          <w:b/>
+          <w:bCs/>
+          <w:color w:val="2E75B6"/>
+        </w:rPr>
+        <w:t xml:space="preserve">Frage: </w:t>
+      </w:r>
+      <w:r>
+        <w:rPr>
+          <w:b/>
+          <w:bCs/>
+        </w:rPr>
+        <w:t>Was unterscheidet Multicast und Broadcast?</w:t>
+      </w:r>
+    </w:p>
+    <w:p>
+      <w:pPr>
+        <w:spacing w:after="120" w:line="260" w:lineRule="auto"/>
+      </w:pPr>
+      <w:r>
+        <w:rPr>
+          <w:b/>
+          <w:bCs/>
+          <w:color w:val="44546A"/>
+        </w:rPr>
+        <w:t xml:space="preserve">Antwort: </w:t>
+      </w:r>
+      <w:r>
+        <w:t xml:space="preserve">Broadcast geht an alle Teilnehmer im Netz/Segment. Multicast geht gezielt nur an eine definierte Gruppe von </w:t>
+      </w:r>
+      <w:proofErr w:type="spellStart"/>
+      <w:r>
+        <w:t>Empfängern</w:t>
+      </w:r>
+      <w:proofErr w:type="spellEnd"/>
+      <w:r>
+        <w:t>.</w:t>
+      </w:r>
+    </w:p>
+    <w:p>
+      <w:pPr>
+        <w:spacing w:after="120" w:line="260" w:lineRule="auto"/>
+      </w:pPr>
+    </w:p>
+    <w:p>
+      <w:pPr>
+        <w:pStyle w:val="berschrift2"/>
+      </w:pPr>
+      <w:bookmarkStart w:id="7" w:name="_Toc232080254"/>
+      <w:r>
+        <w:t xml:space="preserve">5. Ein-/Ausgabe, Interrupts und </w:t>
+      </w:r>
+      <w:proofErr w:type="spellStart"/>
+      <w:r>
+        <w:t>Gerätetreiber</w:t>
+      </w:r>
+      <w:bookmarkEnd w:id="7"/>
+      <w:proofErr w:type="spellEnd"/>
+    </w:p>
+    <w:p/>
+    <w:tbl>
+      <w:tblPr>
+        <w:tblW w:w="9638" w:type="dxa"/>
+        <w:tblBorders>
+          <w:top w:val="single" w:sz="4" w:space="0" w:color="auto"/>
+          <w:left w:val="single" w:sz="4" w:space="0" w:color="auto"/>
+          <w:bottom w:val="single" w:sz="4" w:space="0" w:color="auto"/>
+          <w:right w:val="single" w:sz="4" w:space="0" w:color="auto"/>
+          <w:insideH w:val="single" w:sz="4" w:space="0" w:color="auto"/>
+          <w:insideV w:val="single" w:sz="4" w:space="0" w:color="auto"/>
+        </w:tblBorders>
+        <w:tblLayout w:type="fixed"/>
+        <w:tblCellMar>
+          <w:left w:w="10" w:type="dxa"/>
+          <w:right w:w="10" w:type="dxa"/>
+        </w:tblCellMar>
+        <w:tblLook w:val="0000" w:firstRow="0" w:lastRow="0" w:firstColumn="0" w:lastColumn="0" w:noHBand="0" w:noVBand="0"/>
+      </w:tblPr>
+      <w:tblGrid>
+        <w:gridCol w:w="2200"/>
+        <w:gridCol w:w="4000"/>
+        <w:gridCol w:w="3438"/>
+      </w:tblGrid>
+      <w:tr>
+        <w:tblPrEx>
+          <w:tblCellMar>
+            <w:top w:w="0" w:type="dxa"/>
+            <w:bottom w:w="0" w:type="dxa"/>
+          </w:tblCellMar>
+        </w:tblPrEx>
+        <w:trPr>
+          <w:tblHeader/>
+        </w:trPr>
+        <w:tc>
+          <w:tcPr>
+            <w:tcW w:w="2200" w:type="dxa"/>
+            <w:tcBorders>
+              <w:top w:val="single" w:sz="2" w:space="0" w:color="C7D2DD"/>
+              <w:left w:val="single" w:sz="2" w:space="0" w:color="C7D2DD"/>
+              <w:bottom w:val="single" w:sz="2" w:space="0" w:color="C7D2DD"/>
+              <w:right w:val="single" w:sz="2" w:space="0" w:color="C7D2DD"/>
+            </w:tcBorders>
+            <w:shd w:val="clear" w:color="auto" w:fill="2E75B6"/>
+            <w:tcMar>
+              <w:top w:w="60" w:type="dxa"/>
+              <w:left w:w="110" w:type="dxa"/>
+              <w:bottom w:w="60" w:type="dxa"/>
+              <w:right w:w="110" w:type="dxa"/>
+            </w:tcMar>
+            <w:vAlign w:val="center"/>
+          </w:tcPr>
+          <w:p>
+            <w:pPr>
+              <w:spacing w:line="248" w:lineRule="auto"/>
+            </w:pPr>
+            <w:r>
+              <w:rPr>
+                <w:b/>
+                <w:bCs/>
+                <w:color w:val="FFFFFF"/>
+                <w:sz w:val="20"/>
+                <w:szCs w:val="20"/>
+              </w:rPr>
+              <w:t>Verfahren</w:t>
+            </w:r>
+          </w:p>
+        </w:tc>
+        <w:tc>
+          <w:tcPr>
+            <w:tcW w:w="4000" w:type="dxa"/>
+            <w:tcBorders>
+              <w:top w:val="single" w:sz="2" w:space="0" w:color="C7D2DD"/>
+              <w:left w:val="single" w:sz="2" w:space="0" w:color="C7D2DD"/>
+              <w:bottom w:val="single" w:sz="2" w:space="0" w:color="C7D2DD"/>
+              <w:right w:val="single" w:sz="2" w:space="0" w:color="C7D2DD"/>
+            </w:tcBorders>
+            <w:shd w:val="clear" w:color="auto" w:fill="2E75B6"/>
+            <w:tcMar>
+              <w:top w:w="60" w:type="dxa"/>
+              <w:left w:w="110" w:type="dxa"/>
+              <w:bottom w:w="60" w:type="dxa"/>
+              <w:right w:w="110" w:type="dxa"/>
+            </w:tcMar>
+            <w:vAlign w:val="center"/>
+          </w:tcPr>
+          <w:p>
+            <w:pPr>
+              <w:spacing w:line="248" w:lineRule="auto"/>
+            </w:pPr>
+            <w:r>
+              <w:rPr>
+                <w:b/>
+                <w:bCs/>
+                <w:color w:val="FFFFFF"/>
+                <w:sz w:val="20"/>
+                <w:szCs w:val="20"/>
+              </w:rPr>
+              <w:t>Ablauf</w:t>
+            </w:r>
+          </w:p>
+        </w:tc>
+        <w:tc>
+          <w:tcPr>
+            <w:tcW w:w="3438" w:type="dxa"/>
+            <w:tcBorders>
+              <w:top w:val="single" w:sz="2" w:space="0" w:color="C7D2DD"/>
+              <w:left w:val="single" w:sz="2" w:space="0" w:color="C7D2DD"/>
+              <w:bottom w:val="single" w:sz="2" w:space="0" w:color="C7D2DD"/>
+              <w:right w:val="single" w:sz="2" w:space="0" w:color="C7D2DD"/>
+            </w:tcBorders>
+            <w:shd w:val="clear" w:color="auto" w:fill="2E75B6"/>
+            <w:tcMar>
+              <w:top w:w="60" w:type="dxa"/>
+              <w:left w:w="110" w:type="dxa"/>
+              <w:bottom w:w="60" w:type="dxa"/>
+              <w:right w:w="110" w:type="dxa"/>
+            </w:tcMar>
+            <w:vAlign w:val="center"/>
+          </w:tcPr>
+          <w:p>
+            <w:pPr>
+              <w:spacing w:line="248" w:lineRule="auto"/>
+            </w:pPr>
+            <w:r>
+              <w:rPr>
+                <w:b/>
+                <w:bCs/>
+                <w:color w:val="FFFFFF"/>
+                <w:sz w:val="20"/>
+                <w:szCs w:val="20"/>
+              </w:rPr>
+              <w:t>Bewertung</w:t>
+            </w:r>
+          </w:p>
+        </w:tc>
+      </w:tr>
+      <w:tr>
+        <w:tblPrEx>
+          <w:tblCellMar>
+            <w:top w:w="0" w:type="dxa"/>
+            <w:bottom w:w="0" w:type="dxa"/>
+          </w:tblCellMar>
+        </w:tblPrEx>
+        <w:tc>
+          <w:tcPr>
+            <w:tcW w:w="2200" w:type="dxa"/>
+            <w:tcBorders>
+              <w:top w:val="single" w:sz="2" w:space="0" w:color="C7D2DD"/>
+              <w:left w:val="single" w:sz="2" w:space="0" w:color="C7D2DD"/>
+              <w:bottom w:val="single" w:sz="2" w:space="0" w:color="C7D2DD"/>
+              <w:right w:val="single" w:sz="2" w:space="0" w:color="C7D2DD"/>
+            </w:tcBorders>
+            <w:shd w:val="clear" w:color="auto" w:fill="FFFFFF"/>
+            <w:tcMar>
+              <w:top w:w="60" w:type="dxa"/>
+              <w:left w:w="110" w:type="dxa"/>
+              <w:bottom w:w="60" w:type="dxa"/>
+              <w:right w:w="110" w:type="dxa"/>
+            </w:tcMar>
+            <w:vAlign w:val="center"/>
+          </w:tcPr>
+          <w:p>
+            <w:pPr>
+              <w:spacing w:line="248" w:lineRule="auto"/>
+            </w:pPr>
+            <w:r>
+              <w:rPr>
+                <w:sz w:val="20"/>
+                <w:szCs w:val="20"/>
+              </w:rPr>
+              <w:t>Polling</w:t>
+            </w:r>
+          </w:p>
+        </w:tc>
+        <w:tc>
+          <w:tcPr>
+            <w:tcW w:w="4000" w:type="dxa"/>
+            <w:tcBorders>
+              <w:top w:val="single" w:sz="2" w:space="0" w:color="C7D2DD"/>
+              <w:left w:val="single" w:sz="2" w:space="0" w:color="C7D2DD"/>
+              <w:bottom w:val="single" w:sz="2" w:space="0" w:color="C7D2DD"/>
+              <w:right w:val="single" w:sz="2" w:space="0" w:color="C7D2DD"/>
+            </w:tcBorders>
+            <w:shd w:val="clear" w:color="auto" w:fill="FFFFFF"/>
+            <w:tcMar>
+              <w:top w:w="60" w:type="dxa"/>
+              <w:left w:w="110" w:type="dxa"/>
+              <w:bottom w:w="60" w:type="dxa"/>
+              <w:right w:w="110" w:type="dxa"/>
+            </w:tcMar>
+            <w:vAlign w:val="center"/>
+          </w:tcPr>
+          <w:p>
+            <w:pPr>
+              <w:spacing w:line="248" w:lineRule="auto"/>
+            </w:pPr>
+            <w:r>
+              <w:rPr>
+                <w:sz w:val="20"/>
+                <w:szCs w:val="20"/>
+              </w:rPr>
+              <w:t>CPU fragt zyklisch Statusbits wie BUSY oder READY ab.</w:t>
+            </w:r>
+          </w:p>
+        </w:tc>
+        <w:tc>
+          <w:tcPr>
+            <w:tcW w:w="3438" w:type="dxa"/>
+            <w:tcBorders>
+              <w:top w:val="single" w:sz="2" w:space="0" w:color="C7D2DD"/>
+              <w:left w:val="single" w:sz="2" w:space="0" w:color="C7D2DD"/>
+              <w:bottom w:val="single" w:sz="2" w:space="0" w:color="C7D2DD"/>
+              <w:right w:val="single" w:sz="2" w:space="0" w:color="C7D2DD"/>
+            </w:tcBorders>
+            <w:shd w:val="clear" w:color="auto" w:fill="FFFFFF"/>
+            <w:tcMar>
+              <w:top w:w="60" w:type="dxa"/>
+              <w:left w:w="110" w:type="dxa"/>
+              <w:bottom w:w="60" w:type="dxa"/>
+              <w:right w:w="110" w:type="dxa"/>
+            </w:tcMar>
+            <w:vAlign w:val="center"/>
+          </w:tcPr>
+          <w:p>
+            <w:pPr>
+              <w:spacing w:line="248" w:lineRule="auto"/>
+            </w:pPr>
+            <w:r>
+              <w:rPr>
+                <w:sz w:val="20"/>
+                <w:szCs w:val="20"/>
+              </w:rPr>
+              <w:t xml:space="preserve">Einfach, aber ineffizient, weil CPU-Zeit </w:t>
+            </w:r>
+            <w:proofErr w:type="spellStart"/>
+            <w:r>
+              <w:rPr>
+                <w:sz w:val="20"/>
+                <w:szCs w:val="20"/>
+              </w:rPr>
+              <w:t>für</w:t>
+            </w:r>
+            <w:proofErr w:type="spellEnd"/>
+            <w:r>
+              <w:rPr>
+                <w:sz w:val="20"/>
+                <w:szCs w:val="20"/>
+              </w:rPr>
+              <w:t xml:space="preserve"> Warten verbraucht wird.</w:t>
+            </w:r>
+          </w:p>
+        </w:tc>
+      </w:tr>
+      <w:tr>
+        <w:tblPrEx>
+          <w:tblCellMar>
+            <w:top w:w="0" w:type="dxa"/>
+            <w:bottom w:w="0" w:type="dxa"/>
+          </w:tblCellMar>
+        </w:tblPrEx>
+        <w:tc>
+          <w:tcPr>
+            <w:tcW w:w="2200" w:type="dxa"/>
+            <w:tcBorders>
+              <w:top w:val="single" w:sz="2" w:space="0" w:color="C7D2DD"/>
+              <w:left w:val="single" w:sz="2" w:space="0" w:color="C7D2DD"/>
+              <w:bottom w:val="single" w:sz="2" w:space="0" w:color="C7D2DD"/>
+              <w:right w:val="single" w:sz="2" w:space="0" w:color="C7D2DD"/>
+            </w:tcBorders>
+            <w:shd w:val="clear" w:color="auto" w:fill="EAF1F8"/>
+            <w:tcMar>
+              <w:top w:w="60" w:type="dxa"/>
+              <w:left w:w="110" w:type="dxa"/>
+              <w:bottom w:w="60" w:type="dxa"/>
+              <w:right w:w="110" w:type="dxa"/>
+            </w:tcMar>
+            <w:vAlign w:val="center"/>
+          </w:tcPr>
+          <w:p>
+            <w:pPr>
+              <w:spacing w:line="248" w:lineRule="auto"/>
+            </w:pPr>
+            <w:r>
+              <w:rPr>
+                <w:sz w:val="20"/>
+                <w:szCs w:val="20"/>
+              </w:rPr>
+              <w:t>Interrupt</w:t>
+            </w:r>
+          </w:p>
+        </w:tc>
+        <w:tc>
+          <w:tcPr>
+            <w:tcW w:w="4000" w:type="dxa"/>
+            <w:tcBorders>
+              <w:top w:val="single" w:sz="2" w:space="0" w:color="C7D2DD"/>
+              <w:left w:val="single" w:sz="2" w:space="0" w:color="C7D2DD"/>
+              <w:bottom w:val="single" w:sz="2" w:space="0" w:color="C7D2DD"/>
+              <w:right w:val="single" w:sz="2" w:space="0" w:color="C7D2DD"/>
+            </w:tcBorders>
+            <w:shd w:val="clear" w:color="auto" w:fill="EAF1F8"/>
+            <w:tcMar>
+              <w:top w:w="60" w:type="dxa"/>
+              <w:left w:w="110" w:type="dxa"/>
+              <w:bottom w:w="60" w:type="dxa"/>
+              <w:right w:w="110" w:type="dxa"/>
+            </w:tcMar>
+            <w:vAlign w:val="center"/>
+          </w:tcPr>
+          <w:p>
+            <w:pPr>
+              <w:spacing w:line="248" w:lineRule="auto"/>
+            </w:pPr>
+            <w:proofErr w:type="spellStart"/>
+            <w:r>
+              <w:rPr>
+                <w:sz w:val="20"/>
+                <w:szCs w:val="20"/>
+              </w:rPr>
+              <w:t>Gerät</w:t>
+            </w:r>
+            <w:proofErr w:type="spellEnd"/>
+            <w:r>
+              <w:rPr>
+                <w:sz w:val="20"/>
+                <w:szCs w:val="20"/>
+              </w:rPr>
+              <w:t xml:space="preserve"> meldet sich </w:t>
+            </w:r>
+            <w:proofErr w:type="spellStart"/>
+            <w:r>
+              <w:rPr>
+                <w:sz w:val="20"/>
+                <w:szCs w:val="20"/>
+              </w:rPr>
+              <w:t>selbstständig</w:t>
+            </w:r>
+            <w:proofErr w:type="spellEnd"/>
+            <w:r>
+              <w:rPr>
+                <w:sz w:val="20"/>
+                <w:szCs w:val="20"/>
+              </w:rPr>
+              <w:t>, wenn ein Ereignis eintritt.</w:t>
+            </w:r>
+          </w:p>
+        </w:tc>
+        <w:tc>
+          <w:tcPr>
+            <w:tcW w:w="3438" w:type="dxa"/>
+            <w:tcBorders>
+              <w:top w:val="single" w:sz="2" w:space="0" w:color="C7D2DD"/>
+              <w:left w:val="single" w:sz="2" w:space="0" w:color="C7D2DD"/>
+              <w:bottom w:val="single" w:sz="2" w:space="0" w:color="C7D2DD"/>
+              <w:right w:val="single" w:sz="2" w:space="0" w:color="C7D2DD"/>
+            </w:tcBorders>
+            <w:shd w:val="clear" w:color="auto" w:fill="EAF1F8"/>
+            <w:tcMar>
+              <w:top w:w="60" w:type="dxa"/>
+              <w:left w:w="110" w:type="dxa"/>
+              <w:bottom w:w="60" w:type="dxa"/>
+              <w:right w:w="110" w:type="dxa"/>
+            </w:tcMar>
+            <w:vAlign w:val="center"/>
+          </w:tcPr>
+          <w:p>
+            <w:pPr>
+              <w:spacing w:line="248" w:lineRule="auto"/>
+            </w:pPr>
+            <w:r>
+              <w:rPr>
+                <w:sz w:val="20"/>
+                <w:szCs w:val="20"/>
+              </w:rPr>
+              <w:t xml:space="preserve">Effizienter; </w:t>
+            </w:r>
+            <w:proofErr w:type="spellStart"/>
+            <w:r>
+              <w:rPr>
+                <w:sz w:val="20"/>
+                <w:szCs w:val="20"/>
+              </w:rPr>
+              <w:t>benötigt</w:t>
+            </w:r>
+            <w:proofErr w:type="spellEnd"/>
+            <w:r>
+              <w:rPr>
+                <w:sz w:val="20"/>
+                <w:szCs w:val="20"/>
+              </w:rPr>
+              <w:t xml:space="preserve"> Interrupt-Service-Routine und </w:t>
+            </w:r>
+            <w:proofErr w:type="spellStart"/>
+            <w:r>
+              <w:rPr>
+                <w:sz w:val="20"/>
+                <w:szCs w:val="20"/>
+              </w:rPr>
+              <w:t>Prioritäten</w:t>
+            </w:r>
+            <w:proofErr w:type="spellEnd"/>
+            <w:r>
+              <w:rPr>
+                <w:sz w:val="20"/>
+                <w:szCs w:val="20"/>
+              </w:rPr>
+              <w:t>.</w:t>
+            </w:r>
+          </w:p>
+        </w:tc>
+      </w:tr>
+      <w:tr>
+        <w:tblPrEx>
+          <w:tblCellMar>
+            <w:top w:w="0" w:type="dxa"/>
+            <w:bottom w:w="0" w:type="dxa"/>
+          </w:tblCellMar>
+        </w:tblPrEx>
+        <w:tc>
+          <w:tcPr>
+            <w:tcW w:w="2200" w:type="dxa"/>
+            <w:tcBorders>
+              <w:top w:val="single" w:sz="2" w:space="0" w:color="C7D2DD"/>
+              <w:left w:val="single" w:sz="2" w:space="0" w:color="C7D2DD"/>
+              <w:bottom w:val="single" w:sz="2" w:space="0" w:color="C7D2DD"/>
+              <w:right w:val="single" w:sz="2" w:space="0" w:color="C7D2DD"/>
+            </w:tcBorders>
+            <w:shd w:val="clear" w:color="auto" w:fill="FFFFFF"/>
+            <w:tcMar>
+              <w:top w:w="60" w:type="dxa"/>
+              <w:left w:w="110" w:type="dxa"/>
+              <w:bottom w:w="60" w:type="dxa"/>
+              <w:right w:w="110" w:type="dxa"/>
+            </w:tcMar>
+            <w:vAlign w:val="center"/>
+          </w:tcPr>
+          <w:p>
+            <w:pPr>
+              <w:spacing w:line="248" w:lineRule="auto"/>
+            </w:pPr>
+            <w:r>
+              <w:rPr>
+                <w:sz w:val="20"/>
+                <w:szCs w:val="20"/>
+              </w:rPr>
+              <w:t>DMA</w:t>
+            </w:r>
+          </w:p>
+        </w:tc>
+        <w:tc>
+          <w:tcPr>
+            <w:tcW w:w="4000" w:type="dxa"/>
+            <w:tcBorders>
+              <w:top w:val="single" w:sz="2" w:space="0" w:color="C7D2DD"/>
+              <w:left w:val="single" w:sz="2" w:space="0" w:color="C7D2DD"/>
+              <w:bottom w:val="single" w:sz="2" w:space="0" w:color="C7D2DD"/>
+              <w:right w:val="single" w:sz="2" w:space="0" w:color="C7D2DD"/>
+            </w:tcBorders>
+            <w:shd w:val="clear" w:color="auto" w:fill="FFFFFF"/>
+            <w:tcMar>
+              <w:top w:w="60" w:type="dxa"/>
+              <w:left w:w="110" w:type="dxa"/>
+              <w:bottom w:w="60" w:type="dxa"/>
+              <w:right w:w="110" w:type="dxa"/>
+            </w:tcMar>
+            <w:vAlign w:val="center"/>
+          </w:tcPr>
+          <w:p>
+            <w:pPr>
+              <w:spacing w:line="248" w:lineRule="auto"/>
+            </w:pPr>
+            <w:r>
+              <w:rPr>
+                <w:sz w:val="20"/>
+                <w:szCs w:val="20"/>
+              </w:rPr>
+              <w:t xml:space="preserve">Controller </w:t>
+            </w:r>
+            <w:proofErr w:type="spellStart"/>
+            <w:r>
+              <w:rPr>
+                <w:sz w:val="20"/>
+                <w:szCs w:val="20"/>
+              </w:rPr>
+              <w:t>überträgt</w:t>
+            </w:r>
+            <w:proofErr w:type="spellEnd"/>
+            <w:r>
+              <w:rPr>
+                <w:sz w:val="20"/>
+                <w:szCs w:val="20"/>
+              </w:rPr>
+              <w:t xml:space="preserve"> Daten direkt zwischen </w:t>
+            </w:r>
+            <w:proofErr w:type="spellStart"/>
+            <w:r>
+              <w:rPr>
+                <w:sz w:val="20"/>
+                <w:szCs w:val="20"/>
+              </w:rPr>
+              <w:t>Gerät</w:t>
+            </w:r>
+            <w:proofErr w:type="spellEnd"/>
+            <w:r>
+              <w:rPr>
+                <w:sz w:val="20"/>
+                <w:szCs w:val="20"/>
+              </w:rPr>
+              <w:t xml:space="preserve"> und Speicher.</w:t>
+            </w:r>
+          </w:p>
+        </w:tc>
+        <w:tc>
+          <w:tcPr>
+            <w:tcW w:w="3438" w:type="dxa"/>
+            <w:tcBorders>
+              <w:top w:val="single" w:sz="2" w:space="0" w:color="C7D2DD"/>
+              <w:left w:val="single" w:sz="2" w:space="0" w:color="C7D2DD"/>
+              <w:bottom w:val="single" w:sz="2" w:space="0" w:color="C7D2DD"/>
+              <w:right w:val="single" w:sz="2" w:space="0" w:color="C7D2DD"/>
+            </w:tcBorders>
+            <w:shd w:val="clear" w:color="auto" w:fill="FFFFFF"/>
+            <w:tcMar>
+              <w:top w:w="60" w:type="dxa"/>
+              <w:left w:w="110" w:type="dxa"/>
+              <w:bottom w:w="60" w:type="dxa"/>
+              <w:right w:w="110" w:type="dxa"/>
+            </w:tcMar>
+            <w:vAlign w:val="center"/>
+          </w:tcPr>
+          <w:p>
+            <w:pPr>
+              <w:spacing w:line="248" w:lineRule="auto"/>
+            </w:pPr>
+            <w:r>
+              <w:rPr>
+                <w:sz w:val="20"/>
+                <w:szCs w:val="20"/>
+              </w:rPr>
+              <w:t>Entlastet CPU; CPU muss nur Auftrag starten und Ergebnis behandeln.</w:t>
+            </w:r>
+          </w:p>
+        </w:tc>
+      </w:tr>
+    </w:tbl>
+    <w:p/>
+    <w:p>
+      <w:pPr>
+        <w:pStyle w:val="berschrift3"/>
+      </w:pPr>
+      <w:proofErr w:type="spellStart"/>
+      <w:r>
+        <w:t>Gerätetreiber</w:t>
+      </w:r>
+      <w:proofErr w:type="spellEnd"/>
+    </w:p>
+    <w:p>
+      <w:pPr>
+        <w:pStyle w:val="Listenabsatz"/>
+        <w:numPr>
+          <w:ilvl w:val="0"/>
+          <w:numId w:val="2"/>
+        </w:numPr>
+        <w:spacing w:after="60" w:line="260" w:lineRule="auto"/>
+      </w:pPr>
+      <w:r>
+        <w:t xml:space="preserve">Ein </w:t>
+      </w:r>
+      <w:proofErr w:type="spellStart"/>
+      <w:r>
+        <w:t>Gerätetreiber</w:t>
+      </w:r>
+      <w:proofErr w:type="spellEnd"/>
+      <w:r>
+        <w:t xml:space="preserve"> ist ein Kernelmodul, das ein oder mehrere </w:t>
+      </w:r>
+      <w:proofErr w:type="spellStart"/>
+      <w:r>
+        <w:t>Geräte</w:t>
+      </w:r>
+      <w:proofErr w:type="spellEnd"/>
+      <w:r>
+        <w:t xml:space="preserve"> desselben Typs kontrolliert und eine einheitliche Schnittstelle </w:t>
+      </w:r>
+      <w:proofErr w:type="spellStart"/>
+      <w:r>
+        <w:t>für</w:t>
+      </w:r>
+      <w:proofErr w:type="spellEnd"/>
+      <w:r>
+        <w:t xml:space="preserve"> E/A-Funktionen bereitstellt.</w:t>
+      </w:r>
+    </w:p>
+    <w:p>
+      <w:pPr>
+        <w:pStyle w:val="Listenabsatz"/>
+        <w:numPr>
+          <w:ilvl w:val="0"/>
+          <w:numId w:val="2"/>
+        </w:numPr>
+        <w:spacing w:after="60" w:line="260" w:lineRule="auto"/>
+      </w:pPr>
+      <w:proofErr w:type="spellStart"/>
+      <w:r>
+        <w:t>Übersetzt</w:t>
+      </w:r>
+      <w:proofErr w:type="spellEnd"/>
+      <w:r>
+        <w:t xml:space="preserve"> allgemeine Betriebssystemaufrufe wie </w:t>
+      </w:r>
+      <w:proofErr w:type="spellStart"/>
+      <w:r>
+        <w:t>read</w:t>
+      </w:r>
+      <w:proofErr w:type="spellEnd"/>
+      <w:r>
+        <w:t>/</w:t>
+      </w:r>
+      <w:proofErr w:type="spellStart"/>
+      <w:r>
+        <w:t>write</w:t>
+      </w:r>
+      <w:proofErr w:type="spellEnd"/>
+      <w:r>
+        <w:t xml:space="preserve"> in </w:t>
+      </w:r>
+      <w:proofErr w:type="spellStart"/>
+      <w:r>
+        <w:t>gerätespezifische</w:t>
+      </w:r>
+      <w:proofErr w:type="spellEnd"/>
+      <w:r>
+        <w:t xml:space="preserve"> Befehle.</w:t>
+      </w:r>
+    </w:p>
+    <w:p>
+      <w:pPr>
+        <w:pStyle w:val="Listenabsatz"/>
+        <w:numPr>
+          <w:ilvl w:val="0"/>
+          <w:numId w:val="2"/>
+        </w:numPr>
+        <w:spacing w:after="60" w:line="260" w:lineRule="auto"/>
+      </w:pPr>
+      <w:r>
+        <w:t xml:space="preserve">Verwaltet E/A-Anforderungspakete mit </w:t>
+      </w:r>
+      <w:proofErr w:type="spellStart"/>
+      <w:r>
+        <w:t>Geräteadresse</w:t>
+      </w:r>
+      <w:proofErr w:type="spellEnd"/>
+      <w:r>
+        <w:t>, Datenpuffer und Anzahl der Bytes.</w:t>
+      </w:r>
+    </w:p>
+    <w:p>
+      <w:pPr>
+        <w:pStyle w:val="Listenabsatz"/>
+        <w:numPr>
+          <w:ilvl w:val="0"/>
+          <w:numId w:val="2"/>
+        </w:numPr>
+        <w:spacing w:after="60" w:line="260" w:lineRule="auto"/>
+      </w:pPr>
+      <w:proofErr w:type="spellStart"/>
+      <w:r>
+        <w:t>Geräteunabhängige</w:t>
+      </w:r>
+      <w:proofErr w:type="spellEnd"/>
+      <w:r>
+        <w:t xml:space="preserve"> Software stellt unterschiedliche </w:t>
+      </w:r>
+      <w:proofErr w:type="spellStart"/>
+      <w:r>
+        <w:t>Geräte</w:t>
+      </w:r>
+      <w:proofErr w:type="spellEnd"/>
+      <w:r>
+        <w:t xml:space="preserve"> </w:t>
+      </w:r>
+      <w:proofErr w:type="spellStart"/>
+      <w:r>
+        <w:t>möglichst</w:t>
+      </w:r>
+      <w:proofErr w:type="spellEnd"/>
+      <w:r>
+        <w:t xml:space="preserve"> einheitlich dar.</w:t>
+      </w:r>
+    </w:p>
+    <w:p/>
+    <w:tbl>
+      <w:tblPr>
+        <w:tblW w:w="9638" w:type="dxa"/>
+        <w:tblBorders>
+          <w:top w:val="single" w:sz="4" w:space="0" w:color="auto"/>
+          <w:left w:val="single" w:sz="4" w:space="0" w:color="auto"/>
+          <w:bottom w:val="single" w:sz="4" w:space="0" w:color="auto"/>
+          <w:right w:val="single" w:sz="4" w:space="0" w:color="auto"/>
+          <w:insideH w:val="single" w:sz="4" w:space="0" w:color="auto"/>
+          <w:insideV w:val="single" w:sz="4" w:space="0" w:color="auto"/>
+        </w:tblBorders>
+        <w:tblLayout w:type="fixed"/>
+        <w:tblCellMar>
+          <w:left w:w="10" w:type="dxa"/>
+          <w:right w:w="10" w:type="dxa"/>
+        </w:tblCellMar>
+        <w:tblLook w:val="0000" w:firstRow="0" w:lastRow="0" w:firstColumn="0" w:lastColumn="0" w:noHBand="0" w:noVBand="0"/>
+      </w:tblPr>
+      <w:tblGrid>
+        <w:gridCol w:w="9638"/>
+      </w:tblGrid>
+      <w:tr>
+        <w:tblPrEx>
+          <w:tblCellMar>
+            <w:top w:w="0" w:type="dxa"/>
+            <w:bottom w:w="0" w:type="dxa"/>
+          </w:tblCellMar>
+        </w:tblPrEx>
+        <w:tc>
+          <w:tcPr>
+            <w:tcW w:w="9638" w:type="dxa"/>
+            <w:tcBorders>
+              <w:left w:val="single" w:sz="24" w:space="0" w:color="2E75B6"/>
+            </w:tcBorders>
+            <w:shd w:val="clear" w:color="auto" w:fill="EAF1F8"/>
+            <w:tcMar>
+              <w:top w:w="120" w:type="dxa"/>
+              <w:left w:w="200" w:type="dxa"/>
+              <w:bottom w:w="120" w:type="dxa"/>
+              <w:right w:w="160" w:type="dxa"/>
+            </w:tcMar>
+          </w:tcPr>
+          <w:p>
+            <w:pPr>
+              <w:spacing w:after="60" w:line="260" w:lineRule="auto"/>
+            </w:pPr>
+            <w:proofErr w:type="spellStart"/>
+            <w:r>
+              <w:rPr>
+                <w:b/>
+                <w:bCs/>
+                <w:color w:val="2E75B6"/>
+              </w:rPr>
+              <w:t>Prüfungstipp</w:t>
+            </w:r>
+            <w:proofErr w:type="spellEnd"/>
+          </w:p>
+          <w:p>
+            <w:pPr>
+              <w:spacing w:line="260" w:lineRule="auto"/>
+            </w:pPr>
+            <w:r>
+              <w:t xml:space="preserve">Wenn nach Interrupts gefragt wird: erst Gegensatz zu Polling </w:t>
+            </w:r>
+            <w:proofErr w:type="spellStart"/>
+            <w:r>
+              <w:t>erklären</w:t>
+            </w:r>
+            <w:proofErr w:type="spellEnd"/>
+            <w:r>
+              <w:t xml:space="preserve">, dann ISR nennen und zum Schluss </w:t>
+            </w:r>
+            <w:proofErr w:type="spellStart"/>
+            <w:r>
+              <w:t>erwähnen</w:t>
+            </w:r>
+            <w:proofErr w:type="spellEnd"/>
+            <w:r>
+              <w:t xml:space="preserve">, dass moderne Systeme </w:t>
+            </w:r>
+            <w:proofErr w:type="spellStart"/>
+            <w:r>
+              <w:t>Prioritäten</w:t>
+            </w:r>
+            <w:proofErr w:type="spellEnd"/>
+            <w:r>
+              <w:t xml:space="preserve"> und Maskierung nutzen.</w:t>
+            </w:r>
+          </w:p>
+        </w:tc>
+      </w:tr>
+    </w:tbl>
+    <w:p/>
+    <w:p>
+      <w:pPr>
+        <w:pStyle w:val="berschrift2"/>
+      </w:pPr>
+      <w:bookmarkStart w:id="8" w:name="_Toc232080255"/>
+    </w:p>
+    <w:p>
+      <w:pPr>
+        <w:pStyle w:val="berschrift2"/>
+      </w:pPr>
+      <w:r>
+        <w:t>6. Speicherverwaltung</w:t>
+      </w:r>
+      <w:bookmarkEnd w:id="8"/>
+    </w:p>
+    <w:p/>
+    <w:tbl>
+      <w:tblPr>
+        <w:tblW w:w="9638" w:type="dxa"/>
+        <w:tblBorders>
+          <w:top w:val="single" w:sz="4" w:space="0" w:color="auto"/>
+          <w:left w:val="single" w:sz="4" w:space="0" w:color="auto"/>
+          <w:bottom w:val="single" w:sz="4" w:space="0" w:color="auto"/>
+          <w:right w:val="single" w:sz="4" w:space="0" w:color="auto"/>
+          <w:insideH w:val="single" w:sz="4" w:space="0" w:color="auto"/>
+          <w:insideV w:val="single" w:sz="4" w:space="0" w:color="auto"/>
+        </w:tblBorders>
+        <w:tblLayout w:type="fixed"/>
+        <w:tblCellMar>
+          <w:left w:w="10" w:type="dxa"/>
+          <w:right w:w="10" w:type="dxa"/>
+        </w:tblCellMar>
+        <w:tblLook w:val="0000" w:firstRow="0" w:lastRow="0" w:firstColumn="0" w:lastColumn="0" w:noHBand="0" w:noVBand="0"/>
+      </w:tblPr>
+      <w:tblGrid>
+        <w:gridCol w:w="2800"/>
+        <w:gridCol w:w="6838"/>
+      </w:tblGrid>
+      <w:tr>
+        <w:tblPrEx>
+          <w:tblCellMar>
+            <w:top w:w="0" w:type="dxa"/>
+            <w:bottom w:w="0" w:type="dxa"/>
+          </w:tblCellMar>
+        </w:tblPrEx>
+        <w:trPr>
+          <w:tblHeader/>
+        </w:trPr>
+        <w:tc>
+          <w:tcPr>
+            <w:tcW w:w="2800" w:type="dxa"/>
+            <w:tcBorders>
+              <w:top w:val="single" w:sz="2" w:space="0" w:color="C7D2DD"/>
+              <w:left w:val="single" w:sz="2" w:space="0" w:color="C7D2DD"/>
+              <w:bottom w:val="single" w:sz="2" w:space="0" w:color="C7D2DD"/>
+              <w:right w:val="single" w:sz="2" w:space="0" w:color="C7D2DD"/>
+            </w:tcBorders>
+            <w:shd w:val="clear" w:color="auto" w:fill="2E75B6"/>
+            <w:tcMar>
+              <w:top w:w="60" w:type="dxa"/>
+              <w:left w:w="110" w:type="dxa"/>
+              <w:bottom w:w="60" w:type="dxa"/>
+              <w:right w:w="110" w:type="dxa"/>
+            </w:tcMar>
+            <w:vAlign w:val="center"/>
+          </w:tcPr>
+          <w:p>
+            <w:pPr>
+              <w:spacing w:line="248" w:lineRule="auto"/>
+            </w:pPr>
+            <w:r>
+              <w:rPr>
+                <w:b/>
+                <w:bCs/>
+                <w:color w:val="FFFFFF"/>
+                <w:sz w:val="20"/>
+                <w:szCs w:val="20"/>
+              </w:rPr>
+              <w:t>Speicherart</w:t>
+            </w:r>
+          </w:p>
+        </w:tc>
+        <w:tc>
+          <w:tcPr>
+            <w:tcW w:w="6838" w:type="dxa"/>
+            <w:tcBorders>
+              <w:top w:val="single" w:sz="2" w:space="0" w:color="C7D2DD"/>
+              <w:left w:val="single" w:sz="2" w:space="0" w:color="C7D2DD"/>
+              <w:bottom w:val="single" w:sz="2" w:space="0" w:color="C7D2DD"/>
+              <w:right w:val="single" w:sz="2" w:space="0" w:color="C7D2DD"/>
+            </w:tcBorders>
+            <w:shd w:val="clear" w:color="auto" w:fill="2E75B6"/>
+            <w:tcMar>
+              <w:top w:w="60" w:type="dxa"/>
+              <w:left w:w="110" w:type="dxa"/>
+              <w:bottom w:w="60" w:type="dxa"/>
+              <w:right w:w="110" w:type="dxa"/>
+            </w:tcMar>
+            <w:vAlign w:val="center"/>
+          </w:tcPr>
+          <w:p>
+            <w:pPr>
+              <w:spacing w:line="248" w:lineRule="auto"/>
+            </w:pPr>
+            <w:r>
+              <w:rPr>
+                <w:b/>
+                <w:bCs/>
+                <w:color w:val="FFFFFF"/>
+                <w:sz w:val="20"/>
+                <w:szCs w:val="20"/>
+              </w:rPr>
+              <w:t>Eigenschaft</w:t>
+            </w:r>
+          </w:p>
+        </w:tc>
+      </w:tr>
+      <w:tr>
+        <w:tblPrEx>
+          <w:tblCellMar>
+            <w:top w:w="0" w:type="dxa"/>
+            <w:bottom w:w="0" w:type="dxa"/>
+          </w:tblCellMar>
+        </w:tblPrEx>
+        <w:tc>
+          <w:tcPr>
+            <w:tcW w:w="2800" w:type="dxa"/>
+            <w:tcBorders>
+              <w:top w:val="single" w:sz="2" w:space="0" w:color="C7D2DD"/>
+              <w:left w:val="single" w:sz="2" w:space="0" w:color="C7D2DD"/>
+              <w:bottom w:val="single" w:sz="2" w:space="0" w:color="C7D2DD"/>
+              <w:right w:val="single" w:sz="2" w:space="0" w:color="C7D2DD"/>
+            </w:tcBorders>
+            <w:shd w:val="clear" w:color="auto" w:fill="FFFFFF"/>
+            <w:tcMar>
+              <w:top w:w="60" w:type="dxa"/>
+              <w:left w:w="110" w:type="dxa"/>
+              <w:bottom w:w="60" w:type="dxa"/>
+              <w:right w:w="110" w:type="dxa"/>
+            </w:tcMar>
+            <w:vAlign w:val="center"/>
+          </w:tcPr>
+          <w:p>
+            <w:pPr>
+              <w:spacing w:line="248" w:lineRule="auto"/>
+            </w:pPr>
+            <w:r>
+              <w:rPr>
+                <w:sz w:val="20"/>
+                <w:szCs w:val="20"/>
+              </w:rPr>
+              <w:t>Register/Cache</w:t>
+            </w:r>
+          </w:p>
+        </w:tc>
+        <w:tc>
+          <w:tcPr>
+            <w:tcW w:w="6838" w:type="dxa"/>
+            <w:tcBorders>
+              <w:top w:val="single" w:sz="2" w:space="0" w:color="C7D2DD"/>
+              <w:left w:val="single" w:sz="2" w:space="0" w:color="C7D2DD"/>
+              <w:bottom w:val="single" w:sz="2" w:space="0" w:color="C7D2DD"/>
+              <w:right w:val="single" w:sz="2" w:space="0" w:color="C7D2DD"/>
+            </w:tcBorders>
+            <w:shd w:val="clear" w:color="auto" w:fill="FFFFFF"/>
+            <w:tcMar>
+              <w:top w:w="60" w:type="dxa"/>
+              <w:left w:w="110" w:type="dxa"/>
+              <w:bottom w:w="60" w:type="dxa"/>
+              <w:right w:w="110" w:type="dxa"/>
+            </w:tcMar>
+            <w:vAlign w:val="center"/>
+          </w:tcPr>
+          <w:p>
+            <w:pPr>
+              <w:spacing w:line="248" w:lineRule="auto"/>
+            </w:pPr>
+            <w:r>
+              <w:rPr>
+                <w:sz w:val="20"/>
+                <w:szCs w:val="20"/>
+              </w:rPr>
+              <w:t>Sehr schnell, klein und teuer. Cache gleicht Geschwindigkeit zwischen CPU und RAM an.</w:t>
+            </w:r>
+          </w:p>
+        </w:tc>
+      </w:tr>
+      <w:tr>
+        <w:tblPrEx>
+          <w:tblCellMar>
+            <w:top w:w="0" w:type="dxa"/>
+            <w:bottom w:w="0" w:type="dxa"/>
+          </w:tblCellMar>
+        </w:tblPrEx>
+        <w:tc>
+          <w:tcPr>
+            <w:tcW w:w="2800" w:type="dxa"/>
+            <w:tcBorders>
+              <w:top w:val="single" w:sz="2" w:space="0" w:color="C7D2DD"/>
+              <w:left w:val="single" w:sz="2" w:space="0" w:color="C7D2DD"/>
+              <w:bottom w:val="single" w:sz="2" w:space="0" w:color="C7D2DD"/>
+              <w:right w:val="single" w:sz="2" w:space="0" w:color="C7D2DD"/>
+            </w:tcBorders>
+            <w:shd w:val="clear" w:color="auto" w:fill="EAF1F8"/>
+            <w:tcMar>
+              <w:top w:w="60" w:type="dxa"/>
+              <w:left w:w="110" w:type="dxa"/>
+              <w:bottom w:w="60" w:type="dxa"/>
+              <w:right w:w="110" w:type="dxa"/>
+            </w:tcMar>
+            <w:vAlign w:val="center"/>
+          </w:tcPr>
+          <w:p>
+            <w:pPr>
+              <w:spacing w:line="248" w:lineRule="auto"/>
+            </w:pPr>
+            <w:r>
+              <w:rPr>
+                <w:sz w:val="20"/>
+                <w:szCs w:val="20"/>
+              </w:rPr>
+              <w:t>Hauptspeicher/RAM</w:t>
+            </w:r>
+          </w:p>
+        </w:tc>
+        <w:tc>
+          <w:tcPr>
+            <w:tcW w:w="6838" w:type="dxa"/>
+            <w:tcBorders>
+              <w:top w:val="single" w:sz="2" w:space="0" w:color="C7D2DD"/>
+              <w:left w:val="single" w:sz="2" w:space="0" w:color="C7D2DD"/>
+              <w:bottom w:val="single" w:sz="2" w:space="0" w:color="C7D2DD"/>
+              <w:right w:val="single" w:sz="2" w:space="0" w:color="C7D2DD"/>
+            </w:tcBorders>
+            <w:shd w:val="clear" w:color="auto" w:fill="EAF1F8"/>
+            <w:tcMar>
+              <w:top w:w="60" w:type="dxa"/>
+              <w:left w:w="110" w:type="dxa"/>
+              <w:bottom w:w="60" w:type="dxa"/>
+              <w:right w:w="110" w:type="dxa"/>
+            </w:tcMar>
+            <w:vAlign w:val="center"/>
+          </w:tcPr>
+          <w:p>
+            <w:pPr>
+              <w:spacing w:line="248" w:lineRule="auto"/>
+            </w:pPr>
+            <w:r>
+              <w:rPr>
+                <w:sz w:val="20"/>
+                <w:szCs w:val="20"/>
+              </w:rPr>
+              <w:t xml:space="preserve">Direkt adressierbarer Arbeitsspeicher, </w:t>
+            </w:r>
+            <w:proofErr w:type="spellStart"/>
+            <w:r>
+              <w:rPr>
+                <w:sz w:val="20"/>
+                <w:szCs w:val="20"/>
+              </w:rPr>
+              <w:t>flüchtig</w:t>
+            </w:r>
+            <w:proofErr w:type="spellEnd"/>
+            <w:r>
+              <w:rPr>
+                <w:sz w:val="20"/>
+                <w:szCs w:val="20"/>
+              </w:rPr>
+              <w:t>.</w:t>
+            </w:r>
+          </w:p>
+        </w:tc>
+      </w:tr>
+      <w:tr>
+        <w:tblPrEx>
+          <w:tblCellMar>
+            <w:top w:w="0" w:type="dxa"/>
+            <w:bottom w:w="0" w:type="dxa"/>
+          </w:tblCellMar>
+        </w:tblPrEx>
+        <w:tc>
+          <w:tcPr>
+            <w:tcW w:w="2800" w:type="dxa"/>
+            <w:tcBorders>
+              <w:top w:val="single" w:sz="2" w:space="0" w:color="C7D2DD"/>
+              <w:left w:val="single" w:sz="2" w:space="0" w:color="C7D2DD"/>
+              <w:bottom w:val="single" w:sz="2" w:space="0" w:color="C7D2DD"/>
+              <w:right w:val="single" w:sz="2" w:space="0" w:color="C7D2DD"/>
+            </w:tcBorders>
+            <w:shd w:val="clear" w:color="auto" w:fill="FFFFFF"/>
+            <w:tcMar>
+              <w:top w:w="60" w:type="dxa"/>
+              <w:left w:w="110" w:type="dxa"/>
+              <w:bottom w:w="60" w:type="dxa"/>
+              <w:right w:w="110" w:type="dxa"/>
+            </w:tcMar>
+            <w:vAlign w:val="center"/>
+          </w:tcPr>
+          <w:p>
+            <w:pPr>
+              <w:spacing w:line="248" w:lineRule="auto"/>
+            </w:pPr>
+            <w:proofErr w:type="spellStart"/>
+            <w:r>
+              <w:rPr>
+                <w:sz w:val="20"/>
+                <w:szCs w:val="20"/>
+              </w:rPr>
+              <w:t>Sekundärspeicher</w:t>
+            </w:r>
+            <w:proofErr w:type="spellEnd"/>
+          </w:p>
+        </w:tc>
+        <w:tc>
+          <w:tcPr>
+            <w:tcW w:w="6838" w:type="dxa"/>
+            <w:tcBorders>
+              <w:top w:val="single" w:sz="2" w:space="0" w:color="C7D2DD"/>
+              <w:left w:val="single" w:sz="2" w:space="0" w:color="C7D2DD"/>
+              <w:bottom w:val="single" w:sz="2" w:space="0" w:color="C7D2DD"/>
+              <w:right w:val="single" w:sz="2" w:space="0" w:color="C7D2DD"/>
+            </w:tcBorders>
+            <w:shd w:val="clear" w:color="auto" w:fill="FFFFFF"/>
+            <w:tcMar>
+              <w:top w:w="60" w:type="dxa"/>
+              <w:left w:w="110" w:type="dxa"/>
+              <w:bottom w:w="60" w:type="dxa"/>
+              <w:right w:w="110" w:type="dxa"/>
+            </w:tcMar>
+            <w:vAlign w:val="center"/>
+          </w:tcPr>
+          <w:p>
+            <w:pPr>
+              <w:spacing w:line="248" w:lineRule="auto"/>
+            </w:pPr>
+            <w:r>
+              <w:rPr>
+                <w:sz w:val="20"/>
+                <w:szCs w:val="20"/>
+              </w:rPr>
+              <w:t xml:space="preserve">SSD/HDD; langsamer, aber dauerhaft und </w:t>
+            </w:r>
+            <w:proofErr w:type="spellStart"/>
+            <w:r>
+              <w:rPr>
+                <w:sz w:val="20"/>
+                <w:szCs w:val="20"/>
+              </w:rPr>
+              <w:t>gross</w:t>
+            </w:r>
+            <w:proofErr w:type="spellEnd"/>
+            <w:r>
+              <w:rPr>
+                <w:sz w:val="20"/>
+                <w:szCs w:val="20"/>
+              </w:rPr>
+              <w:t>.</w:t>
+            </w:r>
+          </w:p>
+        </w:tc>
+      </w:tr>
+      <w:tr>
+        <w:tblPrEx>
+          <w:tblCellMar>
+            <w:top w:w="0" w:type="dxa"/>
+            <w:bottom w:w="0" w:type="dxa"/>
+          </w:tblCellMar>
+        </w:tblPrEx>
+        <w:tc>
+          <w:tcPr>
+            <w:tcW w:w="2800" w:type="dxa"/>
+            <w:tcBorders>
+              <w:top w:val="single" w:sz="2" w:space="0" w:color="C7D2DD"/>
+              <w:left w:val="single" w:sz="2" w:space="0" w:color="C7D2DD"/>
+              <w:bottom w:val="single" w:sz="2" w:space="0" w:color="C7D2DD"/>
+              <w:right w:val="single" w:sz="2" w:space="0" w:color="C7D2DD"/>
+            </w:tcBorders>
+            <w:shd w:val="clear" w:color="auto" w:fill="EAF1F8"/>
+            <w:tcMar>
+              <w:top w:w="60" w:type="dxa"/>
+              <w:left w:w="110" w:type="dxa"/>
+              <w:bottom w:w="60" w:type="dxa"/>
+              <w:right w:w="110" w:type="dxa"/>
+            </w:tcMar>
+            <w:vAlign w:val="center"/>
+          </w:tcPr>
+          <w:p>
+            <w:pPr>
+              <w:spacing w:line="248" w:lineRule="auto"/>
+            </w:pPr>
+            <w:r>
+              <w:rPr>
+                <w:sz w:val="20"/>
+                <w:szCs w:val="20"/>
+              </w:rPr>
+              <w:t>Archiv-/Backup-Speicher</w:t>
+            </w:r>
+          </w:p>
+        </w:tc>
+        <w:tc>
+          <w:tcPr>
+            <w:tcW w:w="6838" w:type="dxa"/>
+            <w:tcBorders>
+              <w:top w:val="single" w:sz="2" w:space="0" w:color="C7D2DD"/>
+              <w:left w:val="single" w:sz="2" w:space="0" w:color="C7D2DD"/>
+              <w:bottom w:val="single" w:sz="2" w:space="0" w:color="C7D2DD"/>
+              <w:right w:val="single" w:sz="2" w:space="0" w:color="C7D2DD"/>
+            </w:tcBorders>
+            <w:shd w:val="clear" w:color="auto" w:fill="EAF1F8"/>
+            <w:tcMar>
+              <w:top w:w="60" w:type="dxa"/>
+              <w:left w:w="110" w:type="dxa"/>
+              <w:bottom w:w="60" w:type="dxa"/>
+              <w:right w:w="110" w:type="dxa"/>
+            </w:tcMar>
+            <w:vAlign w:val="center"/>
+          </w:tcPr>
+          <w:p>
+            <w:pPr>
+              <w:spacing w:line="248" w:lineRule="auto"/>
+            </w:pPr>
+            <w:r>
+              <w:rPr>
+                <w:sz w:val="20"/>
+                <w:szCs w:val="20"/>
+              </w:rPr>
+              <w:t xml:space="preserve">Dient Sicherung und Wiederherstellung, nicht laufender </w:t>
+            </w:r>
+            <w:proofErr w:type="spellStart"/>
+            <w:r>
+              <w:rPr>
+                <w:sz w:val="20"/>
+                <w:szCs w:val="20"/>
+              </w:rPr>
+              <w:t>Programmausführung</w:t>
+            </w:r>
+            <w:proofErr w:type="spellEnd"/>
+            <w:r>
+              <w:rPr>
+                <w:sz w:val="20"/>
+                <w:szCs w:val="20"/>
+              </w:rPr>
+              <w:t>.</w:t>
+            </w:r>
+          </w:p>
+        </w:tc>
+      </w:tr>
+    </w:tbl>
+    <w:p/>
+    <w:p>
+      <w:pPr>
+        <w:spacing w:after="120" w:line="264" w:lineRule="auto"/>
+      </w:pPr>
+      <w:r>
+        <w:t xml:space="preserve">Prozesse arbeiten mit logischen Adressen. Die Memory Management Unit (MMU) </w:t>
+      </w:r>
+      <w:proofErr w:type="spellStart"/>
+      <w:r>
+        <w:t>übersetzt</w:t>
+      </w:r>
+      <w:proofErr w:type="spellEnd"/>
+      <w:r>
+        <w:t xml:space="preserve"> diese zur Laufzeit in physikalische Adressen im Hauptspeicher.</w:t>
+      </w:r>
+    </w:p>
+    <w:p>
+      <w:r>
+        <w:br w:type="page"/>
       </w:r>
     </w:p>
     <w:tbl>
@@ -9708,1990 +11706,6 @@
                 <w:sz w:val="20"/>
                 <w:szCs w:val="20"/>
               </w:rPr>
-              <w:t>Deadlock-Bedingung</w:t>
-            </w:r>
-          </w:p>
-        </w:tc>
-        <w:tc>
-          <w:tcPr>
-            <w:tcW w:w="6838" w:type="dxa"/>
-            <w:tcBorders>
-              <w:top w:val="single" w:sz="2" w:space="0" w:color="C7D2DD"/>
-              <w:left w:val="single" w:sz="2" w:space="0" w:color="C7D2DD"/>
-              <w:bottom w:val="single" w:sz="2" w:space="0" w:color="C7D2DD"/>
-              <w:right w:val="single" w:sz="2" w:space="0" w:color="C7D2DD"/>
-            </w:tcBorders>
-            <w:shd w:val="clear" w:color="auto" w:fill="2E75B6"/>
-            <w:tcMar>
-              <w:top w:w="60" w:type="dxa"/>
-              <w:left w:w="110" w:type="dxa"/>
-              <w:bottom w:w="60" w:type="dxa"/>
-              <w:right w:w="110" w:type="dxa"/>
-            </w:tcMar>
-            <w:vAlign w:val="center"/>
-          </w:tcPr>
-          <w:p>
-            <w:pPr>
-              <w:spacing w:line="248" w:lineRule="auto"/>
-            </w:pPr>
-            <w:r>
-              <w:rPr>
-                <w:b/>
-                <w:bCs/>
-                <w:color w:val="FFFFFF"/>
-                <w:sz w:val="20"/>
-                <w:szCs w:val="20"/>
-              </w:rPr>
-              <w:t>Bedeutung</w:t>
-            </w:r>
-          </w:p>
-        </w:tc>
-      </w:tr>
-      <w:tr>
-        <w:tblPrEx>
-          <w:tblCellMar>
-            <w:top w:w="0" w:type="dxa"/>
-            <w:bottom w:w="0" w:type="dxa"/>
-          </w:tblCellMar>
-        </w:tblPrEx>
-        <w:trPr>
-          <w:gridAfter w:val="1"/>
-          <w:wAfter w:w="27" w:type="dxa"/>
-        </w:trPr>
-        <w:tc>
-          <w:tcPr>
-            <w:tcW w:w="2800" w:type="dxa"/>
-            <w:gridSpan w:val="2"/>
-            <w:tcBorders>
-              <w:top w:val="single" w:sz="2" w:space="0" w:color="C7D2DD"/>
-              <w:left w:val="single" w:sz="2" w:space="0" w:color="C7D2DD"/>
-              <w:bottom w:val="single" w:sz="2" w:space="0" w:color="C7D2DD"/>
-              <w:right w:val="single" w:sz="2" w:space="0" w:color="C7D2DD"/>
-            </w:tcBorders>
-            <w:shd w:val="clear" w:color="auto" w:fill="FFFFFF"/>
-            <w:tcMar>
-              <w:top w:w="60" w:type="dxa"/>
-              <w:left w:w="110" w:type="dxa"/>
-              <w:bottom w:w="60" w:type="dxa"/>
-              <w:right w:w="110" w:type="dxa"/>
-            </w:tcMar>
-            <w:vAlign w:val="center"/>
-          </w:tcPr>
-          <w:p>
-            <w:pPr>
-              <w:spacing w:line="248" w:lineRule="auto"/>
-            </w:pPr>
-            <w:r>
-              <w:rPr>
-                <w:sz w:val="20"/>
-                <w:szCs w:val="20"/>
-              </w:rPr>
-              <w:t xml:space="preserve">Mutual </w:t>
-            </w:r>
-            <w:proofErr w:type="spellStart"/>
-            <w:r>
-              <w:rPr>
-                <w:sz w:val="20"/>
-                <w:szCs w:val="20"/>
-              </w:rPr>
-              <w:t>Exclusion</w:t>
-            </w:r>
-            <w:proofErr w:type="spellEnd"/>
-          </w:p>
-        </w:tc>
-        <w:tc>
-          <w:tcPr>
-            <w:tcW w:w="6838" w:type="dxa"/>
-            <w:tcBorders>
-              <w:top w:val="single" w:sz="2" w:space="0" w:color="C7D2DD"/>
-              <w:left w:val="single" w:sz="2" w:space="0" w:color="C7D2DD"/>
-              <w:bottom w:val="single" w:sz="2" w:space="0" w:color="C7D2DD"/>
-              <w:right w:val="single" w:sz="2" w:space="0" w:color="C7D2DD"/>
-            </w:tcBorders>
-            <w:shd w:val="clear" w:color="auto" w:fill="FFFFFF"/>
-            <w:tcMar>
-              <w:top w:w="60" w:type="dxa"/>
-              <w:left w:w="110" w:type="dxa"/>
-              <w:bottom w:w="60" w:type="dxa"/>
-              <w:right w:w="110" w:type="dxa"/>
-            </w:tcMar>
-            <w:vAlign w:val="center"/>
-          </w:tcPr>
-          <w:p>
-            <w:pPr>
-              <w:spacing w:line="248" w:lineRule="auto"/>
-            </w:pPr>
-            <w:r>
-              <w:rPr>
-                <w:sz w:val="20"/>
-                <w:szCs w:val="20"/>
-              </w:rPr>
-              <w:t>Eine Ressource kann nicht gleichzeitig von mehreren Prozessen genutzt werden.</w:t>
-            </w:r>
-          </w:p>
-        </w:tc>
-      </w:tr>
-      <w:tr>
-        <w:tblPrEx>
-          <w:tblCellMar>
-            <w:top w:w="0" w:type="dxa"/>
-            <w:bottom w:w="0" w:type="dxa"/>
-          </w:tblCellMar>
-        </w:tblPrEx>
-        <w:trPr>
-          <w:gridAfter w:val="1"/>
-          <w:wAfter w:w="27" w:type="dxa"/>
-        </w:trPr>
-        <w:tc>
-          <w:tcPr>
-            <w:tcW w:w="2800" w:type="dxa"/>
-            <w:gridSpan w:val="2"/>
-            <w:tcBorders>
-              <w:top w:val="single" w:sz="2" w:space="0" w:color="C7D2DD"/>
-              <w:left w:val="single" w:sz="2" w:space="0" w:color="C7D2DD"/>
-              <w:bottom w:val="single" w:sz="2" w:space="0" w:color="C7D2DD"/>
-              <w:right w:val="single" w:sz="2" w:space="0" w:color="C7D2DD"/>
-            </w:tcBorders>
-            <w:shd w:val="clear" w:color="auto" w:fill="EAF1F8"/>
-            <w:tcMar>
-              <w:top w:w="60" w:type="dxa"/>
-              <w:left w:w="110" w:type="dxa"/>
-              <w:bottom w:w="60" w:type="dxa"/>
-              <w:right w:w="110" w:type="dxa"/>
-            </w:tcMar>
-            <w:vAlign w:val="center"/>
-          </w:tcPr>
-          <w:p>
-            <w:pPr>
-              <w:spacing w:line="248" w:lineRule="auto"/>
-            </w:pPr>
-            <w:r>
-              <w:rPr>
-                <w:sz w:val="20"/>
-                <w:szCs w:val="20"/>
-              </w:rPr>
-              <w:t>Hold and Wait</w:t>
-            </w:r>
-          </w:p>
-        </w:tc>
-        <w:tc>
-          <w:tcPr>
-            <w:tcW w:w="6838" w:type="dxa"/>
-            <w:tcBorders>
-              <w:top w:val="single" w:sz="2" w:space="0" w:color="C7D2DD"/>
-              <w:left w:val="single" w:sz="2" w:space="0" w:color="C7D2DD"/>
-              <w:bottom w:val="single" w:sz="2" w:space="0" w:color="C7D2DD"/>
-              <w:right w:val="single" w:sz="2" w:space="0" w:color="C7D2DD"/>
-            </w:tcBorders>
-            <w:shd w:val="clear" w:color="auto" w:fill="EAF1F8"/>
-            <w:tcMar>
-              <w:top w:w="60" w:type="dxa"/>
-              <w:left w:w="110" w:type="dxa"/>
-              <w:bottom w:w="60" w:type="dxa"/>
-              <w:right w:w="110" w:type="dxa"/>
-            </w:tcMar>
-            <w:vAlign w:val="center"/>
-          </w:tcPr>
-          <w:p>
-            <w:pPr>
-              <w:spacing w:line="248" w:lineRule="auto"/>
-            </w:pPr>
-            <w:r>
-              <w:rPr>
-                <w:sz w:val="20"/>
-                <w:szCs w:val="20"/>
-              </w:rPr>
-              <w:t xml:space="preserve">Ein Prozess </w:t>
-            </w:r>
-            <w:proofErr w:type="spellStart"/>
-            <w:r>
-              <w:rPr>
-                <w:sz w:val="20"/>
-                <w:szCs w:val="20"/>
-              </w:rPr>
-              <w:t>hält</w:t>
-            </w:r>
-            <w:proofErr w:type="spellEnd"/>
-            <w:r>
-              <w:rPr>
-                <w:sz w:val="20"/>
-                <w:szCs w:val="20"/>
-              </w:rPr>
-              <w:t xml:space="preserve"> Ressourcen und wartet gleichzeitig auf weitere.</w:t>
-            </w:r>
-          </w:p>
-        </w:tc>
-      </w:tr>
-      <w:tr>
-        <w:tblPrEx>
-          <w:tblCellMar>
-            <w:top w:w="0" w:type="dxa"/>
-            <w:bottom w:w="0" w:type="dxa"/>
-          </w:tblCellMar>
-        </w:tblPrEx>
-        <w:trPr>
-          <w:gridAfter w:val="1"/>
-          <w:wAfter w:w="27" w:type="dxa"/>
-        </w:trPr>
-        <w:tc>
-          <w:tcPr>
-            <w:tcW w:w="2800" w:type="dxa"/>
-            <w:gridSpan w:val="2"/>
-            <w:tcBorders>
-              <w:top w:val="single" w:sz="2" w:space="0" w:color="C7D2DD"/>
-              <w:left w:val="single" w:sz="2" w:space="0" w:color="C7D2DD"/>
-              <w:bottom w:val="single" w:sz="2" w:space="0" w:color="C7D2DD"/>
-              <w:right w:val="single" w:sz="2" w:space="0" w:color="C7D2DD"/>
-            </w:tcBorders>
-            <w:shd w:val="clear" w:color="auto" w:fill="FFFFFF"/>
-            <w:tcMar>
-              <w:top w:w="60" w:type="dxa"/>
-              <w:left w:w="110" w:type="dxa"/>
-              <w:bottom w:w="60" w:type="dxa"/>
-              <w:right w:w="110" w:type="dxa"/>
-            </w:tcMar>
-            <w:vAlign w:val="center"/>
-          </w:tcPr>
-          <w:p>
-            <w:pPr>
-              <w:spacing w:line="248" w:lineRule="auto"/>
-            </w:pPr>
-            <w:proofErr w:type="spellStart"/>
-            <w:r>
-              <w:rPr>
-                <w:sz w:val="20"/>
-                <w:szCs w:val="20"/>
-              </w:rPr>
-              <w:t>No</w:t>
-            </w:r>
-            <w:proofErr w:type="spellEnd"/>
-            <w:r>
-              <w:rPr>
-                <w:sz w:val="20"/>
-                <w:szCs w:val="20"/>
-              </w:rPr>
-              <w:t xml:space="preserve"> </w:t>
-            </w:r>
-            <w:proofErr w:type="spellStart"/>
-            <w:r>
-              <w:rPr>
-                <w:sz w:val="20"/>
-                <w:szCs w:val="20"/>
-              </w:rPr>
-              <w:t>Preemption</w:t>
-            </w:r>
-            <w:proofErr w:type="spellEnd"/>
-          </w:p>
-        </w:tc>
-        <w:tc>
-          <w:tcPr>
-            <w:tcW w:w="6838" w:type="dxa"/>
-            <w:tcBorders>
-              <w:top w:val="single" w:sz="2" w:space="0" w:color="C7D2DD"/>
-              <w:left w:val="single" w:sz="2" w:space="0" w:color="C7D2DD"/>
-              <w:bottom w:val="single" w:sz="2" w:space="0" w:color="C7D2DD"/>
-              <w:right w:val="single" w:sz="2" w:space="0" w:color="C7D2DD"/>
-            </w:tcBorders>
-            <w:shd w:val="clear" w:color="auto" w:fill="FFFFFF"/>
-            <w:tcMar>
-              <w:top w:w="60" w:type="dxa"/>
-              <w:left w:w="110" w:type="dxa"/>
-              <w:bottom w:w="60" w:type="dxa"/>
-              <w:right w:w="110" w:type="dxa"/>
-            </w:tcMar>
-            <w:vAlign w:val="center"/>
-          </w:tcPr>
-          <w:p>
-            <w:pPr>
-              <w:spacing w:line="248" w:lineRule="auto"/>
-            </w:pPr>
-            <w:r>
-              <w:rPr>
-                <w:sz w:val="20"/>
-                <w:szCs w:val="20"/>
-              </w:rPr>
-              <w:t xml:space="preserve">Ressourcen </w:t>
-            </w:r>
-            <w:proofErr w:type="spellStart"/>
-            <w:r>
-              <w:rPr>
-                <w:sz w:val="20"/>
-                <w:szCs w:val="20"/>
-              </w:rPr>
-              <w:t>können</w:t>
-            </w:r>
-            <w:proofErr w:type="spellEnd"/>
-            <w:r>
-              <w:rPr>
-                <w:sz w:val="20"/>
-                <w:szCs w:val="20"/>
-              </w:rPr>
-              <w:t xml:space="preserve"> nicht zwangsweise entzogen werden.</w:t>
-            </w:r>
-          </w:p>
-        </w:tc>
-      </w:tr>
-      <w:tr>
-        <w:tblPrEx>
-          <w:tblCellMar>
-            <w:top w:w="0" w:type="dxa"/>
-            <w:bottom w:w="0" w:type="dxa"/>
-          </w:tblCellMar>
-        </w:tblPrEx>
-        <w:trPr>
-          <w:gridAfter w:val="1"/>
-          <w:wAfter w:w="27" w:type="dxa"/>
-        </w:trPr>
-        <w:tc>
-          <w:tcPr>
-            <w:tcW w:w="2800" w:type="dxa"/>
-            <w:gridSpan w:val="2"/>
-            <w:tcBorders>
-              <w:top w:val="single" w:sz="2" w:space="0" w:color="C7D2DD"/>
-              <w:left w:val="single" w:sz="2" w:space="0" w:color="C7D2DD"/>
-              <w:bottom w:val="single" w:sz="2" w:space="0" w:color="C7D2DD"/>
-              <w:right w:val="single" w:sz="2" w:space="0" w:color="C7D2DD"/>
-            </w:tcBorders>
-            <w:shd w:val="clear" w:color="auto" w:fill="EAF1F8"/>
-            <w:tcMar>
-              <w:top w:w="60" w:type="dxa"/>
-              <w:left w:w="110" w:type="dxa"/>
-              <w:bottom w:w="60" w:type="dxa"/>
-              <w:right w:w="110" w:type="dxa"/>
-            </w:tcMar>
-            <w:vAlign w:val="center"/>
-          </w:tcPr>
-          <w:p>
-            <w:pPr>
-              <w:spacing w:line="248" w:lineRule="auto"/>
-            </w:pPr>
-            <w:proofErr w:type="spellStart"/>
-            <w:r>
-              <w:rPr>
-                <w:sz w:val="20"/>
-                <w:szCs w:val="20"/>
-              </w:rPr>
-              <w:t>Circular</w:t>
-            </w:r>
-            <w:proofErr w:type="spellEnd"/>
-            <w:r>
-              <w:rPr>
-                <w:sz w:val="20"/>
-                <w:szCs w:val="20"/>
-              </w:rPr>
-              <w:t xml:space="preserve"> Wait</w:t>
-            </w:r>
-          </w:p>
-        </w:tc>
-        <w:tc>
-          <w:tcPr>
-            <w:tcW w:w="6838" w:type="dxa"/>
-            <w:tcBorders>
-              <w:top w:val="single" w:sz="2" w:space="0" w:color="C7D2DD"/>
-              <w:left w:val="single" w:sz="2" w:space="0" w:color="C7D2DD"/>
-              <w:bottom w:val="single" w:sz="2" w:space="0" w:color="C7D2DD"/>
-              <w:right w:val="single" w:sz="2" w:space="0" w:color="C7D2DD"/>
-            </w:tcBorders>
-            <w:shd w:val="clear" w:color="auto" w:fill="EAF1F8"/>
-            <w:tcMar>
-              <w:top w:w="60" w:type="dxa"/>
-              <w:left w:w="110" w:type="dxa"/>
-              <w:bottom w:w="60" w:type="dxa"/>
-              <w:right w:w="110" w:type="dxa"/>
-            </w:tcMar>
-            <w:vAlign w:val="center"/>
-          </w:tcPr>
-          <w:p>
-            <w:pPr>
-              <w:spacing w:line="248" w:lineRule="auto"/>
-            </w:pPr>
-            <w:r>
-              <w:rPr>
-                <w:sz w:val="20"/>
-                <w:szCs w:val="20"/>
-              </w:rPr>
-              <w:t>Es existiert eine geschlossene Warteschleife.</w:t>
-            </w:r>
-          </w:p>
-        </w:tc>
-      </w:tr>
-      <w:tr>
-        <w:tblPrEx>
-          <w:tblCellMar>
-            <w:top w:w="0" w:type="dxa"/>
-            <w:bottom w:w="0" w:type="dxa"/>
-          </w:tblCellMar>
-        </w:tblPrEx>
-        <w:trPr>
-          <w:gridBefore w:val="1"/>
-          <w:wBefore w:w="27" w:type="dxa"/>
-        </w:trPr>
-        <w:tc>
-          <w:tcPr>
-            <w:tcW w:w="9638" w:type="dxa"/>
-            <w:gridSpan w:val="3"/>
-            <w:tcBorders>
-              <w:left w:val="single" w:sz="24" w:space="0" w:color="2E75B6"/>
-            </w:tcBorders>
-            <w:shd w:val="clear" w:color="auto" w:fill="EAF1F8"/>
-            <w:tcMar>
-              <w:top w:w="120" w:type="dxa"/>
-              <w:left w:w="200" w:type="dxa"/>
-              <w:bottom w:w="120" w:type="dxa"/>
-              <w:right w:w="160" w:type="dxa"/>
-            </w:tcMar>
-          </w:tcPr>
-          <w:p>
-            <w:pPr>
-              <w:spacing w:after="60" w:line="260" w:lineRule="auto"/>
-            </w:pPr>
-            <w:r>
-              <w:rPr>
-                <w:b/>
-                <w:bCs/>
-                <w:color w:val="2E75B6"/>
-              </w:rPr>
-              <w:t>Merksatz</w:t>
-            </w:r>
-          </w:p>
-          <w:p>
-            <w:pPr>
-              <w:spacing w:line="260" w:lineRule="auto"/>
-            </w:pPr>
-            <w:r>
-              <w:t xml:space="preserve">Um Deadlocks zu verhindern, muss mindestens eine der vier notwendigen Bedingungen ausgeschlossen werden. Tipp: </w:t>
-            </w:r>
-            <w:proofErr w:type="spellStart"/>
-            <w:r>
-              <w:t>zirkuläres</w:t>
-            </w:r>
-            <w:proofErr w:type="spellEnd"/>
-            <w:r>
-              <w:t xml:space="preserve"> Warten verhindern.</w:t>
-            </w:r>
-          </w:p>
-        </w:tc>
-      </w:tr>
-    </w:tbl>
-    <w:p/>
-    <w:p>
-      <w:pPr>
-        <w:spacing w:after="120" w:line="264" w:lineRule="auto"/>
-      </w:pPr>
-      <w:r>
-        <w:rPr>
-          <w:b/>
-          <w:bCs/>
-        </w:rPr>
-        <w:t xml:space="preserve">Erzeuger-Verbraucher-Problem: </w:t>
-      </w:r>
-      <w:r>
-        <w:t>Ein Erzeuger legt Daten in einen Puffer, ein Verbraucher entnimmt sie. Ist der Puffer voll, muss der Erzeuger warten; ist er leer, muss der Verbraucher warten.</w:t>
-      </w:r>
-    </w:p>
-    <w:p>
-      <w:r>
-        <w:br w:type="page"/>
-      </w:r>
-    </w:p>
-    <w:p>
-      <w:pPr>
-        <w:pStyle w:val="berschrift3"/>
-      </w:pPr>
-      <w:proofErr w:type="spellStart"/>
-      <w:r>
-        <w:t>Übungsfragen</w:t>
-      </w:r>
-      <w:proofErr w:type="spellEnd"/>
-    </w:p>
-    <w:p>
-      <w:pPr>
-        <w:spacing w:before="100" w:after="30" w:line="260" w:lineRule="auto"/>
-      </w:pPr>
-      <w:r>
-        <w:rPr>
-          <w:b/>
-          <w:bCs/>
-          <w:color w:val="2E75B6"/>
-        </w:rPr>
-        <w:t xml:space="preserve">Frage: </w:t>
-      </w:r>
-      <w:r>
-        <w:rPr>
-          <w:b/>
-          <w:bCs/>
-        </w:rPr>
-        <w:t>Was unterscheidet synchrone und asynchrone Kommunikation?</w:t>
-      </w:r>
-    </w:p>
-    <w:p>
-      <w:pPr>
-        <w:spacing w:after="120" w:line="260" w:lineRule="auto"/>
-      </w:pPr>
-      <w:r>
-        <w:rPr>
-          <w:b/>
-          <w:bCs/>
-          <w:color w:val="44546A"/>
-        </w:rPr>
-        <w:t xml:space="preserve">Antwort: </w:t>
-      </w:r>
-      <w:r>
-        <w:t xml:space="preserve">Bei synchroner Kommunikation wartet der Sender, bis der </w:t>
-      </w:r>
-      <w:proofErr w:type="spellStart"/>
-      <w:r>
-        <w:t>Empfänger</w:t>
-      </w:r>
-      <w:proofErr w:type="spellEnd"/>
-      <w:r>
-        <w:t xml:space="preserve"> bereit ist. Bei asynchroner Kommunikation sendet er und arbeitet sofort weiter; die Nachricht wird gepuffert.</w:t>
-      </w:r>
-    </w:p>
-    <w:p>
-      <w:pPr>
-        <w:spacing w:before="100" w:after="30" w:line="260" w:lineRule="auto"/>
-      </w:pPr>
-      <w:r>
-        <w:rPr>
-          <w:b/>
-          <w:bCs/>
-          <w:color w:val="2E75B6"/>
-        </w:rPr>
-        <w:t xml:space="preserve">Frage: </w:t>
-      </w:r>
-      <w:proofErr w:type="spellStart"/>
-      <w:r>
-        <w:rPr>
-          <w:b/>
-          <w:bCs/>
-        </w:rPr>
-        <w:t>Erläutere</w:t>
-      </w:r>
-      <w:proofErr w:type="spellEnd"/>
-      <w:r>
-        <w:rPr>
-          <w:b/>
-          <w:bCs/>
-        </w:rPr>
-        <w:t xml:space="preserve"> die Strategie der atomaren Ressourcenzuteilung.</w:t>
-      </w:r>
-    </w:p>
-    <w:p>
-      <w:pPr>
-        <w:spacing w:after="120" w:line="260" w:lineRule="auto"/>
-      </w:pPr>
-      <w:r>
-        <w:rPr>
-          <w:b/>
-          <w:bCs/>
-          <w:color w:val="44546A"/>
-        </w:rPr>
-        <w:t xml:space="preserve">Antwort: </w:t>
-      </w:r>
-      <w:r>
-        <w:t xml:space="preserve">Ein Prozess fordert alle </w:t>
-      </w:r>
-      <w:proofErr w:type="spellStart"/>
-      <w:r>
-        <w:t>benötigten</w:t>
-      </w:r>
-      <w:proofErr w:type="spellEnd"/>
-      <w:r>
-        <w:t xml:space="preserve"> Ressourcen auf einmal an und bekommt sie entweder </w:t>
-      </w:r>
-      <w:proofErr w:type="spellStart"/>
-      <w:r>
-        <w:t>vollständig</w:t>
-      </w:r>
-      <w:proofErr w:type="spellEnd"/>
-      <w:r>
-        <w:t xml:space="preserve"> oder gar nicht. Dadurch wird 'Hold and Wait' vermieden.</w:t>
-      </w:r>
-    </w:p>
-    <w:p>
-      <w:pPr>
-        <w:spacing w:before="100" w:after="30" w:line="260" w:lineRule="auto"/>
-      </w:pPr>
-      <w:r>
-        <w:rPr>
-          <w:b/>
-          <w:bCs/>
-          <w:color w:val="2E75B6"/>
-        </w:rPr>
-        <w:t xml:space="preserve">Frage: </w:t>
-      </w:r>
-      <w:r>
-        <w:rPr>
-          <w:b/>
-          <w:bCs/>
-        </w:rPr>
-        <w:t>Was unterscheidet Multicast und Broadcast?</w:t>
-      </w:r>
-    </w:p>
-    <w:p>
-      <w:pPr>
-        <w:spacing w:after="120" w:line="260" w:lineRule="auto"/>
-      </w:pPr>
-      <w:r>
-        <w:rPr>
-          <w:b/>
-          <w:bCs/>
-          <w:color w:val="44546A"/>
-        </w:rPr>
-        <w:t xml:space="preserve">Antwort: </w:t>
-      </w:r>
-      <w:r>
-        <w:t xml:space="preserve">Broadcast geht an alle Teilnehmer im Netz/Segment. Multicast geht gezielt nur an eine definierte Gruppe von </w:t>
-      </w:r>
-      <w:proofErr w:type="spellStart"/>
-      <w:r>
-        <w:t>Empfängern</w:t>
-      </w:r>
-      <w:proofErr w:type="spellEnd"/>
-      <w:r>
-        <w:t>.</w:t>
-      </w:r>
-    </w:p>
-    <w:p>
-      <w:pPr>
-        <w:spacing w:after="120" w:line="260" w:lineRule="auto"/>
-      </w:pPr>
-    </w:p>
-    <w:p>
-      <w:pPr>
-        <w:pStyle w:val="berschrift2"/>
-      </w:pPr>
-      <w:bookmarkStart w:id="7" w:name="_Toc232080254"/>
-      <w:r>
-        <w:t xml:space="preserve">5. Ein-/Ausgabe, Interrupts und </w:t>
-      </w:r>
-      <w:proofErr w:type="spellStart"/>
-      <w:r>
-        <w:t>Gerätetreiber</w:t>
-      </w:r>
-      <w:bookmarkEnd w:id="7"/>
-      <w:proofErr w:type="spellEnd"/>
-    </w:p>
-    <w:tbl>
-      <w:tblPr>
-        <w:tblW w:w="9638" w:type="dxa"/>
-        <w:tblBorders>
-          <w:top w:val="single" w:sz="4" w:space="0" w:color="auto"/>
-          <w:left w:val="single" w:sz="4" w:space="0" w:color="auto"/>
-          <w:bottom w:val="single" w:sz="4" w:space="0" w:color="auto"/>
-          <w:right w:val="single" w:sz="4" w:space="0" w:color="auto"/>
-          <w:insideH w:val="single" w:sz="4" w:space="0" w:color="auto"/>
-          <w:insideV w:val="single" w:sz="4" w:space="0" w:color="auto"/>
-        </w:tblBorders>
-        <w:tblLayout w:type="fixed"/>
-        <w:tblCellMar>
-          <w:left w:w="10" w:type="dxa"/>
-          <w:right w:w="10" w:type="dxa"/>
-        </w:tblCellMar>
-        <w:tblLook w:val="0000" w:firstRow="0" w:lastRow="0" w:firstColumn="0" w:lastColumn="0" w:noHBand="0" w:noVBand="0"/>
-      </w:tblPr>
-      <w:tblGrid>
-        <w:gridCol w:w="2200"/>
-        <w:gridCol w:w="4000"/>
-        <w:gridCol w:w="3438"/>
-      </w:tblGrid>
-      <w:tr>
-        <w:tblPrEx>
-          <w:tblCellMar>
-            <w:top w:w="0" w:type="dxa"/>
-            <w:bottom w:w="0" w:type="dxa"/>
-          </w:tblCellMar>
-        </w:tblPrEx>
-        <w:trPr>
-          <w:tblHeader/>
-        </w:trPr>
-        <w:tc>
-          <w:tcPr>
-            <w:tcW w:w="2200" w:type="dxa"/>
-            <w:tcBorders>
-              <w:top w:val="single" w:sz="2" w:space="0" w:color="C7D2DD"/>
-              <w:left w:val="single" w:sz="2" w:space="0" w:color="C7D2DD"/>
-              <w:bottom w:val="single" w:sz="2" w:space="0" w:color="C7D2DD"/>
-              <w:right w:val="single" w:sz="2" w:space="0" w:color="C7D2DD"/>
-            </w:tcBorders>
-            <w:shd w:val="clear" w:color="auto" w:fill="2E75B6"/>
-            <w:tcMar>
-              <w:top w:w="60" w:type="dxa"/>
-              <w:left w:w="110" w:type="dxa"/>
-              <w:bottom w:w="60" w:type="dxa"/>
-              <w:right w:w="110" w:type="dxa"/>
-            </w:tcMar>
-            <w:vAlign w:val="center"/>
-          </w:tcPr>
-          <w:p>
-            <w:pPr>
-              <w:spacing w:line="248" w:lineRule="auto"/>
-            </w:pPr>
-            <w:r>
-              <w:rPr>
-                <w:b/>
-                <w:bCs/>
-                <w:color w:val="FFFFFF"/>
-                <w:sz w:val="20"/>
-                <w:szCs w:val="20"/>
-              </w:rPr>
-              <w:t>Verfahren</w:t>
-            </w:r>
-          </w:p>
-        </w:tc>
-        <w:tc>
-          <w:tcPr>
-            <w:tcW w:w="4000" w:type="dxa"/>
-            <w:tcBorders>
-              <w:top w:val="single" w:sz="2" w:space="0" w:color="C7D2DD"/>
-              <w:left w:val="single" w:sz="2" w:space="0" w:color="C7D2DD"/>
-              <w:bottom w:val="single" w:sz="2" w:space="0" w:color="C7D2DD"/>
-              <w:right w:val="single" w:sz="2" w:space="0" w:color="C7D2DD"/>
-            </w:tcBorders>
-            <w:shd w:val="clear" w:color="auto" w:fill="2E75B6"/>
-            <w:tcMar>
-              <w:top w:w="60" w:type="dxa"/>
-              <w:left w:w="110" w:type="dxa"/>
-              <w:bottom w:w="60" w:type="dxa"/>
-              <w:right w:w="110" w:type="dxa"/>
-            </w:tcMar>
-            <w:vAlign w:val="center"/>
-          </w:tcPr>
-          <w:p>
-            <w:pPr>
-              <w:spacing w:line="248" w:lineRule="auto"/>
-            </w:pPr>
-            <w:r>
-              <w:rPr>
-                <w:b/>
-                <w:bCs/>
-                <w:color w:val="FFFFFF"/>
-                <w:sz w:val="20"/>
-                <w:szCs w:val="20"/>
-              </w:rPr>
-              <w:t>Ablauf</w:t>
-            </w:r>
-          </w:p>
-        </w:tc>
-        <w:tc>
-          <w:tcPr>
-            <w:tcW w:w="3438" w:type="dxa"/>
-            <w:tcBorders>
-              <w:top w:val="single" w:sz="2" w:space="0" w:color="C7D2DD"/>
-              <w:left w:val="single" w:sz="2" w:space="0" w:color="C7D2DD"/>
-              <w:bottom w:val="single" w:sz="2" w:space="0" w:color="C7D2DD"/>
-              <w:right w:val="single" w:sz="2" w:space="0" w:color="C7D2DD"/>
-            </w:tcBorders>
-            <w:shd w:val="clear" w:color="auto" w:fill="2E75B6"/>
-            <w:tcMar>
-              <w:top w:w="60" w:type="dxa"/>
-              <w:left w:w="110" w:type="dxa"/>
-              <w:bottom w:w="60" w:type="dxa"/>
-              <w:right w:w="110" w:type="dxa"/>
-            </w:tcMar>
-            <w:vAlign w:val="center"/>
-          </w:tcPr>
-          <w:p>
-            <w:pPr>
-              <w:spacing w:line="248" w:lineRule="auto"/>
-            </w:pPr>
-            <w:r>
-              <w:rPr>
-                <w:b/>
-                <w:bCs/>
-                <w:color w:val="FFFFFF"/>
-                <w:sz w:val="20"/>
-                <w:szCs w:val="20"/>
-              </w:rPr>
-              <w:t>Bewertung</w:t>
-            </w:r>
-          </w:p>
-        </w:tc>
-      </w:tr>
-      <w:tr>
-        <w:tblPrEx>
-          <w:tblCellMar>
-            <w:top w:w="0" w:type="dxa"/>
-            <w:bottom w:w="0" w:type="dxa"/>
-          </w:tblCellMar>
-        </w:tblPrEx>
-        <w:tc>
-          <w:tcPr>
-            <w:tcW w:w="2200" w:type="dxa"/>
-            <w:tcBorders>
-              <w:top w:val="single" w:sz="2" w:space="0" w:color="C7D2DD"/>
-              <w:left w:val="single" w:sz="2" w:space="0" w:color="C7D2DD"/>
-              <w:bottom w:val="single" w:sz="2" w:space="0" w:color="C7D2DD"/>
-              <w:right w:val="single" w:sz="2" w:space="0" w:color="C7D2DD"/>
-            </w:tcBorders>
-            <w:shd w:val="clear" w:color="auto" w:fill="FFFFFF"/>
-            <w:tcMar>
-              <w:top w:w="60" w:type="dxa"/>
-              <w:left w:w="110" w:type="dxa"/>
-              <w:bottom w:w="60" w:type="dxa"/>
-              <w:right w:w="110" w:type="dxa"/>
-            </w:tcMar>
-            <w:vAlign w:val="center"/>
-          </w:tcPr>
-          <w:p>
-            <w:pPr>
-              <w:spacing w:line="248" w:lineRule="auto"/>
-            </w:pPr>
-            <w:r>
-              <w:rPr>
-                <w:sz w:val="20"/>
-                <w:szCs w:val="20"/>
-              </w:rPr>
-              <w:t>Polling</w:t>
-            </w:r>
-          </w:p>
-        </w:tc>
-        <w:tc>
-          <w:tcPr>
-            <w:tcW w:w="4000" w:type="dxa"/>
-            <w:tcBorders>
-              <w:top w:val="single" w:sz="2" w:space="0" w:color="C7D2DD"/>
-              <w:left w:val="single" w:sz="2" w:space="0" w:color="C7D2DD"/>
-              <w:bottom w:val="single" w:sz="2" w:space="0" w:color="C7D2DD"/>
-              <w:right w:val="single" w:sz="2" w:space="0" w:color="C7D2DD"/>
-            </w:tcBorders>
-            <w:shd w:val="clear" w:color="auto" w:fill="FFFFFF"/>
-            <w:tcMar>
-              <w:top w:w="60" w:type="dxa"/>
-              <w:left w:w="110" w:type="dxa"/>
-              <w:bottom w:w="60" w:type="dxa"/>
-              <w:right w:w="110" w:type="dxa"/>
-            </w:tcMar>
-            <w:vAlign w:val="center"/>
-          </w:tcPr>
-          <w:p>
-            <w:pPr>
-              <w:spacing w:line="248" w:lineRule="auto"/>
-            </w:pPr>
-            <w:r>
-              <w:rPr>
-                <w:sz w:val="20"/>
-                <w:szCs w:val="20"/>
-              </w:rPr>
-              <w:t>CPU fragt zyklisch Statusbits wie BUSY oder READY ab.</w:t>
-            </w:r>
-          </w:p>
-        </w:tc>
-        <w:tc>
-          <w:tcPr>
-            <w:tcW w:w="3438" w:type="dxa"/>
-            <w:tcBorders>
-              <w:top w:val="single" w:sz="2" w:space="0" w:color="C7D2DD"/>
-              <w:left w:val="single" w:sz="2" w:space="0" w:color="C7D2DD"/>
-              <w:bottom w:val="single" w:sz="2" w:space="0" w:color="C7D2DD"/>
-              <w:right w:val="single" w:sz="2" w:space="0" w:color="C7D2DD"/>
-            </w:tcBorders>
-            <w:shd w:val="clear" w:color="auto" w:fill="FFFFFF"/>
-            <w:tcMar>
-              <w:top w:w="60" w:type="dxa"/>
-              <w:left w:w="110" w:type="dxa"/>
-              <w:bottom w:w="60" w:type="dxa"/>
-              <w:right w:w="110" w:type="dxa"/>
-            </w:tcMar>
-            <w:vAlign w:val="center"/>
-          </w:tcPr>
-          <w:p>
-            <w:pPr>
-              <w:spacing w:line="248" w:lineRule="auto"/>
-            </w:pPr>
-            <w:r>
-              <w:rPr>
-                <w:sz w:val="20"/>
-                <w:szCs w:val="20"/>
-              </w:rPr>
-              <w:t xml:space="preserve">Einfach, aber ineffizient, weil CPU-Zeit </w:t>
-            </w:r>
-            <w:proofErr w:type="spellStart"/>
-            <w:r>
-              <w:rPr>
-                <w:sz w:val="20"/>
-                <w:szCs w:val="20"/>
-              </w:rPr>
-              <w:t>für</w:t>
-            </w:r>
-            <w:proofErr w:type="spellEnd"/>
-            <w:r>
-              <w:rPr>
-                <w:sz w:val="20"/>
-                <w:szCs w:val="20"/>
-              </w:rPr>
-              <w:t xml:space="preserve"> Warten verbraucht wird.</w:t>
-            </w:r>
-          </w:p>
-        </w:tc>
-      </w:tr>
-      <w:tr>
-        <w:tblPrEx>
-          <w:tblCellMar>
-            <w:top w:w="0" w:type="dxa"/>
-            <w:bottom w:w="0" w:type="dxa"/>
-          </w:tblCellMar>
-        </w:tblPrEx>
-        <w:tc>
-          <w:tcPr>
-            <w:tcW w:w="2200" w:type="dxa"/>
-            <w:tcBorders>
-              <w:top w:val="single" w:sz="2" w:space="0" w:color="C7D2DD"/>
-              <w:left w:val="single" w:sz="2" w:space="0" w:color="C7D2DD"/>
-              <w:bottom w:val="single" w:sz="2" w:space="0" w:color="C7D2DD"/>
-              <w:right w:val="single" w:sz="2" w:space="0" w:color="C7D2DD"/>
-            </w:tcBorders>
-            <w:shd w:val="clear" w:color="auto" w:fill="EAF1F8"/>
-            <w:tcMar>
-              <w:top w:w="60" w:type="dxa"/>
-              <w:left w:w="110" w:type="dxa"/>
-              <w:bottom w:w="60" w:type="dxa"/>
-              <w:right w:w="110" w:type="dxa"/>
-            </w:tcMar>
-            <w:vAlign w:val="center"/>
-          </w:tcPr>
-          <w:p>
-            <w:pPr>
-              <w:spacing w:line="248" w:lineRule="auto"/>
-            </w:pPr>
-            <w:r>
-              <w:rPr>
-                <w:sz w:val="20"/>
-                <w:szCs w:val="20"/>
-              </w:rPr>
-              <w:t>Interrupt</w:t>
-            </w:r>
-          </w:p>
-        </w:tc>
-        <w:tc>
-          <w:tcPr>
-            <w:tcW w:w="4000" w:type="dxa"/>
-            <w:tcBorders>
-              <w:top w:val="single" w:sz="2" w:space="0" w:color="C7D2DD"/>
-              <w:left w:val="single" w:sz="2" w:space="0" w:color="C7D2DD"/>
-              <w:bottom w:val="single" w:sz="2" w:space="0" w:color="C7D2DD"/>
-              <w:right w:val="single" w:sz="2" w:space="0" w:color="C7D2DD"/>
-            </w:tcBorders>
-            <w:shd w:val="clear" w:color="auto" w:fill="EAF1F8"/>
-            <w:tcMar>
-              <w:top w:w="60" w:type="dxa"/>
-              <w:left w:w="110" w:type="dxa"/>
-              <w:bottom w:w="60" w:type="dxa"/>
-              <w:right w:w="110" w:type="dxa"/>
-            </w:tcMar>
-            <w:vAlign w:val="center"/>
-          </w:tcPr>
-          <w:p>
-            <w:pPr>
-              <w:spacing w:line="248" w:lineRule="auto"/>
-            </w:pPr>
-            <w:proofErr w:type="spellStart"/>
-            <w:r>
-              <w:rPr>
-                <w:sz w:val="20"/>
-                <w:szCs w:val="20"/>
-              </w:rPr>
-              <w:t>Gerät</w:t>
-            </w:r>
-            <w:proofErr w:type="spellEnd"/>
-            <w:r>
-              <w:rPr>
-                <w:sz w:val="20"/>
-                <w:szCs w:val="20"/>
-              </w:rPr>
-              <w:t xml:space="preserve"> meldet sich </w:t>
-            </w:r>
-            <w:proofErr w:type="spellStart"/>
-            <w:r>
-              <w:rPr>
-                <w:sz w:val="20"/>
-                <w:szCs w:val="20"/>
-              </w:rPr>
-              <w:t>selbstständig</w:t>
-            </w:r>
-            <w:proofErr w:type="spellEnd"/>
-            <w:r>
-              <w:rPr>
-                <w:sz w:val="20"/>
-                <w:szCs w:val="20"/>
-              </w:rPr>
-              <w:t>, wenn ein Ereignis eintritt.</w:t>
-            </w:r>
-          </w:p>
-        </w:tc>
-        <w:tc>
-          <w:tcPr>
-            <w:tcW w:w="3438" w:type="dxa"/>
-            <w:tcBorders>
-              <w:top w:val="single" w:sz="2" w:space="0" w:color="C7D2DD"/>
-              <w:left w:val="single" w:sz="2" w:space="0" w:color="C7D2DD"/>
-              <w:bottom w:val="single" w:sz="2" w:space="0" w:color="C7D2DD"/>
-              <w:right w:val="single" w:sz="2" w:space="0" w:color="C7D2DD"/>
-            </w:tcBorders>
-            <w:shd w:val="clear" w:color="auto" w:fill="EAF1F8"/>
-            <w:tcMar>
-              <w:top w:w="60" w:type="dxa"/>
-              <w:left w:w="110" w:type="dxa"/>
-              <w:bottom w:w="60" w:type="dxa"/>
-              <w:right w:w="110" w:type="dxa"/>
-            </w:tcMar>
-            <w:vAlign w:val="center"/>
-          </w:tcPr>
-          <w:p>
-            <w:pPr>
-              <w:spacing w:line="248" w:lineRule="auto"/>
-            </w:pPr>
-            <w:r>
-              <w:rPr>
-                <w:sz w:val="20"/>
-                <w:szCs w:val="20"/>
-              </w:rPr>
-              <w:t xml:space="preserve">Effizienter; </w:t>
-            </w:r>
-            <w:proofErr w:type="spellStart"/>
-            <w:r>
-              <w:rPr>
-                <w:sz w:val="20"/>
-                <w:szCs w:val="20"/>
-              </w:rPr>
-              <w:t>benötigt</w:t>
-            </w:r>
-            <w:proofErr w:type="spellEnd"/>
-            <w:r>
-              <w:rPr>
-                <w:sz w:val="20"/>
-                <w:szCs w:val="20"/>
-              </w:rPr>
-              <w:t xml:space="preserve"> Interrupt-Service-Routine und </w:t>
-            </w:r>
-            <w:proofErr w:type="spellStart"/>
-            <w:r>
-              <w:rPr>
-                <w:sz w:val="20"/>
-                <w:szCs w:val="20"/>
-              </w:rPr>
-              <w:t>Prioritäten</w:t>
-            </w:r>
-            <w:proofErr w:type="spellEnd"/>
-            <w:r>
-              <w:rPr>
-                <w:sz w:val="20"/>
-                <w:szCs w:val="20"/>
-              </w:rPr>
-              <w:t>.</w:t>
-            </w:r>
-          </w:p>
-        </w:tc>
-      </w:tr>
-      <w:tr>
-        <w:tblPrEx>
-          <w:tblCellMar>
-            <w:top w:w="0" w:type="dxa"/>
-            <w:bottom w:w="0" w:type="dxa"/>
-          </w:tblCellMar>
-        </w:tblPrEx>
-        <w:tc>
-          <w:tcPr>
-            <w:tcW w:w="2200" w:type="dxa"/>
-            <w:tcBorders>
-              <w:top w:val="single" w:sz="2" w:space="0" w:color="C7D2DD"/>
-              <w:left w:val="single" w:sz="2" w:space="0" w:color="C7D2DD"/>
-              <w:bottom w:val="single" w:sz="2" w:space="0" w:color="C7D2DD"/>
-              <w:right w:val="single" w:sz="2" w:space="0" w:color="C7D2DD"/>
-            </w:tcBorders>
-            <w:shd w:val="clear" w:color="auto" w:fill="FFFFFF"/>
-            <w:tcMar>
-              <w:top w:w="60" w:type="dxa"/>
-              <w:left w:w="110" w:type="dxa"/>
-              <w:bottom w:w="60" w:type="dxa"/>
-              <w:right w:w="110" w:type="dxa"/>
-            </w:tcMar>
-            <w:vAlign w:val="center"/>
-          </w:tcPr>
-          <w:p>
-            <w:pPr>
-              <w:spacing w:line="248" w:lineRule="auto"/>
-            </w:pPr>
-            <w:r>
-              <w:rPr>
-                <w:sz w:val="20"/>
-                <w:szCs w:val="20"/>
-              </w:rPr>
-              <w:t>DMA</w:t>
-            </w:r>
-          </w:p>
-        </w:tc>
-        <w:tc>
-          <w:tcPr>
-            <w:tcW w:w="4000" w:type="dxa"/>
-            <w:tcBorders>
-              <w:top w:val="single" w:sz="2" w:space="0" w:color="C7D2DD"/>
-              <w:left w:val="single" w:sz="2" w:space="0" w:color="C7D2DD"/>
-              <w:bottom w:val="single" w:sz="2" w:space="0" w:color="C7D2DD"/>
-              <w:right w:val="single" w:sz="2" w:space="0" w:color="C7D2DD"/>
-            </w:tcBorders>
-            <w:shd w:val="clear" w:color="auto" w:fill="FFFFFF"/>
-            <w:tcMar>
-              <w:top w:w="60" w:type="dxa"/>
-              <w:left w:w="110" w:type="dxa"/>
-              <w:bottom w:w="60" w:type="dxa"/>
-              <w:right w:w="110" w:type="dxa"/>
-            </w:tcMar>
-            <w:vAlign w:val="center"/>
-          </w:tcPr>
-          <w:p>
-            <w:pPr>
-              <w:spacing w:line="248" w:lineRule="auto"/>
-            </w:pPr>
-            <w:r>
-              <w:rPr>
-                <w:sz w:val="20"/>
-                <w:szCs w:val="20"/>
-              </w:rPr>
-              <w:t xml:space="preserve">Controller </w:t>
-            </w:r>
-            <w:proofErr w:type="spellStart"/>
-            <w:r>
-              <w:rPr>
-                <w:sz w:val="20"/>
-                <w:szCs w:val="20"/>
-              </w:rPr>
-              <w:t>überträgt</w:t>
-            </w:r>
-            <w:proofErr w:type="spellEnd"/>
-            <w:r>
-              <w:rPr>
-                <w:sz w:val="20"/>
-                <w:szCs w:val="20"/>
-              </w:rPr>
-              <w:t xml:space="preserve"> Daten direkt zwischen </w:t>
-            </w:r>
-            <w:proofErr w:type="spellStart"/>
-            <w:r>
-              <w:rPr>
-                <w:sz w:val="20"/>
-                <w:szCs w:val="20"/>
-              </w:rPr>
-              <w:t>Gerät</w:t>
-            </w:r>
-            <w:proofErr w:type="spellEnd"/>
-            <w:r>
-              <w:rPr>
-                <w:sz w:val="20"/>
-                <w:szCs w:val="20"/>
-              </w:rPr>
-              <w:t xml:space="preserve"> und Speicher.</w:t>
-            </w:r>
-          </w:p>
-        </w:tc>
-        <w:tc>
-          <w:tcPr>
-            <w:tcW w:w="3438" w:type="dxa"/>
-            <w:tcBorders>
-              <w:top w:val="single" w:sz="2" w:space="0" w:color="C7D2DD"/>
-              <w:left w:val="single" w:sz="2" w:space="0" w:color="C7D2DD"/>
-              <w:bottom w:val="single" w:sz="2" w:space="0" w:color="C7D2DD"/>
-              <w:right w:val="single" w:sz="2" w:space="0" w:color="C7D2DD"/>
-            </w:tcBorders>
-            <w:shd w:val="clear" w:color="auto" w:fill="FFFFFF"/>
-            <w:tcMar>
-              <w:top w:w="60" w:type="dxa"/>
-              <w:left w:w="110" w:type="dxa"/>
-              <w:bottom w:w="60" w:type="dxa"/>
-              <w:right w:w="110" w:type="dxa"/>
-            </w:tcMar>
-            <w:vAlign w:val="center"/>
-          </w:tcPr>
-          <w:p>
-            <w:pPr>
-              <w:spacing w:line="248" w:lineRule="auto"/>
-            </w:pPr>
-            <w:r>
-              <w:rPr>
-                <w:sz w:val="20"/>
-                <w:szCs w:val="20"/>
-              </w:rPr>
-              <w:t>Entlastet CPU; CPU muss nur Auftrag starten und Ergebnis behandeln.</w:t>
-            </w:r>
-          </w:p>
-        </w:tc>
-      </w:tr>
-    </w:tbl>
-    <w:p/>
-    <w:p>
-      <w:pPr>
-        <w:pStyle w:val="berschrift3"/>
-      </w:pPr>
-      <w:proofErr w:type="spellStart"/>
-      <w:r>
-        <w:t>Gerätetreiber</w:t>
-      </w:r>
-      <w:proofErr w:type="spellEnd"/>
-    </w:p>
-    <w:p>
-      <w:pPr>
-        <w:pStyle w:val="Listenabsatz"/>
-        <w:numPr>
-          <w:ilvl w:val="0"/>
-          <w:numId w:val="2"/>
-        </w:numPr>
-        <w:spacing w:after="60" w:line="260" w:lineRule="auto"/>
-      </w:pPr>
-      <w:r>
-        <w:t xml:space="preserve">Ein </w:t>
-      </w:r>
-      <w:proofErr w:type="spellStart"/>
-      <w:r>
-        <w:t>Gerätetreiber</w:t>
-      </w:r>
-      <w:proofErr w:type="spellEnd"/>
-      <w:r>
-        <w:t xml:space="preserve"> ist ein Kernelmodul, das ein oder mehrere </w:t>
-      </w:r>
-      <w:proofErr w:type="spellStart"/>
-      <w:r>
-        <w:t>Geräte</w:t>
-      </w:r>
-      <w:proofErr w:type="spellEnd"/>
-      <w:r>
-        <w:t xml:space="preserve"> desselben Typs kontrolliert und eine einheitliche Schnittstelle </w:t>
-      </w:r>
-      <w:proofErr w:type="spellStart"/>
-      <w:r>
-        <w:t>für</w:t>
-      </w:r>
-      <w:proofErr w:type="spellEnd"/>
-      <w:r>
-        <w:t xml:space="preserve"> E/A-Funktionen bereitstellt.</w:t>
-      </w:r>
-    </w:p>
-    <w:p>
-      <w:pPr>
-        <w:pStyle w:val="Listenabsatz"/>
-        <w:numPr>
-          <w:ilvl w:val="0"/>
-          <w:numId w:val="2"/>
-        </w:numPr>
-        <w:spacing w:after="60" w:line="260" w:lineRule="auto"/>
-      </w:pPr>
-      <w:proofErr w:type="spellStart"/>
-      <w:r>
-        <w:t>Übersetzt</w:t>
-      </w:r>
-      <w:proofErr w:type="spellEnd"/>
-      <w:r>
-        <w:t xml:space="preserve"> allgemeine Betriebssystemaufrufe wie </w:t>
-      </w:r>
-      <w:proofErr w:type="spellStart"/>
-      <w:r>
-        <w:t>read</w:t>
-      </w:r>
-      <w:proofErr w:type="spellEnd"/>
-      <w:r>
-        <w:t>/</w:t>
-      </w:r>
-      <w:proofErr w:type="spellStart"/>
-      <w:r>
-        <w:t>write</w:t>
-      </w:r>
-      <w:proofErr w:type="spellEnd"/>
-      <w:r>
-        <w:t xml:space="preserve"> in </w:t>
-      </w:r>
-      <w:proofErr w:type="spellStart"/>
-      <w:r>
-        <w:t>gerätespezifische</w:t>
-      </w:r>
-      <w:proofErr w:type="spellEnd"/>
-      <w:r>
-        <w:t xml:space="preserve"> Befehle.</w:t>
-      </w:r>
-    </w:p>
-    <w:p>
-      <w:pPr>
-        <w:pStyle w:val="Listenabsatz"/>
-        <w:numPr>
-          <w:ilvl w:val="0"/>
-          <w:numId w:val="2"/>
-        </w:numPr>
-        <w:spacing w:after="60" w:line="260" w:lineRule="auto"/>
-      </w:pPr>
-      <w:r>
-        <w:t xml:space="preserve">Verwaltet E/A-Anforderungspakete mit </w:t>
-      </w:r>
-      <w:proofErr w:type="spellStart"/>
-      <w:r>
-        <w:t>Geräteadresse</w:t>
-      </w:r>
-      <w:proofErr w:type="spellEnd"/>
-      <w:r>
-        <w:t>, Datenpuffer und Anzahl der Bytes.</w:t>
-      </w:r>
-    </w:p>
-    <w:p>
-      <w:pPr>
-        <w:pStyle w:val="Listenabsatz"/>
-        <w:numPr>
-          <w:ilvl w:val="0"/>
-          <w:numId w:val="2"/>
-        </w:numPr>
-        <w:spacing w:after="60" w:line="260" w:lineRule="auto"/>
-      </w:pPr>
-      <w:proofErr w:type="spellStart"/>
-      <w:r>
-        <w:t>Geräteunabhängige</w:t>
-      </w:r>
-      <w:proofErr w:type="spellEnd"/>
-      <w:r>
-        <w:t xml:space="preserve"> Software stellt unterschiedliche </w:t>
-      </w:r>
-      <w:proofErr w:type="spellStart"/>
-      <w:r>
-        <w:t>Geräte</w:t>
-      </w:r>
-      <w:proofErr w:type="spellEnd"/>
-      <w:r>
-        <w:t xml:space="preserve"> </w:t>
-      </w:r>
-      <w:proofErr w:type="spellStart"/>
-      <w:r>
-        <w:t>möglichst</w:t>
-      </w:r>
-      <w:proofErr w:type="spellEnd"/>
-      <w:r>
-        <w:t xml:space="preserve"> einheitlich dar.</w:t>
-      </w:r>
-    </w:p>
-    <w:tbl>
-      <w:tblPr>
-        <w:tblW w:w="9638" w:type="dxa"/>
-        <w:tblBorders>
-          <w:top w:val="single" w:sz="4" w:space="0" w:color="auto"/>
-          <w:left w:val="single" w:sz="4" w:space="0" w:color="auto"/>
-          <w:bottom w:val="single" w:sz="4" w:space="0" w:color="auto"/>
-          <w:right w:val="single" w:sz="4" w:space="0" w:color="auto"/>
-          <w:insideH w:val="single" w:sz="4" w:space="0" w:color="auto"/>
-          <w:insideV w:val="single" w:sz="4" w:space="0" w:color="auto"/>
-        </w:tblBorders>
-        <w:tblLayout w:type="fixed"/>
-        <w:tblCellMar>
-          <w:left w:w="10" w:type="dxa"/>
-          <w:right w:w="10" w:type="dxa"/>
-        </w:tblCellMar>
-        <w:tblLook w:val="0000" w:firstRow="0" w:lastRow="0" w:firstColumn="0" w:lastColumn="0" w:noHBand="0" w:noVBand="0"/>
-      </w:tblPr>
-      <w:tblGrid>
-        <w:gridCol w:w="9638"/>
-      </w:tblGrid>
-      <w:tr>
-        <w:tblPrEx>
-          <w:tblCellMar>
-            <w:top w:w="0" w:type="dxa"/>
-            <w:bottom w:w="0" w:type="dxa"/>
-          </w:tblCellMar>
-        </w:tblPrEx>
-        <w:tc>
-          <w:tcPr>
-            <w:tcW w:w="9638" w:type="dxa"/>
-            <w:tcBorders>
-              <w:left w:val="single" w:sz="24" w:space="0" w:color="2E75B6"/>
-            </w:tcBorders>
-            <w:shd w:val="clear" w:color="auto" w:fill="EAF1F8"/>
-            <w:tcMar>
-              <w:top w:w="120" w:type="dxa"/>
-              <w:left w:w="200" w:type="dxa"/>
-              <w:bottom w:w="120" w:type="dxa"/>
-              <w:right w:w="160" w:type="dxa"/>
-            </w:tcMar>
-          </w:tcPr>
-          <w:p>
-            <w:pPr>
-              <w:spacing w:after="60" w:line="260" w:lineRule="auto"/>
-            </w:pPr>
-            <w:proofErr w:type="spellStart"/>
-            <w:r>
-              <w:rPr>
-                <w:b/>
-                <w:bCs/>
-                <w:color w:val="2E75B6"/>
-              </w:rPr>
-              <w:t>Prüfungstipp</w:t>
-            </w:r>
-            <w:proofErr w:type="spellEnd"/>
-          </w:p>
-          <w:p>
-            <w:pPr>
-              <w:spacing w:line="260" w:lineRule="auto"/>
-            </w:pPr>
-            <w:r>
-              <w:t xml:space="preserve">Wenn nach Interrupts gefragt wird: erst Gegensatz zu Polling </w:t>
-            </w:r>
-            <w:proofErr w:type="spellStart"/>
-            <w:r>
-              <w:t>erklären</w:t>
-            </w:r>
-            <w:proofErr w:type="spellEnd"/>
-            <w:r>
-              <w:t xml:space="preserve">, dann ISR nennen und zum Schluss </w:t>
-            </w:r>
-            <w:proofErr w:type="spellStart"/>
-            <w:r>
-              <w:t>erwähnen</w:t>
-            </w:r>
-            <w:proofErr w:type="spellEnd"/>
-            <w:r>
-              <w:t xml:space="preserve">, dass moderne Systeme </w:t>
-            </w:r>
-            <w:proofErr w:type="spellStart"/>
-            <w:r>
-              <w:t>Prioritäten</w:t>
-            </w:r>
-            <w:proofErr w:type="spellEnd"/>
-            <w:r>
-              <w:t xml:space="preserve"> und Maskierung nutzen.</w:t>
-            </w:r>
-          </w:p>
-        </w:tc>
-      </w:tr>
-    </w:tbl>
-    <w:p/>
-    <w:p>
-      <w:pPr>
-        <w:pStyle w:val="berschrift2"/>
-      </w:pPr>
-      <w:bookmarkStart w:id="8" w:name="_Toc232080255"/>
-    </w:p>
-    <w:p>
-      <w:pPr>
-        <w:pStyle w:val="berschrift2"/>
-      </w:pPr>
-      <w:r>
-        <w:t>6. Speicherverwaltung</w:t>
-      </w:r>
-      <w:bookmarkEnd w:id="8"/>
-    </w:p>
-    <w:tbl>
-      <w:tblPr>
-        <w:tblW w:w="9638" w:type="dxa"/>
-        <w:tblBorders>
-          <w:top w:val="single" w:sz="4" w:space="0" w:color="auto"/>
-          <w:left w:val="single" w:sz="4" w:space="0" w:color="auto"/>
-          <w:bottom w:val="single" w:sz="4" w:space="0" w:color="auto"/>
-          <w:right w:val="single" w:sz="4" w:space="0" w:color="auto"/>
-          <w:insideH w:val="single" w:sz="4" w:space="0" w:color="auto"/>
-          <w:insideV w:val="single" w:sz="4" w:space="0" w:color="auto"/>
-        </w:tblBorders>
-        <w:tblLayout w:type="fixed"/>
-        <w:tblCellMar>
-          <w:left w:w="10" w:type="dxa"/>
-          <w:right w:w="10" w:type="dxa"/>
-        </w:tblCellMar>
-        <w:tblLook w:val="0000" w:firstRow="0" w:lastRow="0" w:firstColumn="0" w:lastColumn="0" w:noHBand="0" w:noVBand="0"/>
-      </w:tblPr>
-      <w:tblGrid>
-        <w:gridCol w:w="2800"/>
-        <w:gridCol w:w="6838"/>
-      </w:tblGrid>
-      <w:tr>
-        <w:tblPrEx>
-          <w:tblCellMar>
-            <w:top w:w="0" w:type="dxa"/>
-            <w:bottom w:w="0" w:type="dxa"/>
-          </w:tblCellMar>
-        </w:tblPrEx>
-        <w:trPr>
-          <w:tblHeader/>
-        </w:trPr>
-        <w:tc>
-          <w:tcPr>
-            <w:tcW w:w="2800" w:type="dxa"/>
-            <w:tcBorders>
-              <w:top w:val="single" w:sz="2" w:space="0" w:color="C7D2DD"/>
-              <w:left w:val="single" w:sz="2" w:space="0" w:color="C7D2DD"/>
-              <w:bottom w:val="single" w:sz="2" w:space="0" w:color="C7D2DD"/>
-              <w:right w:val="single" w:sz="2" w:space="0" w:color="C7D2DD"/>
-            </w:tcBorders>
-            <w:shd w:val="clear" w:color="auto" w:fill="2E75B6"/>
-            <w:tcMar>
-              <w:top w:w="60" w:type="dxa"/>
-              <w:left w:w="110" w:type="dxa"/>
-              <w:bottom w:w="60" w:type="dxa"/>
-              <w:right w:w="110" w:type="dxa"/>
-            </w:tcMar>
-            <w:vAlign w:val="center"/>
-          </w:tcPr>
-          <w:p>
-            <w:pPr>
-              <w:spacing w:line="248" w:lineRule="auto"/>
-            </w:pPr>
-            <w:r>
-              <w:rPr>
-                <w:b/>
-                <w:bCs/>
-                <w:color w:val="FFFFFF"/>
-                <w:sz w:val="20"/>
-                <w:szCs w:val="20"/>
-              </w:rPr>
-              <w:t>Speicherart</w:t>
-            </w:r>
-          </w:p>
-        </w:tc>
-        <w:tc>
-          <w:tcPr>
-            <w:tcW w:w="6838" w:type="dxa"/>
-            <w:tcBorders>
-              <w:top w:val="single" w:sz="2" w:space="0" w:color="C7D2DD"/>
-              <w:left w:val="single" w:sz="2" w:space="0" w:color="C7D2DD"/>
-              <w:bottom w:val="single" w:sz="2" w:space="0" w:color="C7D2DD"/>
-              <w:right w:val="single" w:sz="2" w:space="0" w:color="C7D2DD"/>
-            </w:tcBorders>
-            <w:shd w:val="clear" w:color="auto" w:fill="2E75B6"/>
-            <w:tcMar>
-              <w:top w:w="60" w:type="dxa"/>
-              <w:left w:w="110" w:type="dxa"/>
-              <w:bottom w:w="60" w:type="dxa"/>
-              <w:right w:w="110" w:type="dxa"/>
-            </w:tcMar>
-            <w:vAlign w:val="center"/>
-          </w:tcPr>
-          <w:p>
-            <w:pPr>
-              <w:spacing w:line="248" w:lineRule="auto"/>
-            </w:pPr>
-            <w:r>
-              <w:rPr>
-                <w:b/>
-                <w:bCs/>
-                <w:color w:val="FFFFFF"/>
-                <w:sz w:val="20"/>
-                <w:szCs w:val="20"/>
-              </w:rPr>
-              <w:t>Eigenschaft</w:t>
-            </w:r>
-          </w:p>
-        </w:tc>
-      </w:tr>
-      <w:tr>
-        <w:tblPrEx>
-          <w:tblCellMar>
-            <w:top w:w="0" w:type="dxa"/>
-            <w:bottom w:w="0" w:type="dxa"/>
-          </w:tblCellMar>
-        </w:tblPrEx>
-        <w:tc>
-          <w:tcPr>
-            <w:tcW w:w="2800" w:type="dxa"/>
-            <w:tcBorders>
-              <w:top w:val="single" w:sz="2" w:space="0" w:color="C7D2DD"/>
-              <w:left w:val="single" w:sz="2" w:space="0" w:color="C7D2DD"/>
-              <w:bottom w:val="single" w:sz="2" w:space="0" w:color="C7D2DD"/>
-              <w:right w:val="single" w:sz="2" w:space="0" w:color="C7D2DD"/>
-            </w:tcBorders>
-            <w:shd w:val="clear" w:color="auto" w:fill="FFFFFF"/>
-            <w:tcMar>
-              <w:top w:w="60" w:type="dxa"/>
-              <w:left w:w="110" w:type="dxa"/>
-              <w:bottom w:w="60" w:type="dxa"/>
-              <w:right w:w="110" w:type="dxa"/>
-            </w:tcMar>
-            <w:vAlign w:val="center"/>
-          </w:tcPr>
-          <w:p>
-            <w:pPr>
-              <w:spacing w:line="248" w:lineRule="auto"/>
-            </w:pPr>
-            <w:r>
-              <w:rPr>
-                <w:sz w:val="20"/>
-                <w:szCs w:val="20"/>
-              </w:rPr>
-              <w:t>Register/Cache</w:t>
-            </w:r>
-          </w:p>
-        </w:tc>
-        <w:tc>
-          <w:tcPr>
-            <w:tcW w:w="6838" w:type="dxa"/>
-            <w:tcBorders>
-              <w:top w:val="single" w:sz="2" w:space="0" w:color="C7D2DD"/>
-              <w:left w:val="single" w:sz="2" w:space="0" w:color="C7D2DD"/>
-              <w:bottom w:val="single" w:sz="2" w:space="0" w:color="C7D2DD"/>
-              <w:right w:val="single" w:sz="2" w:space="0" w:color="C7D2DD"/>
-            </w:tcBorders>
-            <w:shd w:val="clear" w:color="auto" w:fill="FFFFFF"/>
-            <w:tcMar>
-              <w:top w:w="60" w:type="dxa"/>
-              <w:left w:w="110" w:type="dxa"/>
-              <w:bottom w:w="60" w:type="dxa"/>
-              <w:right w:w="110" w:type="dxa"/>
-            </w:tcMar>
-            <w:vAlign w:val="center"/>
-          </w:tcPr>
-          <w:p>
-            <w:pPr>
-              <w:spacing w:line="248" w:lineRule="auto"/>
-            </w:pPr>
-            <w:r>
-              <w:rPr>
-                <w:sz w:val="20"/>
-                <w:szCs w:val="20"/>
-              </w:rPr>
-              <w:t>Sehr schnell, klein und teuer. Cache gleicht Geschwindigkeit zwischen CPU und RAM an.</w:t>
-            </w:r>
-          </w:p>
-        </w:tc>
-      </w:tr>
-      <w:tr>
-        <w:tblPrEx>
-          <w:tblCellMar>
-            <w:top w:w="0" w:type="dxa"/>
-            <w:bottom w:w="0" w:type="dxa"/>
-          </w:tblCellMar>
-        </w:tblPrEx>
-        <w:tc>
-          <w:tcPr>
-            <w:tcW w:w="2800" w:type="dxa"/>
-            <w:tcBorders>
-              <w:top w:val="single" w:sz="2" w:space="0" w:color="C7D2DD"/>
-              <w:left w:val="single" w:sz="2" w:space="0" w:color="C7D2DD"/>
-              <w:bottom w:val="single" w:sz="2" w:space="0" w:color="C7D2DD"/>
-              <w:right w:val="single" w:sz="2" w:space="0" w:color="C7D2DD"/>
-            </w:tcBorders>
-            <w:shd w:val="clear" w:color="auto" w:fill="EAF1F8"/>
-            <w:tcMar>
-              <w:top w:w="60" w:type="dxa"/>
-              <w:left w:w="110" w:type="dxa"/>
-              <w:bottom w:w="60" w:type="dxa"/>
-              <w:right w:w="110" w:type="dxa"/>
-            </w:tcMar>
-            <w:vAlign w:val="center"/>
-          </w:tcPr>
-          <w:p>
-            <w:pPr>
-              <w:spacing w:line="248" w:lineRule="auto"/>
-            </w:pPr>
-            <w:r>
-              <w:rPr>
-                <w:sz w:val="20"/>
-                <w:szCs w:val="20"/>
-              </w:rPr>
-              <w:t>Hauptspeicher/RAM</w:t>
-            </w:r>
-          </w:p>
-        </w:tc>
-        <w:tc>
-          <w:tcPr>
-            <w:tcW w:w="6838" w:type="dxa"/>
-            <w:tcBorders>
-              <w:top w:val="single" w:sz="2" w:space="0" w:color="C7D2DD"/>
-              <w:left w:val="single" w:sz="2" w:space="0" w:color="C7D2DD"/>
-              <w:bottom w:val="single" w:sz="2" w:space="0" w:color="C7D2DD"/>
-              <w:right w:val="single" w:sz="2" w:space="0" w:color="C7D2DD"/>
-            </w:tcBorders>
-            <w:shd w:val="clear" w:color="auto" w:fill="EAF1F8"/>
-            <w:tcMar>
-              <w:top w:w="60" w:type="dxa"/>
-              <w:left w:w="110" w:type="dxa"/>
-              <w:bottom w:w="60" w:type="dxa"/>
-              <w:right w:w="110" w:type="dxa"/>
-            </w:tcMar>
-            <w:vAlign w:val="center"/>
-          </w:tcPr>
-          <w:p>
-            <w:pPr>
-              <w:spacing w:line="248" w:lineRule="auto"/>
-            </w:pPr>
-            <w:r>
-              <w:rPr>
-                <w:sz w:val="20"/>
-                <w:szCs w:val="20"/>
-              </w:rPr>
-              <w:t xml:space="preserve">Direkt adressierbarer Arbeitsspeicher, </w:t>
-            </w:r>
-            <w:proofErr w:type="spellStart"/>
-            <w:r>
-              <w:rPr>
-                <w:sz w:val="20"/>
-                <w:szCs w:val="20"/>
-              </w:rPr>
-              <w:t>flüchtig</w:t>
-            </w:r>
-            <w:proofErr w:type="spellEnd"/>
-            <w:r>
-              <w:rPr>
-                <w:sz w:val="20"/>
-                <w:szCs w:val="20"/>
-              </w:rPr>
-              <w:t>.</w:t>
-            </w:r>
-          </w:p>
-        </w:tc>
-      </w:tr>
-      <w:tr>
-        <w:tblPrEx>
-          <w:tblCellMar>
-            <w:top w:w="0" w:type="dxa"/>
-            <w:bottom w:w="0" w:type="dxa"/>
-          </w:tblCellMar>
-        </w:tblPrEx>
-        <w:tc>
-          <w:tcPr>
-            <w:tcW w:w="2800" w:type="dxa"/>
-            <w:tcBorders>
-              <w:top w:val="single" w:sz="2" w:space="0" w:color="C7D2DD"/>
-              <w:left w:val="single" w:sz="2" w:space="0" w:color="C7D2DD"/>
-              <w:bottom w:val="single" w:sz="2" w:space="0" w:color="C7D2DD"/>
-              <w:right w:val="single" w:sz="2" w:space="0" w:color="C7D2DD"/>
-            </w:tcBorders>
-            <w:shd w:val="clear" w:color="auto" w:fill="FFFFFF"/>
-            <w:tcMar>
-              <w:top w:w="60" w:type="dxa"/>
-              <w:left w:w="110" w:type="dxa"/>
-              <w:bottom w:w="60" w:type="dxa"/>
-              <w:right w:w="110" w:type="dxa"/>
-            </w:tcMar>
-            <w:vAlign w:val="center"/>
-          </w:tcPr>
-          <w:p>
-            <w:pPr>
-              <w:spacing w:line="248" w:lineRule="auto"/>
-            </w:pPr>
-            <w:proofErr w:type="spellStart"/>
-            <w:r>
-              <w:rPr>
-                <w:sz w:val="20"/>
-                <w:szCs w:val="20"/>
-              </w:rPr>
-              <w:t>Sekundärspeicher</w:t>
-            </w:r>
-            <w:proofErr w:type="spellEnd"/>
-          </w:p>
-        </w:tc>
-        <w:tc>
-          <w:tcPr>
-            <w:tcW w:w="6838" w:type="dxa"/>
-            <w:tcBorders>
-              <w:top w:val="single" w:sz="2" w:space="0" w:color="C7D2DD"/>
-              <w:left w:val="single" w:sz="2" w:space="0" w:color="C7D2DD"/>
-              <w:bottom w:val="single" w:sz="2" w:space="0" w:color="C7D2DD"/>
-              <w:right w:val="single" w:sz="2" w:space="0" w:color="C7D2DD"/>
-            </w:tcBorders>
-            <w:shd w:val="clear" w:color="auto" w:fill="FFFFFF"/>
-            <w:tcMar>
-              <w:top w:w="60" w:type="dxa"/>
-              <w:left w:w="110" w:type="dxa"/>
-              <w:bottom w:w="60" w:type="dxa"/>
-              <w:right w:w="110" w:type="dxa"/>
-            </w:tcMar>
-            <w:vAlign w:val="center"/>
-          </w:tcPr>
-          <w:p>
-            <w:pPr>
-              <w:spacing w:line="248" w:lineRule="auto"/>
-            </w:pPr>
-            <w:r>
-              <w:rPr>
-                <w:sz w:val="20"/>
-                <w:szCs w:val="20"/>
-              </w:rPr>
-              <w:t xml:space="preserve">SSD/HDD; langsamer, aber dauerhaft und </w:t>
-            </w:r>
-            <w:proofErr w:type="spellStart"/>
-            <w:r>
-              <w:rPr>
-                <w:sz w:val="20"/>
-                <w:szCs w:val="20"/>
-              </w:rPr>
-              <w:t>gross</w:t>
-            </w:r>
-            <w:proofErr w:type="spellEnd"/>
-            <w:r>
-              <w:rPr>
-                <w:sz w:val="20"/>
-                <w:szCs w:val="20"/>
-              </w:rPr>
-              <w:t>.</w:t>
-            </w:r>
-          </w:p>
-        </w:tc>
-      </w:tr>
-      <w:tr>
-        <w:tblPrEx>
-          <w:tblCellMar>
-            <w:top w:w="0" w:type="dxa"/>
-            <w:bottom w:w="0" w:type="dxa"/>
-          </w:tblCellMar>
-        </w:tblPrEx>
-        <w:tc>
-          <w:tcPr>
-            <w:tcW w:w="2800" w:type="dxa"/>
-            <w:tcBorders>
-              <w:top w:val="single" w:sz="2" w:space="0" w:color="C7D2DD"/>
-              <w:left w:val="single" w:sz="2" w:space="0" w:color="C7D2DD"/>
-              <w:bottom w:val="single" w:sz="2" w:space="0" w:color="C7D2DD"/>
-              <w:right w:val="single" w:sz="2" w:space="0" w:color="C7D2DD"/>
-            </w:tcBorders>
-            <w:shd w:val="clear" w:color="auto" w:fill="EAF1F8"/>
-            <w:tcMar>
-              <w:top w:w="60" w:type="dxa"/>
-              <w:left w:w="110" w:type="dxa"/>
-              <w:bottom w:w="60" w:type="dxa"/>
-              <w:right w:w="110" w:type="dxa"/>
-            </w:tcMar>
-            <w:vAlign w:val="center"/>
-          </w:tcPr>
-          <w:p>
-            <w:pPr>
-              <w:spacing w:line="248" w:lineRule="auto"/>
-            </w:pPr>
-            <w:r>
-              <w:rPr>
-                <w:sz w:val="20"/>
-                <w:szCs w:val="20"/>
-              </w:rPr>
-              <w:t>Archiv-/Backup-Speicher</w:t>
-            </w:r>
-          </w:p>
-        </w:tc>
-        <w:tc>
-          <w:tcPr>
-            <w:tcW w:w="6838" w:type="dxa"/>
-            <w:tcBorders>
-              <w:top w:val="single" w:sz="2" w:space="0" w:color="C7D2DD"/>
-              <w:left w:val="single" w:sz="2" w:space="0" w:color="C7D2DD"/>
-              <w:bottom w:val="single" w:sz="2" w:space="0" w:color="C7D2DD"/>
-              <w:right w:val="single" w:sz="2" w:space="0" w:color="C7D2DD"/>
-            </w:tcBorders>
-            <w:shd w:val="clear" w:color="auto" w:fill="EAF1F8"/>
-            <w:tcMar>
-              <w:top w:w="60" w:type="dxa"/>
-              <w:left w:w="110" w:type="dxa"/>
-              <w:bottom w:w="60" w:type="dxa"/>
-              <w:right w:w="110" w:type="dxa"/>
-            </w:tcMar>
-            <w:vAlign w:val="center"/>
-          </w:tcPr>
-          <w:p>
-            <w:pPr>
-              <w:spacing w:line="248" w:lineRule="auto"/>
-            </w:pPr>
-            <w:r>
-              <w:rPr>
-                <w:sz w:val="20"/>
-                <w:szCs w:val="20"/>
-              </w:rPr>
-              <w:t xml:space="preserve">Dient Sicherung und Wiederherstellung, nicht laufender </w:t>
-            </w:r>
-            <w:proofErr w:type="spellStart"/>
-            <w:r>
-              <w:rPr>
-                <w:sz w:val="20"/>
-                <w:szCs w:val="20"/>
-              </w:rPr>
-              <w:t>Programmausführung</w:t>
-            </w:r>
-            <w:proofErr w:type="spellEnd"/>
-            <w:r>
-              <w:rPr>
-                <w:sz w:val="20"/>
-                <w:szCs w:val="20"/>
-              </w:rPr>
-              <w:t>.</w:t>
-            </w:r>
-          </w:p>
-        </w:tc>
-      </w:tr>
-    </w:tbl>
-    <w:p/>
-    <w:p>
-      <w:pPr>
-        <w:spacing w:after="120" w:line="264" w:lineRule="auto"/>
-      </w:pPr>
-      <w:r>
-        <w:t xml:space="preserve">Prozesse arbeiten mit logischen Adressen. Die Memory Management Unit (MMU) </w:t>
-      </w:r>
-      <w:proofErr w:type="spellStart"/>
-      <w:r>
-        <w:t>übersetzt</w:t>
-      </w:r>
-      <w:proofErr w:type="spellEnd"/>
-      <w:r>
-        <w:t xml:space="preserve"> diese zur Laufzeit in physikalische Adressen im Hauptspeicher.</w:t>
-      </w:r>
-    </w:p>
-    <w:p>
-      <w:r>
-        <w:br w:type="page"/>
-      </w:r>
-    </w:p>
-    <w:tbl>
-      <w:tblPr>
-        <w:tblW w:w="9638" w:type="dxa"/>
-        <w:tblBorders>
-          <w:top w:val="single" w:sz="4" w:space="0" w:color="auto"/>
-          <w:left w:val="single" w:sz="4" w:space="0" w:color="auto"/>
-          <w:bottom w:val="single" w:sz="4" w:space="0" w:color="auto"/>
-          <w:right w:val="single" w:sz="4" w:space="0" w:color="auto"/>
-          <w:insideH w:val="single" w:sz="4" w:space="0" w:color="auto"/>
-          <w:insideV w:val="single" w:sz="4" w:space="0" w:color="auto"/>
-        </w:tblBorders>
-        <w:tblLayout w:type="fixed"/>
-        <w:tblCellMar>
-          <w:left w:w="10" w:type="dxa"/>
-          <w:right w:w="10" w:type="dxa"/>
-        </w:tblCellMar>
-        <w:tblLook w:val="0000" w:firstRow="0" w:lastRow="0" w:firstColumn="0" w:lastColumn="0" w:noHBand="0" w:noVBand="0"/>
-      </w:tblPr>
-      <w:tblGrid>
-        <w:gridCol w:w="26"/>
-        <w:gridCol w:w="2766"/>
-        <w:gridCol w:w="6819"/>
-        <w:gridCol w:w="27"/>
-      </w:tblGrid>
-      <w:tr>
-        <w:tblPrEx>
-          <w:tblCellMar>
-            <w:top w:w="0" w:type="dxa"/>
-            <w:bottom w:w="0" w:type="dxa"/>
-          </w:tblCellMar>
-        </w:tblPrEx>
-        <w:trPr>
-          <w:gridAfter w:val="1"/>
-          <w:wAfter w:w="27" w:type="dxa"/>
-          <w:tblHeader/>
-        </w:trPr>
-        <w:tc>
-          <w:tcPr>
-            <w:tcW w:w="2800" w:type="dxa"/>
-            <w:gridSpan w:val="2"/>
-            <w:tcBorders>
-              <w:top w:val="single" w:sz="2" w:space="0" w:color="C7D2DD"/>
-              <w:left w:val="single" w:sz="2" w:space="0" w:color="C7D2DD"/>
-              <w:bottom w:val="single" w:sz="2" w:space="0" w:color="C7D2DD"/>
-              <w:right w:val="single" w:sz="2" w:space="0" w:color="C7D2DD"/>
-            </w:tcBorders>
-            <w:shd w:val="clear" w:color="auto" w:fill="2E75B6"/>
-            <w:tcMar>
-              <w:top w:w="60" w:type="dxa"/>
-              <w:left w:w="110" w:type="dxa"/>
-              <w:bottom w:w="60" w:type="dxa"/>
-              <w:right w:w="110" w:type="dxa"/>
-            </w:tcMar>
-            <w:vAlign w:val="center"/>
-          </w:tcPr>
-          <w:p>
-            <w:pPr>
-              <w:spacing w:line="248" w:lineRule="auto"/>
-            </w:pPr>
-            <w:r>
-              <w:rPr>
-                <w:b/>
-                <w:bCs/>
-                <w:color w:val="FFFFFF"/>
-                <w:sz w:val="20"/>
-                <w:szCs w:val="20"/>
-              </w:rPr>
               <w:lastRenderedPageBreak/>
               <w:t>Konzept</w:t>
             </w:r>
@@ -12945,6 +12959,7 @@
         <w:t>Eine Datensicherung ist eine Zusatzkopie, an der nicht gearbeitet wird. Sie dient der Wiederherstellung nach Datenverlust, Fehlbedienung, Defekt oder Angriff.</w:t>
       </w:r>
     </w:p>
+    <w:p/>
     <w:tbl>
       <w:tblPr>
         <w:tblW w:w="9638" w:type="dxa"/>
@@ -14721,6 +14736,7 @@
       </w:r>
       <w:bookmarkEnd w:id="10"/>
     </w:p>
+    <w:p/>
     <w:tbl>
       <w:tblPr>
         <w:tblW w:w="9638" w:type="dxa"/>
@@ -16005,6 +16021,7 @@
         <w:t>Authentisierung, Authentifizierung, Autorisierung</w:t>
       </w:r>
     </w:p>
+    <w:p/>
     <w:tbl>
       <w:tblPr>
         <w:tblW w:w="9638" w:type="dxa"/>
@@ -16699,6 +16716,7 @@
       </w:r>
       <w:bookmarkEnd w:id="12"/>
     </w:p>
+    <w:p/>
     <w:tbl>
       <w:tblPr>
         <w:tblW w:w="9638" w:type="dxa"/>
@@ -18400,6 +18418,7 @@
         <w:pStyle w:val="berschrift2"/>
       </w:pPr>
     </w:p>
+    <w:p/>
     <w:tbl>
       <w:tblPr>
         <w:tblW w:w="9638" w:type="dxa"/>
@@ -20086,6 +20105,7 @@
         <w:pStyle w:val="berschrift2"/>
       </w:pPr>
     </w:p>
+    <w:p/>
     <w:tbl>
       <w:tblPr>
         <w:tblW w:w="9638" w:type="dxa"/>
@@ -21378,6 +21398,7 @@
         <w:pStyle w:val="berschrift2"/>
       </w:pPr>
     </w:p>
+    <w:p/>
     <w:tbl>
       <w:tblPr>
         <w:tblW w:w="9638" w:type="dxa"/>
@@ -22955,6 +22976,7 @@
         <w:pStyle w:val="berschrift2"/>
       </w:pPr>
     </w:p>
+    <w:p/>
     <w:tbl>
       <w:tblPr>
         <w:tblW w:w="9638" w:type="dxa"/>
@@ -23672,6 +23694,7 @@
         <w:t>.</w:t>
       </w:r>
     </w:p>
+    <w:p/>
     <w:tbl>
       <w:tblPr>
         <w:tblW w:w="9638" w:type="dxa"/>
@@ -24325,6 +24348,7 @@
         <w:pStyle w:val="berschrift2"/>
       </w:pPr>
     </w:p>
+    <w:p/>
     <w:tbl>
       <w:tblPr>
         <w:tblW w:w="9638" w:type="dxa"/>
@@ -25352,6 +25376,7 @@
         <w:pStyle w:val="berschrift2"/>
       </w:pPr>
     </w:p>
+    <w:p/>
     <w:tbl>
       <w:tblPr>
         <w:tblW w:w="9638" w:type="dxa"/>
@@ -26779,6 +26804,7 @@
         <w:pStyle w:val="berschrift2"/>
       </w:pPr>
     </w:p>
+    <w:p/>
     <w:tbl>
       <w:tblPr>
         <w:tblW w:w="9638" w:type="dxa"/>
@@ -27988,6 +28014,7 @@
         <w:t>).</w:t>
       </w:r>
     </w:p>
+    <w:p/>
     <w:tbl>
       <w:tblPr>
         <w:tblW w:w="9638" w:type="dxa"/>
@@ -30073,6 +30100,7 @@
         <w:pStyle w:val="berschrift2"/>
       </w:pPr>
     </w:p>
+    <w:p/>
     <w:tbl>
       <w:tblPr>
         <w:tblW w:w="9638" w:type="dxa"/>
@@ -31140,6 +31168,7 @@
         <w:t xml:space="preserve"> festhalten.</w:t>
       </w:r>
     </w:p>
+    <w:p/>
     <w:tbl>
       <w:tblPr>
         <w:tblW w:w="9638" w:type="dxa"/>
@@ -32708,6 +32737,7 @@
       </w:r>
       <w:bookmarkEnd w:id="24"/>
     </w:p>
+    <w:p/>
     <w:tbl>
       <w:tblPr>
         <w:tblW w:w="9638" w:type="dxa"/>
@@ -34173,6 +34203,7 @@
       <w:bookmarkEnd w:id="25"/>
       <w:proofErr w:type="spellEnd"/>
     </w:p>
+    <w:p/>
     <w:tbl>
       <w:tblPr>
         <w:tblW w:w="9638" w:type="dxa"/>

</xml_diff>

<commit_message>
Betriebssysteme: zusammengefügte Tabellen aufgetrennt
Mehrere Abschnitte hatten 2–3 logische Tabellen in einer physischen
Tabelle ohne Abstand. Jetzt getrennt:
- Abschnitt 9:  Begriff/Bedeutung · Netztyp · Client-Server
- Abschnitt 10: OSI-Schicht · TCP/IP-Schicht · Merksatz
- Abschnitt 11: Medium · Verfahren · Prüfungstipp
- Abschnitt 12: Framing · Fehlerkorrektur · MAC-Verfahren
- Abschnitt 14: Routing · Merksatz
- Abschnitt 15: CIDR · Besondere Adressen · Mini-Beispiel

Co-Authored-By: Claude Sonnet 4.6 <noreply@anthropic.com>
</commit_message>
<xml_diff>
--- a/Betriebssysteme-Rechnernetze.docx
+++ b/Betriebssysteme-Rechnernetze.docx
@@ -17407,6 +17407,33 @@
           </w:p>
         </w:tc>
       </w:tr>
+    </w:tbl>
+    <w:p/>
+    <w:tbl>
+      <w:tblPr>
+        <w:tblW w:w="9638" w:type="dxa"/>
+        <w:tblBorders>
+          <w:top w:val="single" w:sz="4" w:space="0" w:color="auto"/>
+          <w:left w:val="single" w:sz="4" w:space="0" w:color="auto"/>
+          <w:bottom w:val="single" w:sz="4" w:space="0" w:color="auto"/>
+          <w:right w:val="single" w:sz="4" w:space="0" w:color="auto"/>
+          <w:insideH w:val="single" w:sz="4" w:space="0" w:color="auto"/>
+          <w:insideV w:val="single" w:sz="4" w:space="0" w:color="auto"/>
+        </w:tblBorders>
+        <w:tblLayout w:type="fixed"/>
+        <w:tblCellMar>
+          <w:left w:w="10" w:type="dxa"/>
+          <w:right w:w="10" w:type="dxa"/>
+        </w:tblCellMar>
+        <w:tblLook w:val="0000" w:firstRow="0" w:lastRow="0" w:firstColumn="0" w:lastColumn="0" w:noHBand="0" w:noVBand="0"/>
+      </w:tblPr>
+      <w:tblGrid>
+        <w:gridCol w:w="2000"/>
+        <w:gridCol w:w="800"/>
+        <w:gridCol w:w="1800"/>
+        <w:gridCol w:w="200"/>
+        <w:gridCol w:w="4838"/>
+      </w:tblGrid>
       <w:tr>
         <w:tblPrEx>
           <w:tblCellMar>
@@ -18067,6 +18094,33 @@
           </w:p>
         </w:tc>
       </w:tr>
+    </w:tbl>
+    <w:p/>
+    <w:tbl>
+      <w:tblPr>
+        <w:tblW w:w="9638" w:type="dxa"/>
+        <w:tblBorders>
+          <w:top w:val="single" w:sz="4" w:space="0" w:color="auto"/>
+          <w:left w:val="single" w:sz="4" w:space="0" w:color="auto"/>
+          <w:bottom w:val="single" w:sz="4" w:space="0" w:color="auto"/>
+          <w:right w:val="single" w:sz="4" w:space="0" w:color="auto"/>
+          <w:insideH w:val="single" w:sz="4" w:space="0" w:color="auto"/>
+          <w:insideV w:val="single" w:sz="4" w:space="0" w:color="auto"/>
+        </w:tblBorders>
+        <w:tblLayout w:type="fixed"/>
+        <w:tblCellMar>
+          <w:left w:w="10" w:type="dxa"/>
+          <w:right w:w="10" w:type="dxa"/>
+        </w:tblCellMar>
+        <w:tblLook w:val="0000" w:firstRow="0" w:lastRow="0" w:firstColumn="0" w:lastColumn="0" w:noHBand="0" w:noVBand="0"/>
+      </w:tblPr>
+      <w:tblGrid>
+        <w:gridCol w:w="2000"/>
+        <w:gridCol w:w="800"/>
+        <w:gridCol w:w="1800"/>
+        <w:gridCol w:w="200"/>
+        <w:gridCol w:w="4838"/>
+      </w:tblGrid>
       <w:tr>
         <w:tblPrEx>
           <w:tblCellMar>
@@ -19385,6 +19439,35 @@
           </w:p>
         </w:tc>
       </w:tr>
+    </w:tbl>
+    <w:p/>
+    <w:tbl>
+      <w:tblPr>
+        <w:tblW w:w="9638" w:type="dxa"/>
+        <w:tblBorders>
+          <w:top w:val="single" w:sz="4" w:space="0" w:color="auto"/>
+          <w:left w:val="single" w:sz="4" w:space="0" w:color="auto"/>
+          <w:bottom w:val="single" w:sz="4" w:space="0" w:color="auto"/>
+          <w:right w:val="single" w:sz="4" w:space="0" w:color="auto"/>
+          <w:insideH w:val="single" w:sz="4" w:space="0" w:color="auto"/>
+          <w:insideV w:val="single" w:sz="4" w:space="0" w:color="auto"/>
+        </w:tblBorders>
+        <w:tblLayout w:type="fixed"/>
+        <w:tblCellMar>
+          <w:left w:w="10" w:type="dxa"/>
+          <w:right w:w="10" w:type="dxa"/>
+        </w:tblCellMar>
+        <w:tblLook w:val="0000" w:firstRow="0" w:lastRow="0" w:firstColumn="0" w:lastColumn="0" w:noHBand="0" w:noVBand="0"/>
+      </w:tblPr>
+      <w:tblGrid>
+        <w:gridCol w:w="26"/>
+        <w:gridCol w:w="1968"/>
+        <w:gridCol w:w="798"/>
+        <w:gridCol w:w="2194"/>
+        <w:gridCol w:w="399"/>
+        <w:gridCol w:w="4226"/>
+        <w:gridCol w:w="27"/>
+      </w:tblGrid>
       <w:tr>
         <w:tblPrEx>
           <w:tblCellMar>
@@ -19962,6 +20045,35 @@
           </w:p>
         </w:tc>
       </w:tr>
+    </w:tbl>
+    <w:p/>
+    <w:tbl>
+      <w:tblPr>
+        <w:tblW w:w="9638" w:type="dxa"/>
+        <w:tblBorders>
+          <w:top w:val="single" w:sz="4" w:space="0" w:color="auto"/>
+          <w:left w:val="single" w:sz="4" w:space="0" w:color="auto"/>
+          <w:bottom w:val="single" w:sz="4" w:space="0" w:color="auto"/>
+          <w:right w:val="single" w:sz="4" w:space="0" w:color="auto"/>
+          <w:insideH w:val="single" w:sz="4" w:space="0" w:color="auto"/>
+          <w:insideV w:val="single" w:sz="4" w:space="0" w:color="auto"/>
+        </w:tblBorders>
+        <w:tblLayout w:type="fixed"/>
+        <w:tblCellMar>
+          <w:left w:w="10" w:type="dxa"/>
+          <w:right w:w="10" w:type="dxa"/>
+        </w:tblCellMar>
+        <w:tblLook w:val="0000" w:firstRow="0" w:lastRow="0" w:firstColumn="0" w:lastColumn="0" w:noHBand="0" w:noVBand="0"/>
+      </w:tblPr>
+      <w:tblGrid>
+        <w:gridCol w:w="26"/>
+        <w:gridCol w:w="1968"/>
+        <w:gridCol w:w="798"/>
+        <w:gridCol w:w="2194"/>
+        <w:gridCol w:w="399"/>
+        <w:gridCol w:w="4226"/>
+        <w:gridCol w:w="27"/>
+      </w:tblGrid>
       <w:tr>
         <w:tblPrEx>
           <w:tblCellMar>
@@ -20086,6 +20198,10 @@
       </w:pPr>
       <w:bookmarkStart w:id="14" w:name="_Toc232080261"/>
     </w:p>
+    <w:p/>
+    <w:tbl/>
+    <w:p/>
+    <w:tbl/>
     <w:p>
       <w:pPr>
         <w:pStyle w:val="berschrift2"/>
@@ -20105,6 +20221,10 @@
         <w:pStyle w:val="berschrift2"/>
       </w:pPr>
     </w:p>
+    <w:p/>
+    <w:tbl/>
+    <w:p/>
+    <w:tbl/>
     <w:p/>
     <w:tbl>
       <w:tblPr>
@@ -25098,6 +25218,32 @@
           </w:p>
         </w:tc>
       </w:tr>
+    </w:tbl>
+    <w:p/>
+    <w:tbl>
+      <w:tblPr>
+        <w:tblW w:w="9638" w:type="dxa"/>
+        <w:tblBorders>
+          <w:top w:val="single" w:sz="4" w:space="0" w:color="auto"/>
+          <w:left w:val="single" w:sz="4" w:space="0" w:color="auto"/>
+          <w:bottom w:val="single" w:sz="4" w:space="0" w:color="auto"/>
+          <w:right w:val="single" w:sz="4" w:space="0" w:color="auto"/>
+          <w:insideH w:val="single" w:sz="4" w:space="0" w:color="auto"/>
+          <w:insideV w:val="single" w:sz="4" w:space="0" w:color="auto"/>
+        </w:tblBorders>
+        <w:tblLayout w:type="fixed"/>
+        <w:tblCellMar>
+          <w:left w:w="10" w:type="dxa"/>
+          <w:right w:w="10" w:type="dxa"/>
+        </w:tblCellMar>
+        <w:tblLook w:val="0000" w:firstRow="0" w:lastRow="0" w:firstColumn="0" w:lastColumn="0" w:noHBand="0" w:noVBand="0"/>
+      </w:tblPr>
+      <w:tblGrid>
+        <w:gridCol w:w="26"/>
+        <w:gridCol w:w="2766"/>
+        <w:gridCol w:w="6819"/>
+        <w:gridCol w:w="27"/>
+      </w:tblGrid>
       <w:tr>
         <w:tblPrEx>
           <w:tblCellMar>
@@ -25724,6 +25870,32 @@
           </w:p>
         </w:tc>
       </w:tr>
+    </w:tbl>
+    <w:p/>
+    <w:tbl>
+      <w:tblPr>
+        <w:tblW w:w="9638" w:type="dxa"/>
+        <w:tblBorders>
+          <w:top w:val="single" w:sz="4" w:space="0" w:color="auto"/>
+          <w:left w:val="single" w:sz="4" w:space="0" w:color="auto"/>
+          <w:bottom w:val="single" w:sz="4" w:space="0" w:color="auto"/>
+          <w:right w:val="single" w:sz="4" w:space="0" w:color="auto"/>
+          <w:insideH w:val="single" w:sz="4" w:space="0" w:color="auto"/>
+          <w:insideV w:val="single" w:sz="4" w:space="0" w:color="auto"/>
+        </w:tblBorders>
+        <w:tblLayout w:type="fixed"/>
+        <w:tblCellMar>
+          <w:left w:w="10" w:type="dxa"/>
+          <w:right w:w="10" w:type="dxa"/>
+        </w:tblCellMar>
+        <w:tblLook w:val="0000" w:firstRow="0" w:lastRow="0" w:firstColumn="0" w:lastColumn="0" w:noHBand="0" w:noVBand="0"/>
+      </w:tblPr>
+      <w:tblGrid>
+        <w:gridCol w:w="26"/>
+        <w:gridCol w:w="2766"/>
+        <w:gridCol w:w="6819"/>
+        <w:gridCol w:w="27"/>
+      </w:tblGrid>
       <w:tr>
         <w:tblPrEx>
           <w:tblCellMar>
@@ -26172,6 +26344,32 @@
           </w:p>
         </w:tc>
       </w:tr>
+    </w:tbl>
+    <w:p/>
+    <w:tbl>
+      <w:tblPr>
+        <w:tblW w:w="9638" w:type="dxa"/>
+        <w:tblBorders>
+          <w:top w:val="single" w:sz="4" w:space="0" w:color="auto"/>
+          <w:left w:val="single" w:sz="4" w:space="0" w:color="auto"/>
+          <w:bottom w:val="single" w:sz="4" w:space="0" w:color="auto"/>
+          <w:right w:val="single" w:sz="4" w:space="0" w:color="auto"/>
+          <w:insideH w:val="single" w:sz="4" w:space="0" w:color="auto"/>
+          <w:insideV w:val="single" w:sz="4" w:space="0" w:color="auto"/>
+        </w:tblBorders>
+        <w:tblLayout w:type="fixed"/>
+        <w:tblCellMar>
+          <w:left w:w="10" w:type="dxa"/>
+          <w:right w:w="10" w:type="dxa"/>
+        </w:tblCellMar>
+        <w:tblLook w:val="0000" w:firstRow="0" w:lastRow="0" w:firstColumn="0" w:lastColumn="0" w:noHBand="0" w:noVBand="0"/>
+      </w:tblPr>
+      <w:tblGrid>
+        <w:gridCol w:w="26"/>
+        <w:gridCol w:w="2766"/>
+        <w:gridCol w:w="6819"/>
+        <w:gridCol w:w="27"/>
+      </w:tblGrid>
       <w:tr>
         <w:tblPrEx>
           <w:tblCellMar>

</xml_diff>